<commit_message>
bumped to version 1.1.0 with updated Manual
</commit_message>
<xml_diff>
--- a/manual.docx
+++ b/manual.docx
@@ -30,8 +30,14 @@
         <w:p>
           <w:pPr>
             <w:pStyle w:val="TOCHeading"/>
+            <w:rPr>
+              <w:lang w:val="de-DE"/>
+            </w:rPr>
           </w:pPr>
           <w:r>
+            <w:rPr>
+              <w:lang w:val="de-DE"/>
+            </w:rPr>
             <w:t>Contents</w:t>
           </w:r>
         </w:p>
@@ -58,7 +64,7 @@
           <w:r>
             <w:fldChar w:fldCharType="separate"/>
           </w:r>
-          <w:hyperlink w:anchor="_Toc209964199" w:history="1">
+          <w:hyperlink w:anchor="_Toc210980688" w:history="1">
             <w:r>
               <w:rPr>
                 <w:rStyle w:val="Hyperlink"/>
@@ -85,7 +91,7 @@
                 <w:noProof/>
                 <w:webHidden/>
               </w:rPr>
-              <w:instrText xml:space="preserve"> PAGEREF _Toc209964199 \h </w:instrText>
+              <w:instrText xml:space="preserve"> PAGEREF _Toc210980688 \h </w:instrText>
             </w:r>
             <w:r>
               <w:rPr>
@@ -130,7 +136,7 @@
               <w:lang w:eastAsia="de-DE"/>
             </w:rPr>
           </w:pPr>
-          <w:hyperlink w:anchor="_Toc209964200" w:history="1">
+          <w:hyperlink w:anchor="_Toc210980689" w:history="1">
             <w:r>
               <w:rPr>
                 <w:rStyle w:val="Hyperlink"/>
@@ -157,79 +163,7 @@
                 <w:noProof/>
                 <w:webHidden/>
               </w:rPr>
-              <w:instrText xml:space="preserve"> PAGEREF _Toc209964200 \h </w:instrText>
-            </w:r>
-            <w:r>
-              <w:rPr>
-                <w:noProof/>
-                <w:webHidden/>
-              </w:rPr>
-            </w:r>
-            <w:r>
-              <w:rPr>
-                <w:noProof/>
-                <w:webHidden/>
-              </w:rPr>
-              <w:fldChar w:fldCharType="separate"/>
-            </w:r>
-            <w:r>
-              <w:rPr>
-                <w:noProof/>
-                <w:webHidden/>
-              </w:rPr>
-              <w:t>2</w:t>
-            </w:r>
-            <w:r>
-              <w:rPr>
-                <w:noProof/>
-                <w:webHidden/>
-              </w:rPr>
-              <w:fldChar w:fldCharType="end"/>
-            </w:r>
-          </w:hyperlink>
-        </w:p>
-        <w:p>
-          <w:pPr>
-            <w:pStyle w:val="TOC1"/>
-            <w:tabs>
-              <w:tab w:val="right" w:leader="dot" w:pos="9062"/>
-            </w:tabs>
-            <w:rPr>
-              <w:rFonts w:eastAsiaTheme="minorEastAsia"/>
-              <w:noProof/>
-              <w:sz w:val="24"/>
-              <w:szCs w:val="24"/>
-              <w:lang w:eastAsia="de-DE"/>
-            </w:rPr>
-          </w:pPr>
-          <w:hyperlink w:anchor="_Toc209964201" w:history="1">
-            <w:r>
-              <w:rPr>
-                <w:rStyle w:val="Hyperlink"/>
-                <w:noProof/>
-              </w:rPr>
-              <w:t>Zuteilung</w:t>
-            </w:r>
-            <w:r>
-              <w:rPr>
-                <w:noProof/>
-                <w:webHidden/>
-              </w:rPr>
-              <w:tab/>
-            </w:r>
-            <w:r>
-              <w:rPr>
-                <w:noProof/>
-                <w:webHidden/>
-              </w:rPr>
-              <w:fldChar w:fldCharType="begin"/>
-            </w:r>
-            <w:r>
-              <w:rPr>
-                <w:noProof/>
-                <w:webHidden/>
-              </w:rPr>
-              <w:instrText xml:space="preserve"> PAGEREF _Toc209964201 \h </w:instrText>
+              <w:instrText xml:space="preserve"> PAGEREF _Toc210980689 \h </w:instrText>
             </w:r>
             <w:r>
               <w:rPr>
@@ -274,13 +208,13 @@
               <w:lang w:eastAsia="de-DE"/>
             </w:rPr>
           </w:pPr>
-          <w:hyperlink w:anchor="_Toc209964202" w:history="1">
+          <w:hyperlink w:anchor="_Toc210980690" w:history="1">
             <w:r>
               <w:rPr>
                 <w:rStyle w:val="Hyperlink"/>
                 <w:noProof/>
               </w:rPr>
-              <w:t>Teilnehmer</w:t>
+              <w:t>Zuteilung</w:t>
             </w:r>
             <w:r>
               <w:rPr>
@@ -301,79 +235,7 @@
                 <w:noProof/>
                 <w:webHidden/>
               </w:rPr>
-              <w:instrText xml:space="preserve"> PAGEREF _Toc209964202 \h </w:instrText>
-            </w:r>
-            <w:r>
-              <w:rPr>
-                <w:noProof/>
-                <w:webHidden/>
-              </w:rPr>
-            </w:r>
-            <w:r>
-              <w:rPr>
-                <w:noProof/>
-                <w:webHidden/>
-              </w:rPr>
-              <w:fldChar w:fldCharType="separate"/>
-            </w:r>
-            <w:r>
-              <w:rPr>
-                <w:noProof/>
-                <w:webHidden/>
-              </w:rPr>
-              <w:t>3</w:t>
-            </w:r>
-            <w:r>
-              <w:rPr>
-                <w:noProof/>
-                <w:webHidden/>
-              </w:rPr>
-              <w:fldChar w:fldCharType="end"/>
-            </w:r>
-          </w:hyperlink>
-        </w:p>
-        <w:p>
-          <w:pPr>
-            <w:pStyle w:val="TOC1"/>
-            <w:tabs>
-              <w:tab w:val="right" w:leader="dot" w:pos="9062"/>
-            </w:tabs>
-            <w:rPr>
-              <w:rFonts w:eastAsiaTheme="minorEastAsia"/>
-              <w:noProof/>
-              <w:sz w:val="24"/>
-              <w:szCs w:val="24"/>
-              <w:lang w:eastAsia="de-DE"/>
-            </w:rPr>
-          </w:pPr>
-          <w:hyperlink w:anchor="_Toc209964203" w:history="1">
-            <w:r>
-              <w:rPr>
-                <w:rStyle w:val="Hyperlink"/>
-                <w:noProof/>
-              </w:rPr>
-              <w:t>Ansicht</w:t>
-            </w:r>
-            <w:r>
-              <w:rPr>
-                <w:noProof/>
-                <w:webHidden/>
-              </w:rPr>
-              <w:tab/>
-            </w:r>
-            <w:r>
-              <w:rPr>
-                <w:noProof/>
-                <w:webHidden/>
-              </w:rPr>
-              <w:fldChar w:fldCharType="begin"/>
-            </w:r>
-            <w:r>
-              <w:rPr>
-                <w:noProof/>
-                <w:webHidden/>
-              </w:rPr>
-              <w:instrText xml:space="preserve"> PAGEREF _Toc209964203 \h </w:instrText>
+              <w:instrText xml:space="preserve"> PAGEREF _Toc210980690 \h </w:instrText>
             </w:r>
             <w:r>
               <w:rPr>
@@ -418,13 +280,13 @@
               <w:lang w:eastAsia="de-DE"/>
             </w:rPr>
           </w:pPr>
-          <w:hyperlink w:anchor="_Toc209964204" w:history="1">
+          <w:hyperlink w:anchor="_Toc210980691" w:history="1">
             <w:r>
               <w:rPr>
                 <w:rStyle w:val="Hyperlink"/>
                 <w:noProof/>
               </w:rPr>
-              <w:t>Einstellungen</w:t>
+              <w:t>Teilnehmer</w:t>
             </w:r>
             <w:r>
               <w:rPr>
@@ -445,7 +307,7 @@
                 <w:noProof/>
                 <w:webHidden/>
               </w:rPr>
-              <w:instrText xml:space="preserve"> PAGEREF _Toc209964204 \h </w:instrText>
+              <w:instrText xml:space="preserve"> PAGEREF _Toc210980691 \h </w:instrText>
             </w:r>
             <w:r>
               <w:rPr>
@@ -490,13 +352,13 @@
               <w:lang w:eastAsia="de-DE"/>
             </w:rPr>
           </w:pPr>
-          <w:hyperlink w:anchor="_Toc209964205" w:history="1">
+          <w:hyperlink w:anchor="_Toc210980692" w:history="1">
             <w:r>
               <w:rPr>
                 <w:rStyle w:val="Hyperlink"/>
                 <w:noProof/>
               </w:rPr>
-              <w:t>Hilfe</w:t>
+              <w:t>Ansicht</w:t>
             </w:r>
             <w:r>
               <w:rPr>
@@ -517,7 +379,7 @@
                 <w:noProof/>
                 <w:webHidden/>
               </w:rPr>
-              <w:instrText xml:space="preserve"> PAGEREF _Toc209964205 \h </w:instrText>
+              <w:instrText xml:space="preserve"> PAGEREF _Toc210980692 \h </w:instrText>
             </w:r>
             <w:r>
               <w:rPr>
@@ -562,13 +424,13 @@
               <w:lang w:eastAsia="de-DE"/>
             </w:rPr>
           </w:pPr>
-          <w:hyperlink w:anchor="_Toc209964206" w:history="1">
+          <w:hyperlink w:anchor="_Toc210980693" w:history="1">
             <w:r>
               <w:rPr>
                 <w:rStyle w:val="Hyperlink"/>
                 <w:noProof/>
               </w:rPr>
-              <w:t>Statusanzeige</w:t>
+              <w:t>Einstellungen</w:t>
             </w:r>
             <w:r>
               <w:rPr>
@@ -589,7 +451,7 @@
                 <w:noProof/>
                 <w:webHidden/>
               </w:rPr>
-              <w:instrText xml:space="preserve"> PAGEREF _Toc209964206 \h </w:instrText>
+              <w:instrText xml:space="preserve"> PAGEREF _Toc210980693 \h </w:instrText>
             </w:r>
             <w:r>
               <w:rPr>
@@ -634,13 +496,13 @@
               <w:lang w:eastAsia="de-DE"/>
             </w:rPr>
           </w:pPr>
-          <w:hyperlink w:anchor="_Toc209964207" w:history="1">
+          <w:hyperlink w:anchor="_Toc210980694" w:history="1">
             <w:r>
               <w:rPr>
                 <w:rStyle w:val="Hyperlink"/>
                 <w:noProof/>
               </w:rPr>
-              <w:t>Teilnehmeransicht</w:t>
+              <w:t>Hilfe</w:t>
             </w:r>
             <w:r>
               <w:rPr>
@@ -661,79 +523,7 @@
                 <w:noProof/>
                 <w:webHidden/>
               </w:rPr>
-              <w:instrText xml:space="preserve"> PAGEREF _Toc209964207 \h </w:instrText>
-            </w:r>
-            <w:r>
-              <w:rPr>
-                <w:noProof/>
-                <w:webHidden/>
-              </w:rPr>
-            </w:r>
-            <w:r>
-              <w:rPr>
-                <w:noProof/>
-                <w:webHidden/>
-              </w:rPr>
-              <w:fldChar w:fldCharType="separate"/>
-            </w:r>
-            <w:r>
-              <w:rPr>
-                <w:noProof/>
-                <w:webHidden/>
-              </w:rPr>
-              <w:t>5</w:t>
-            </w:r>
-            <w:r>
-              <w:rPr>
-                <w:noProof/>
-                <w:webHidden/>
-              </w:rPr>
-              <w:fldChar w:fldCharType="end"/>
-            </w:r>
-          </w:hyperlink>
-        </w:p>
-        <w:p>
-          <w:pPr>
-            <w:pStyle w:val="TOC1"/>
-            <w:tabs>
-              <w:tab w:val="right" w:leader="dot" w:pos="9062"/>
-            </w:tabs>
-            <w:rPr>
-              <w:rFonts w:eastAsiaTheme="minorEastAsia"/>
-              <w:noProof/>
-              <w:sz w:val="24"/>
-              <w:szCs w:val="24"/>
-              <w:lang w:eastAsia="de-DE"/>
-            </w:rPr>
-          </w:pPr>
-          <w:hyperlink w:anchor="_Toc209964208" w:history="1">
-            <w:r>
-              <w:rPr>
-                <w:rStyle w:val="Hyperlink"/>
-                <w:noProof/>
-              </w:rPr>
-              <w:t>Probleme und Lösungen</w:t>
-            </w:r>
-            <w:r>
-              <w:rPr>
-                <w:noProof/>
-                <w:webHidden/>
-              </w:rPr>
-              <w:tab/>
-            </w:r>
-            <w:r>
-              <w:rPr>
-                <w:noProof/>
-                <w:webHidden/>
-              </w:rPr>
-              <w:fldChar w:fldCharType="begin"/>
-            </w:r>
-            <w:r>
-              <w:rPr>
-                <w:noProof/>
-                <w:webHidden/>
-              </w:rPr>
-              <w:instrText xml:space="preserve"> PAGEREF _Toc209964208 \h </w:instrText>
+              <w:instrText xml:space="preserve"> PAGEREF _Toc210980694 \h </w:instrText>
             </w:r>
             <w:r>
               <w:rPr>
@@ -765,6 +555,294 @@
           </w:hyperlink>
         </w:p>
         <w:p>
+          <w:pPr>
+            <w:pStyle w:val="TOC1"/>
+            <w:tabs>
+              <w:tab w:val="right" w:leader="dot" w:pos="9062"/>
+            </w:tabs>
+            <w:rPr>
+              <w:rFonts w:eastAsiaTheme="minorEastAsia"/>
+              <w:noProof/>
+              <w:sz w:val="24"/>
+              <w:szCs w:val="24"/>
+              <w:lang w:eastAsia="de-DE"/>
+            </w:rPr>
+          </w:pPr>
+          <w:hyperlink w:anchor="_Toc210980695" w:history="1">
+            <w:r>
+              <w:rPr>
+                <w:rStyle w:val="Hyperlink"/>
+                <w:noProof/>
+              </w:rPr>
+              <w:t>Statusanzeige</w:t>
+            </w:r>
+            <w:r>
+              <w:rPr>
+                <w:noProof/>
+                <w:webHidden/>
+              </w:rPr>
+              <w:tab/>
+            </w:r>
+            <w:r>
+              <w:rPr>
+                <w:noProof/>
+                <w:webHidden/>
+              </w:rPr>
+              <w:fldChar w:fldCharType="begin"/>
+            </w:r>
+            <w:r>
+              <w:rPr>
+                <w:noProof/>
+                <w:webHidden/>
+              </w:rPr>
+              <w:instrText xml:space="preserve"> PAGEREF _Toc210980695 \h </w:instrText>
+            </w:r>
+            <w:r>
+              <w:rPr>
+                <w:noProof/>
+                <w:webHidden/>
+              </w:rPr>
+            </w:r>
+            <w:r>
+              <w:rPr>
+                <w:noProof/>
+                <w:webHidden/>
+              </w:rPr>
+              <w:fldChar w:fldCharType="separate"/>
+            </w:r>
+            <w:r>
+              <w:rPr>
+                <w:noProof/>
+                <w:webHidden/>
+              </w:rPr>
+              <w:t>6</w:t>
+            </w:r>
+            <w:r>
+              <w:rPr>
+                <w:noProof/>
+                <w:webHidden/>
+              </w:rPr>
+              <w:fldChar w:fldCharType="end"/>
+            </w:r>
+          </w:hyperlink>
+        </w:p>
+        <w:p>
+          <w:pPr>
+            <w:pStyle w:val="TOC1"/>
+            <w:tabs>
+              <w:tab w:val="right" w:leader="dot" w:pos="9062"/>
+            </w:tabs>
+            <w:rPr>
+              <w:rFonts w:eastAsiaTheme="minorEastAsia"/>
+              <w:noProof/>
+              <w:sz w:val="24"/>
+              <w:szCs w:val="24"/>
+              <w:lang w:eastAsia="de-DE"/>
+            </w:rPr>
+          </w:pPr>
+          <w:hyperlink w:anchor="_Toc210980696" w:history="1">
+            <w:r>
+              <w:rPr>
+                <w:rStyle w:val="Hyperlink"/>
+                <w:noProof/>
+              </w:rPr>
+              <w:t>Teilnehmeransicht</w:t>
+            </w:r>
+            <w:r>
+              <w:rPr>
+                <w:noProof/>
+                <w:webHidden/>
+              </w:rPr>
+              <w:tab/>
+            </w:r>
+            <w:r>
+              <w:rPr>
+                <w:noProof/>
+                <w:webHidden/>
+              </w:rPr>
+              <w:fldChar w:fldCharType="begin"/>
+            </w:r>
+            <w:r>
+              <w:rPr>
+                <w:noProof/>
+                <w:webHidden/>
+              </w:rPr>
+              <w:instrText xml:space="preserve"> PAGEREF _Toc210980696 \h </w:instrText>
+            </w:r>
+            <w:r>
+              <w:rPr>
+                <w:noProof/>
+                <w:webHidden/>
+              </w:rPr>
+            </w:r>
+            <w:r>
+              <w:rPr>
+                <w:noProof/>
+                <w:webHidden/>
+              </w:rPr>
+              <w:fldChar w:fldCharType="separate"/>
+            </w:r>
+            <w:r>
+              <w:rPr>
+                <w:noProof/>
+                <w:webHidden/>
+              </w:rPr>
+              <w:t>6</w:t>
+            </w:r>
+            <w:r>
+              <w:rPr>
+                <w:noProof/>
+                <w:webHidden/>
+              </w:rPr>
+              <w:fldChar w:fldCharType="end"/>
+            </w:r>
+          </w:hyperlink>
+        </w:p>
+        <w:p>
+          <w:pPr>
+            <w:pStyle w:val="TOC1"/>
+            <w:tabs>
+              <w:tab w:val="right" w:leader="dot" w:pos="9062"/>
+            </w:tabs>
+            <w:rPr>
+              <w:rFonts w:eastAsiaTheme="minorEastAsia"/>
+              <w:noProof/>
+              <w:sz w:val="24"/>
+              <w:szCs w:val="24"/>
+              <w:lang w:eastAsia="de-DE"/>
+            </w:rPr>
+          </w:pPr>
+          <w:hyperlink w:anchor="_Toc210980697" w:history="1">
+            <w:r>
+              <w:rPr>
+                <w:rStyle w:val="Hyperlink"/>
+                <w:noProof/>
+              </w:rPr>
+              <w:t>Probleme und Lösungen</w:t>
+            </w:r>
+            <w:r>
+              <w:rPr>
+                <w:noProof/>
+                <w:webHidden/>
+              </w:rPr>
+              <w:tab/>
+            </w:r>
+            <w:r>
+              <w:rPr>
+                <w:noProof/>
+                <w:webHidden/>
+              </w:rPr>
+              <w:fldChar w:fldCharType="begin"/>
+            </w:r>
+            <w:r>
+              <w:rPr>
+                <w:noProof/>
+                <w:webHidden/>
+              </w:rPr>
+              <w:instrText xml:space="preserve"> PAGEREF _Toc210980697 \h </w:instrText>
+            </w:r>
+            <w:r>
+              <w:rPr>
+                <w:noProof/>
+                <w:webHidden/>
+              </w:rPr>
+            </w:r>
+            <w:r>
+              <w:rPr>
+                <w:noProof/>
+                <w:webHidden/>
+              </w:rPr>
+              <w:fldChar w:fldCharType="separate"/>
+            </w:r>
+            <w:r>
+              <w:rPr>
+                <w:noProof/>
+                <w:webHidden/>
+              </w:rPr>
+              <w:t>7</w:t>
+            </w:r>
+            <w:r>
+              <w:rPr>
+                <w:noProof/>
+                <w:webHidden/>
+              </w:rPr>
+              <w:fldChar w:fldCharType="end"/>
+            </w:r>
+          </w:hyperlink>
+        </w:p>
+        <w:p>
+          <w:pPr>
+            <w:pStyle w:val="TOC1"/>
+            <w:tabs>
+              <w:tab w:val="right" w:leader="dot" w:pos="9062"/>
+            </w:tabs>
+            <w:rPr>
+              <w:rFonts w:eastAsiaTheme="minorEastAsia"/>
+              <w:noProof/>
+              <w:sz w:val="24"/>
+              <w:szCs w:val="24"/>
+              <w:lang w:eastAsia="de-DE"/>
+            </w:rPr>
+          </w:pPr>
+          <w:hyperlink w:anchor="_Toc210980698" w:history="1">
+            <w:r>
+              <w:rPr>
+                <w:rStyle w:val="Hyperlink"/>
+                <w:noProof/>
+              </w:rPr>
+              <w:t>Starten auf MacOS</w:t>
+            </w:r>
+            <w:r>
+              <w:rPr>
+                <w:noProof/>
+                <w:webHidden/>
+              </w:rPr>
+              <w:tab/>
+            </w:r>
+            <w:r>
+              <w:rPr>
+                <w:noProof/>
+                <w:webHidden/>
+              </w:rPr>
+              <w:fldChar w:fldCharType="begin"/>
+            </w:r>
+            <w:r>
+              <w:rPr>
+                <w:noProof/>
+                <w:webHidden/>
+              </w:rPr>
+              <w:instrText xml:space="preserve"> PAGEREF _Toc210980698 \h </w:instrText>
+            </w:r>
+            <w:r>
+              <w:rPr>
+                <w:noProof/>
+                <w:webHidden/>
+              </w:rPr>
+            </w:r>
+            <w:r>
+              <w:rPr>
+                <w:noProof/>
+                <w:webHidden/>
+              </w:rPr>
+              <w:fldChar w:fldCharType="separate"/>
+            </w:r>
+            <w:r>
+              <w:rPr>
+                <w:noProof/>
+                <w:webHidden/>
+              </w:rPr>
+              <w:t>7</w:t>
+            </w:r>
+            <w:r>
+              <w:rPr>
+                <w:noProof/>
+                <w:webHidden/>
+              </w:rPr>
+              <w:fldChar w:fldCharType="end"/>
+            </w:r>
+          </w:hyperlink>
+        </w:p>
+        <w:p>
           <w:r>
             <w:rPr>
               <w:b/>
@@ -794,9 +872,43 @@
     </w:p>
     <w:p>
       <w:pPr>
+        <w:pStyle w:val="NoSpacing"/>
+      </w:pPr>
+      <w:r>
+        <w:t>Das Importieren der Teilnehmenden ist für die Funktion der App nicht notwendig, aber sehr hilfreich.</w:t>
+      </w:r>
+    </w:p>
+    <w:p>
+      <w:pPr>
+        <w:pStyle w:val="NoSpacing"/>
+      </w:pPr>
+      <w:r>
+        <w:t xml:space="preserve">Es ist zwingend notwendig die Workshops zu pflegen, wenn man diese nicht importieren möchte, kann man über die </w:t>
+      </w:r>
+      <w:r>
+        <w:t>„</w:t>
+      </w:r>
+      <w:r>
+        <w:t>Workshop</w:t>
+      </w:r>
+      <w:r>
+        <w:t xml:space="preserve"> </w:t>
+      </w:r>
+      <w:r>
+        <w:t>bearbeiten</w:t>
+      </w:r>
+      <w:r>
+        <w:t>“-</w:t>
+      </w:r>
+      <w:r>
+        <w:t>Funktion auch die Workshops direkt hinzufügen.</w:t>
+      </w:r>
+    </w:p>
+    <w:p>
+      <w:pPr>
         <w:pStyle w:val="Heading1"/>
       </w:pPr>
-      <w:bookmarkStart w:id="0" w:name="_Toc209964199"/>
+      <w:bookmarkStart w:id="0" w:name="_Toc210980688"/>
       <w:r>
         <w:rPr>
           <w:noProof/>
@@ -894,14 +1006,35 @@
         <w:t>Export</w:t>
       </w:r>
       <w:r>
-        <w:t xml:space="preserve"> → Exportiert alle Workshop-Wahlen im </w:t>
+        <w:t xml:space="preserve"> → </w:t>
+      </w:r>
+      <w:proofErr w:type="gramStart"/>
+      <w:r>
+        <w:t>Exportiert</w:t>
+      </w:r>
+      <w:proofErr w:type="gramEnd"/>
+      <w:r>
+        <w:t xml:space="preserve"> alle Workshop-Wahlen </w:t>
+      </w:r>
+      <w:proofErr w:type="gramStart"/>
+      <w:r>
+        <w:t xml:space="preserve">im </w:t>
       </w:r>
       <w:r>
         <w:rPr>
           <w:rFonts w:ascii="Cascadia Mono" w:hAnsi="Cascadia Mono"/>
         </w:rPr>
-        <w:t>.json</w:t>
-      </w:r>
+        <w:t>.</w:t>
+      </w:r>
+      <w:proofErr w:type="spellStart"/>
+      <w:r>
+        <w:rPr>
+          <w:rFonts w:ascii="Cascadia Mono" w:hAnsi="Cascadia Mono"/>
+        </w:rPr>
+        <w:t>json</w:t>
+      </w:r>
+      <w:proofErr w:type="spellEnd"/>
+      <w:proofErr w:type="gramEnd"/>
       <w:r>
         <w:t>-Format.</w:t>
       </w:r>
@@ -922,13 +1055,32 @@
         <w:t xml:space="preserve">Import </w:t>
       </w:r>
       <w:r>
-        <w:t xml:space="preserve">→ Importiert Workshop-Wahlen im </w:t>
+        <w:t xml:space="preserve">→ Importiert Workshop-Wahlen </w:t>
+      </w:r>
+      <w:proofErr w:type="gramStart"/>
+      <w:r>
+        <w:t xml:space="preserve">im </w:t>
       </w:r>
       <w:r>
         <w:rPr>
           <w:rFonts w:ascii="Cascadia Mono" w:hAnsi="Cascadia Mono"/>
         </w:rPr>
-        <w:t>.json-</w:t>
+        <w:t>.</w:t>
+      </w:r>
+      <w:proofErr w:type="spellStart"/>
+      <w:r>
+        <w:rPr>
+          <w:rFonts w:ascii="Cascadia Mono" w:hAnsi="Cascadia Mono"/>
+        </w:rPr>
+        <w:t>json</w:t>
+      </w:r>
+      <w:proofErr w:type="spellEnd"/>
+      <w:proofErr w:type="gramEnd"/>
+      <w:r>
+        <w:rPr>
+          <w:rFonts w:ascii="Cascadia Mono" w:hAnsi="Cascadia Mono"/>
+        </w:rPr>
+        <w:t>-</w:t>
       </w:r>
       <w:r>
         <w:t>Format.</w:t>
@@ -944,6 +1096,7 @@
         <w:rPr>
           <w:noProof/>
         </w:rPr>
+        <w:lastRenderedPageBreak/>
         <mc:AlternateContent>
           <mc:Choice Requires="wps">
             <w:drawing>
@@ -1041,7 +1194,25 @@
                                 <w:sz w:val="20"/>
                                 <w:szCs w:val="20"/>
                               </w:rPr>
-                              <w:t xml:space="preserve">    "id": 1,</w:t>
+                              <w:t xml:space="preserve">    "</w:t>
+                            </w:r>
+                            <w:proofErr w:type="spellStart"/>
+                            <w:r>
+                              <w:rPr>
+                                <w:rFonts w:ascii="Cascadia Mono" w:hAnsi="Cascadia Mono"/>
+                                <w:sz w:val="20"/>
+                                <w:szCs w:val="20"/>
+                              </w:rPr>
+                              <w:t>id</w:t>
+                            </w:r>
+                            <w:proofErr w:type="spellEnd"/>
+                            <w:r>
+                              <w:rPr>
+                                <w:rFonts w:ascii="Cascadia Mono" w:hAnsi="Cascadia Mono"/>
+                                <w:sz w:val="20"/>
+                                <w:szCs w:val="20"/>
+                              </w:rPr>
+                              <w:t>": 1,</w:t>
                             </w:r>
                           </w:p>
                           <w:p>
@@ -1059,7 +1230,25 @@
                                 <w:sz w:val="20"/>
                                 <w:szCs w:val="20"/>
                               </w:rPr>
-                              <w:t xml:space="preserve">    "name": "Max Mustermann",</w:t>
+                              <w:t xml:space="preserve">    "</w:t>
+                            </w:r>
+                            <w:proofErr w:type="spellStart"/>
+                            <w:r>
+                              <w:rPr>
+                                <w:rFonts w:ascii="Cascadia Mono" w:hAnsi="Cascadia Mono"/>
+                                <w:sz w:val="20"/>
+                                <w:szCs w:val="20"/>
+                              </w:rPr>
+                              <w:t>name</w:t>
+                            </w:r>
+                            <w:proofErr w:type="spellEnd"/>
+                            <w:r>
+                              <w:rPr>
+                                <w:rFonts w:ascii="Cascadia Mono" w:hAnsi="Cascadia Mono"/>
+                                <w:sz w:val="20"/>
+                                <w:szCs w:val="20"/>
+                              </w:rPr>
+                              <w:t>": "Max Mustermann",</w:t>
                             </w:r>
                           </w:p>
                           <w:p>
@@ -1077,7 +1266,25 @@
                                 <w:sz w:val="20"/>
                                 <w:szCs w:val="20"/>
                               </w:rPr>
-                              <w:t xml:space="preserve">    "preferences": {</w:t>
+                              <w:t xml:space="preserve">    "</w:t>
+                            </w:r>
+                            <w:proofErr w:type="spellStart"/>
+                            <w:r>
+                              <w:rPr>
+                                <w:rFonts w:ascii="Cascadia Mono" w:hAnsi="Cascadia Mono"/>
+                                <w:sz w:val="20"/>
+                                <w:szCs w:val="20"/>
+                              </w:rPr>
+                              <w:t>preferences</w:t>
+                            </w:r>
+                            <w:proofErr w:type="spellEnd"/>
+                            <w:r>
+                              <w:rPr>
+                                <w:rFonts w:ascii="Cascadia Mono" w:hAnsi="Cascadia Mono"/>
+                                <w:sz w:val="20"/>
+                                <w:szCs w:val="20"/>
+                              </w:rPr>
+                              <w:t>": {</w:t>
                             </w:r>
                           </w:p>
                           <w:p>
@@ -1095,7 +1302,25 @@
                                 <w:sz w:val="20"/>
                                 <w:szCs w:val="20"/>
                               </w:rPr>
-                              <w:t xml:space="preserve">      "first": "Workshop A",</w:t>
+                              <w:t xml:space="preserve">      "</w:t>
+                            </w:r>
+                            <w:proofErr w:type="spellStart"/>
+                            <w:r>
+                              <w:rPr>
+                                <w:rFonts w:ascii="Cascadia Mono" w:hAnsi="Cascadia Mono"/>
+                                <w:sz w:val="20"/>
+                                <w:szCs w:val="20"/>
+                              </w:rPr>
+                              <w:t>first</w:t>
+                            </w:r>
+                            <w:proofErr w:type="spellEnd"/>
+                            <w:r>
+                              <w:rPr>
+                                <w:rFonts w:ascii="Cascadia Mono" w:hAnsi="Cascadia Mono"/>
+                                <w:sz w:val="20"/>
+                                <w:szCs w:val="20"/>
+                              </w:rPr>
+                              <w:t>": "Workshop A",</w:t>
                             </w:r>
                           </w:p>
                           <w:p>
@@ -1113,7 +1338,25 @@
                                 <w:sz w:val="20"/>
                                 <w:szCs w:val="20"/>
                               </w:rPr>
-                              <w:t xml:space="preserve">      "second": "Workshop B",</w:t>
+                              <w:t xml:space="preserve">      "</w:t>
+                            </w:r>
+                            <w:proofErr w:type="spellStart"/>
+                            <w:r>
+                              <w:rPr>
+                                <w:rFonts w:ascii="Cascadia Mono" w:hAnsi="Cascadia Mono"/>
+                                <w:sz w:val="20"/>
+                                <w:szCs w:val="20"/>
+                              </w:rPr>
+                              <w:t>second</w:t>
+                            </w:r>
+                            <w:proofErr w:type="spellEnd"/>
+                            <w:r>
+                              <w:rPr>
+                                <w:rFonts w:ascii="Cascadia Mono" w:hAnsi="Cascadia Mono"/>
+                                <w:sz w:val="20"/>
+                                <w:szCs w:val="20"/>
+                              </w:rPr>
+                              <w:t>": "Workshop B",</w:t>
                             </w:r>
                           </w:p>
                           <w:p>
@@ -1131,7 +1374,25 @@
                                 <w:sz w:val="20"/>
                                 <w:szCs w:val="20"/>
                               </w:rPr>
-                              <w:t xml:space="preserve">      "third": "Workshop C"</w:t>
+                              <w:t xml:space="preserve">      "</w:t>
+                            </w:r>
+                            <w:proofErr w:type="spellStart"/>
+                            <w:r>
+                              <w:rPr>
+                                <w:rFonts w:ascii="Cascadia Mono" w:hAnsi="Cascadia Mono"/>
+                                <w:sz w:val="20"/>
+                                <w:szCs w:val="20"/>
+                              </w:rPr>
+                              <w:t>third</w:t>
+                            </w:r>
+                            <w:proofErr w:type="spellEnd"/>
+                            <w:r>
+                              <w:rPr>
+                                <w:rFonts w:ascii="Cascadia Mono" w:hAnsi="Cascadia Mono"/>
+                                <w:sz w:val="20"/>
+                                <w:szCs w:val="20"/>
+                              </w:rPr>
+                              <w:t>": "Workshop C"</w:t>
                             </w:r>
                           </w:p>
                           <w:p>
@@ -1203,7 +1464,25 @@
                                 <w:sz w:val="20"/>
                                 <w:szCs w:val="20"/>
                               </w:rPr>
-                              <w:t xml:space="preserve">    "id": 2,</w:t>
+                              <w:t xml:space="preserve">    "</w:t>
+                            </w:r>
+                            <w:proofErr w:type="spellStart"/>
+                            <w:r>
+                              <w:rPr>
+                                <w:rFonts w:ascii="Cascadia Mono" w:hAnsi="Cascadia Mono"/>
+                                <w:sz w:val="20"/>
+                                <w:szCs w:val="20"/>
+                              </w:rPr>
+                              <w:t>id</w:t>
+                            </w:r>
+                            <w:proofErr w:type="spellEnd"/>
+                            <w:r>
+                              <w:rPr>
+                                <w:rFonts w:ascii="Cascadia Mono" w:hAnsi="Cascadia Mono"/>
+                                <w:sz w:val="20"/>
+                                <w:szCs w:val="20"/>
+                              </w:rPr>
+                              <w:t>": 2,</w:t>
                             </w:r>
                           </w:p>
                           <w:p>
@@ -1221,7 +1500,25 @@
                                 <w:sz w:val="20"/>
                                 <w:szCs w:val="20"/>
                               </w:rPr>
-                              <w:t xml:space="preserve">    "name": "Erika Musterfrau",</w:t>
+                              <w:t xml:space="preserve">    "</w:t>
+                            </w:r>
+                            <w:proofErr w:type="spellStart"/>
+                            <w:r>
+                              <w:rPr>
+                                <w:rFonts w:ascii="Cascadia Mono" w:hAnsi="Cascadia Mono"/>
+                                <w:sz w:val="20"/>
+                                <w:szCs w:val="20"/>
+                              </w:rPr>
+                              <w:t>name</w:t>
+                            </w:r>
+                            <w:proofErr w:type="spellEnd"/>
+                            <w:r>
+                              <w:rPr>
+                                <w:rFonts w:ascii="Cascadia Mono" w:hAnsi="Cascadia Mono"/>
+                                <w:sz w:val="20"/>
+                                <w:szCs w:val="20"/>
+                              </w:rPr>
+                              <w:t>": "Erika Musterfrau",</w:t>
                             </w:r>
                           </w:p>
                           <w:p>
@@ -1239,7 +1536,25 @@
                                 <w:sz w:val="20"/>
                                 <w:szCs w:val="20"/>
                               </w:rPr>
-                              <w:t xml:space="preserve">    "preferences": {</w:t>
+                              <w:t xml:space="preserve">    "</w:t>
+                            </w:r>
+                            <w:proofErr w:type="spellStart"/>
+                            <w:r>
+                              <w:rPr>
+                                <w:rFonts w:ascii="Cascadia Mono" w:hAnsi="Cascadia Mono"/>
+                                <w:sz w:val="20"/>
+                                <w:szCs w:val="20"/>
+                              </w:rPr>
+                              <w:t>preferences</w:t>
+                            </w:r>
+                            <w:proofErr w:type="spellEnd"/>
+                            <w:r>
+                              <w:rPr>
+                                <w:rFonts w:ascii="Cascadia Mono" w:hAnsi="Cascadia Mono"/>
+                                <w:sz w:val="20"/>
+                                <w:szCs w:val="20"/>
+                              </w:rPr>
+                              <w:t>": {</w:t>
                             </w:r>
                           </w:p>
                           <w:p>
@@ -1257,7 +1572,25 @@
                                 <w:sz w:val="20"/>
                                 <w:szCs w:val="20"/>
                               </w:rPr>
-                              <w:t xml:space="preserve">      "first": "Workshop B",</w:t>
+                              <w:t xml:space="preserve">      "</w:t>
+                            </w:r>
+                            <w:proofErr w:type="spellStart"/>
+                            <w:r>
+                              <w:rPr>
+                                <w:rFonts w:ascii="Cascadia Mono" w:hAnsi="Cascadia Mono"/>
+                                <w:sz w:val="20"/>
+                                <w:szCs w:val="20"/>
+                              </w:rPr>
+                              <w:t>first</w:t>
+                            </w:r>
+                            <w:proofErr w:type="spellEnd"/>
+                            <w:r>
+                              <w:rPr>
+                                <w:rFonts w:ascii="Cascadia Mono" w:hAnsi="Cascadia Mono"/>
+                                <w:sz w:val="20"/>
+                                <w:szCs w:val="20"/>
+                              </w:rPr>
+                              <w:t>": "Workshop B",</w:t>
                             </w:r>
                           </w:p>
                           <w:p>
@@ -1275,7 +1608,25 @@
                                 <w:sz w:val="20"/>
                                 <w:szCs w:val="20"/>
                               </w:rPr>
-                              <w:t xml:space="preserve">      "second": "Workshop A",</w:t>
+                              <w:t xml:space="preserve">      "</w:t>
+                            </w:r>
+                            <w:proofErr w:type="spellStart"/>
+                            <w:r>
+                              <w:rPr>
+                                <w:rFonts w:ascii="Cascadia Mono" w:hAnsi="Cascadia Mono"/>
+                                <w:sz w:val="20"/>
+                                <w:szCs w:val="20"/>
+                              </w:rPr>
+                              <w:t>second</w:t>
+                            </w:r>
+                            <w:proofErr w:type="spellEnd"/>
+                            <w:r>
+                              <w:rPr>
+                                <w:rFonts w:ascii="Cascadia Mono" w:hAnsi="Cascadia Mono"/>
+                                <w:sz w:val="20"/>
+                                <w:szCs w:val="20"/>
+                              </w:rPr>
+                              <w:t>": "Workshop A",</w:t>
                             </w:r>
                           </w:p>
                           <w:p>
@@ -1293,7 +1644,25 @@
                                 <w:sz w:val="20"/>
                                 <w:szCs w:val="20"/>
                               </w:rPr>
-                              <w:t xml:space="preserve">      "third": "Workshop D"</w:t>
+                              <w:t xml:space="preserve">      "</w:t>
+                            </w:r>
+                            <w:proofErr w:type="spellStart"/>
+                            <w:r>
+                              <w:rPr>
+                                <w:rFonts w:ascii="Cascadia Mono" w:hAnsi="Cascadia Mono"/>
+                                <w:sz w:val="20"/>
+                                <w:szCs w:val="20"/>
+                              </w:rPr>
+                              <w:t>third</w:t>
+                            </w:r>
+                            <w:proofErr w:type="spellEnd"/>
+                            <w:r>
+                              <w:rPr>
+                                <w:rFonts w:ascii="Cascadia Mono" w:hAnsi="Cascadia Mono"/>
+                                <w:sz w:val="20"/>
+                                <w:szCs w:val="20"/>
+                              </w:rPr>
+                              <w:t>": "Workshop D"</w:t>
                             </w:r>
                           </w:p>
                           <w:p>
@@ -1427,7 +1796,25 @@
                           <w:sz w:val="20"/>
                           <w:szCs w:val="20"/>
                         </w:rPr>
-                        <w:t xml:space="preserve">    "id": 1,</w:t>
+                        <w:t xml:space="preserve">    "</w:t>
+                      </w:r>
+                      <w:proofErr w:type="spellStart"/>
+                      <w:r>
+                        <w:rPr>
+                          <w:rFonts w:ascii="Cascadia Mono" w:hAnsi="Cascadia Mono"/>
+                          <w:sz w:val="20"/>
+                          <w:szCs w:val="20"/>
+                        </w:rPr>
+                        <w:t>id</w:t>
+                      </w:r>
+                      <w:proofErr w:type="spellEnd"/>
+                      <w:r>
+                        <w:rPr>
+                          <w:rFonts w:ascii="Cascadia Mono" w:hAnsi="Cascadia Mono"/>
+                          <w:sz w:val="20"/>
+                          <w:szCs w:val="20"/>
+                        </w:rPr>
+                        <w:t>": 1,</w:t>
                       </w:r>
                     </w:p>
                     <w:p>
@@ -1445,7 +1832,25 @@
                           <w:sz w:val="20"/>
                           <w:szCs w:val="20"/>
                         </w:rPr>
-                        <w:t xml:space="preserve">    "name": "Max Mustermann",</w:t>
+                        <w:t xml:space="preserve">    "</w:t>
+                      </w:r>
+                      <w:proofErr w:type="spellStart"/>
+                      <w:r>
+                        <w:rPr>
+                          <w:rFonts w:ascii="Cascadia Mono" w:hAnsi="Cascadia Mono"/>
+                          <w:sz w:val="20"/>
+                          <w:szCs w:val="20"/>
+                        </w:rPr>
+                        <w:t>name</w:t>
+                      </w:r>
+                      <w:proofErr w:type="spellEnd"/>
+                      <w:r>
+                        <w:rPr>
+                          <w:rFonts w:ascii="Cascadia Mono" w:hAnsi="Cascadia Mono"/>
+                          <w:sz w:val="20"/>
+                          <w:szCs w:val="20"/>
+                        </w:rPr>
+                        <w:t>": "Max Mustermann",</w:t>
                       </w:r>
                     </w:p>
                     <w:p>
@@ -1463,7 +1868,25 @@
                           <w:sz w:val="20"/>
                           <w:szCs w:val="20"/>
                         </w:rPr>
-                        <w:t xml:space="preserve">    "preferences": {</w:t>
+                        <w:t xml:space="preserve">    "</w:t>
+                      </w:r>
+                      <w:proofErr w:type="spellStart"/>
+                      <w:r>
+                        <w:rPr>
+                          <w:rFonts w:ascii="Cascadia Mono" w:hAnsi="Cascadia Mono"/>
+                          <w:sz w:val="20"/>
+                          <w:szCs w:val="20"/>
+                        </w:rPr>
+                        <w:t>preferences</w:t>
+                      </w:r>
+                      <w:proofErr w:type="spellEnd"/>
+                      <w:r>
+                        <w:rPr>
+                          <w:rFonts w:ascii="Cascadia Mono" w:hAnsi="Cascadia Mono"/>
+                          <w:sz w:val="20"/>
+                          <w:szCs w:val="20"/>
+                        </w:rPr>
+                        <w:t>": {</w:t>
                       </w:r>
                     </w:p>
                     <w:p>
@@ -1481,7 +1904,25 @@
                           <w:sz w:val="20"/>
                           <w:szCs w:val="20"/>
                         </w:rPr>
-                        <w:t xml:space="preserve">      "first": "Workshop A",</w:t>
+                        <w:t xml:space="preserve">      "</w:t>
+                      </w:r>
+                      <w:proofErr w:type="spellStart"/>
+                      <w:r>
+                        <w:rPr>
+                          <w:rFonts w:ascii="Cascadia Mono" w:hAnsi="Cascadia Mono"/>
+                          <w:sz w:val="20"/>
+                          <w:szCs w:val="20"/>
+                        </w:rPr>
+                        <w:t>first</w:t>
+                      </w:r>
+                      <w:proofErr w:type="spellEnd"/>
+                      <w:r>
+                        <w:rPr>
+                          <w:rFonts w:ascii="Cascadia Mono" w:hAnsi="Cascadia Mono"/>
+                          <w:sz w:val="20"/>
+                          <w:szCs w:val="20"/>
+                        </w:rPr>
+                        <w:t>": "Workshop A",</w:t>
                       </w:r>
                     </w:p>
                     <w:p>
@@ -1499,7 +1940,25 @@
                           <w:sz w:val="20"/>
                           <w:szCs w:val="20"/>
                         </w:rPr>
-                        <w:t xml:space="preserve">      "second": "Workshop B",</w:t>
+                        <w:t xml:space="preserve">      "</w:t>
+                      </w:r>
+                      <w:proofErr w:type="spellStart"/>
+                      <w:r>
+                        <w:rPr>
+                          <w:rFonts w:ascii="Cascadia Mono" w:hAnsi="Cascadia Mono"/>
+                          <w:sz w:val="20"/>
+                          <w:szCs w:val="20"/>
+                        </w:rPr>
+                        <w:t>second</w:t>
+                      </w:r>
+                      <w:proofErr w:type="spellEnd"/>
+                      <w:r>
+                        <w:rPr>
+                          <w:rFonts w:ascii="Cascadia Mono" w:hAnsi="Cascadia Mono"/>
+                          <w:sz w:val="20"/>
+                          <w:szCs w:val="20"/>
+                        </w:rPr>
+                        <w:t>": "Workshop B",</w:t>
                       </w:r>
                     </w:p>
                     <w:p>
@@ -1517,7 +1976,25 @@
                           <w:sz w:val="20"/>
                           <w:szCs w:val="20"/>
                         </w:rPr>
-                        <w:t xml:space="preserve">      "third": "Workshop C"</w:t>
+                        <w:t xml:space="preserve">      "</w:t>
+                      </w:r>
+                      <w:proofErr w:type="spellStart"/>
+                      <w:r>
+                        <w:rPr>
+                          <w:rFonts w:ascii="Cascadia Mono" w:hAnsi="Cascadia Mono"/>
+                          <w:sz w:val="20"/>
+                          <w:szCs w:val="20"/>
+                        </w:rPr>
+                        <w:t>third</w:t>
+                      </w:r>
+                      <w:proofErr w:type="spellEnd"/>
+                      <w:r>
+                        <w:rPr>
+                          <w:rFonts w:ascii="Cascadia Mono" w:hAnsi="Cascadia Mono"/>
+                          <w:sz w:val="20"/>
+                          <w:szCs w:val="20"/>
+                        </w:rPr>
+                        <w:t>": "Workshop C"</w:t>
                       </w:r>
                     </w:p>
                     <w:p>
@@ -1589,7 +2066,25 @@
                           <w:sz w:val="20"/>
                           <w:szCs w:val="20"/>
                         </w:rPr>
-                        <w:t xml:space="preserve">    "id": 2,</w:t>
+                        <w:t xml:space="preserve">    "</w:t>
+                      </w:r>
+                      <w:proofErr w:type="spellStart"/>
+                      <w:r>
+                        <w:rPr>
+                          <w:rFonts w:ascii="Cascadia Mono" w:hAnsi="Cascadia Mono"/>
+                          <w:sz w:val="20"/>
+                          <w:szCs w:val="20"/>
+                        </w:rPr>
+                        <w:t>id</w:t>
+                      </w:r>
+                      <w:proofErr w:type="spellEnd"/>
+                      <w:r>
+                        <w:rPr>
+                          <w:rFonts w:ascii="Cascadia Mono" w:hAnsi="Cascadia Mono"/>
+                          <w:sz w:val="20"/>
+                          <w:szCs w:val="20"/>
+                        </w:rPr>
+                        <w:t>": 2,</w:t>
                       </w:r>
                     </w:p>
                     <w:p>
@@ -1607,7 +2102,25 @@
                           <w:sz w:val="20"/>
                           <w:szCs w:val="20"/>
                         </w:rPr>
-                        <w:t xml:space="preserve">    "name": "Erika Musterfrau",</w:t>
+                        <w:t xml:space="preserve">    "</w:t>
+                      </w:r>
+                      <w:proofErr w:type="spellStart"/>
+                      <w:r>
+                        <w:rPr>
+                          <w:rFonts w:ascii="Cascadia Mono" w:hAnsi="Cascadia Mono"/>
+                          <w:sz w:val="20"/>
+                          <w:szCs w:val="20"/>
+                        </w:rPr>
+                        <w:t>name</w:t>
+                      </w:r>
+                      <w:proofErr w:type="spellEnd"/>
+                      <w:r>
+                        <w:rPr>
+                          <w:rFonts w:ascii="Cascadia Mono" w:hAnsi="Cascadia Mono"/>
+                          <w:sz w:val="20"/>
+                          <w:szCs w:val="20"/>
+                        </w:rPr>
+                        <w:t>": "Erika Musterfrau",</w:t>
                       </w:r>
                     </w:p>
                     <w:p>
@@ -1625,7 +2138,25 @@
                           <w:sz w:val="20"/>
                           <w:szCs w:val="20"/>
                         </w:rPr>
-                        <w:t xml:space="preserve">    "preferences": {</w:t>
+                        <w:t xml:space="preserve">    "</w:t>
+                      </w:r>
+                      <w:proofErr w:type="spellStart"/>
+                      <w:r>
+                        <w:rPr>
+                          <w:rFonts w:ascii="Cascadia Mono" w:hAnsi="Cascadia Mono"/>
+                          <w:sz w:val="20"/>
+                          <w:szCs w:val="20"/>
+                        </w:rPr>
+                        <w:t>preferences</w:t>
+                      </w:r>
+                      <w:proofErr w:type="spellEnd"/>
+                      <w:r>
+                        <w:rPr>
+                          <w:rFonts w:ascii="Cascadia Mono" w:hAnsi="Cascadia Mono"/>
+                          <w:sz w:val="20"/>
+                          <w:szCs w:val="20"/>
+                        </w:rPr>
+                        <w:t>": {</w:t>
                       </w:r>
                     </w:p>
                     <w:p>
@@ -1643,7 +2174,25 @@
                           <w:sz w:val="20"/>
                           <w:szCs w:val="20"/>
                         </w:rPr>
-                        <w:t xml:space="preserve">      "first": "Workshop B",</w:t>
+                        <w:t xml:space="preserve">      "</w:t>
+                      </w:r>
+                      <w:proofErr w:type="spellStart"/>
+                      <w:r>
+                        <w:rPr>
+                          <w:rFonts w:ascii="Cascadia Mono" w:hAnsi="Cascadia Mono"/>
+                          <w:sz w:val="20"/>
+                          <w:szCs w:val="20"/>
+                        </w:rPr>
+                        <w:t>first</w:t>
+                      </w:r>
+                      <w:proofErr w:type="spellEnd"/>
+                      <w:r>
+                        <w:rPr>
+                          <w:rFonts w:ascii="Cascadia Mono" w:hAnsi="Cascadia Mono"/>
+                          <w:sz w:val="20"/>
+                          <w:szCs w:val="20"/>
+                        </w:rPr>
+                        <w:t>": "Workshop B",</w:t>
                       </w:r>
                     </w:p>
                     <w:p>
@@ -1661,7 +2210,25 @@
                           <w:sz w:val="20"/>
                           <w:szCs w:val="20"/>
                         </w:rPr>
-                        <w:t xml:space="preserve">      "second": "Workshop A",</w:t>
+                        <w:t xml:space="preserve">      "</w:t>
+                      </w:r>
+                      <w:proofErr w:type="spellStart"/>
+                      <w:r>
+                        <w:rPr>
+                          <w:rFonts w:ascii="Cascadia Mono" w:hAnsi="Cascadia Mono"/>
+                          <w:sz w:val="20"/>
+                          <w:szCs w:val="20"/>
+                        </w:rPr>
+                        <w:t>second</w:t>
+                      </w:r>
+                      <w:proofErr w:type="spellEnd"/>
+                      <w:r>
+                        <w:rPr>
+                          <w:rFonts w:ascii="Cascadia Mono" w:hAnsi="Cascadia Mono"/>
+                          <w:sz w:val="20"/>
+                          <w:szCs w:val="20"/>
+                        </w:rPr>
+                        <w:t>": "Workshop A",</w:t>
                       </w:r>
                     </w:p>
                     <w:p>
@@ -1679,7 +2246,25 @@
                           <w:sz w:val="20"/>
                           <w:szCs w:val="20"/>
                         </w:rPr>
-                        <w:t xml:space="preserve">      "third": "Workshop D"</w:t>
+                        <w:t xml:space="preserve">      "</w:t>
+                      </w:r>
+                      <w:proofErr w:type="spellStart"/>
+                      <w:r>
+                        <w:rPr>
+                          <w:rFonts w:ascii="Cascadia Mono" w:hAnsi="Cascadia Mono"/>
+                          <w:sz w:val="20"/>
+                          <w:szCs w:val="20"/>
+                        </w:rPr>
+                        <w:t>third</w:t>
+                      </w:r>
+                      <w:proofErr w:type="spellEnd"/>
+                      <w:r>
+                        <w:rPr>
+                          <w:rFonts w:ascii="Cascadia Mono" w:hAnsi="Cascadia Mono"/>
+                          <w:sz w:val="20"/>
+                          <w:szCs w:val="20"/>
+                        </w:rPr>
+                        <w:t>": "Workshop D"</w:t>
                       </w:r>
                     </w:p>
                     <w:p>
@@ -1750,48 +2335,43 @@
           <w:b/>
           <w:bCs/>
         </w:rPr>
-        <w:t>📂</w:t>
-      </w:r>
-      <w:r>
-        <w:rPr>
-          <w:rFonts w:ascii="Segoe UI Emoji" w:hAnsi="Segoe UI Emoji" w:cs="Segoe UI Emoji"/>
+        <w:t xml:space="preserve">📂 </w:t>
+      </w:r>
+      <w:r>
+        <w:rPr>
           <w:b/>
           <w:bCs/>
         </w:rPr>
-        <w:t xml:space="preserve"> </w:t>
-      </w:r>
+        <w:t>Beispiel-Datei</w:t>
+      </w:r>
+      <w:r>
+        <w:t xml:space="preserve"> (</w:t>
+      </w:r>
+      <w:proofErr w:type="spellStart"/>
+      <w:proofErr w:type="gramStart"/>
+      <w:r>
+        <w:rPr>
+          <w:rFonts w:ascii="Cascadia Mono" w:hAnsi="Cascadia Mono"/>
+        </w:rPr>
+        <w:t>preferences.json</w:t>
+      </w:r>
+      <w:proofErr w:type="spellEnd"/>
+      <w:proofErr w:type="gramEnd"/>
+      <w:r>
+        <w:t xml:space="preserve">): </w:t>
+      </w:r>
+    </w:p>
+    <w:p>
+      <w:pPr>
+        <w:rPr>
+          <w:noProof/>
+        </w:rPr>
+      </w:pPr>
       <w:r>
         <w:rPr>
           <w:b/>
           <w:bCs/>
         </w:rPr>
-        <w:t>Beispiel-Datei</w:t>
-      </w:r>
-      <w:r>
-        <w:t xml:space="preserve"> (</w:t>
-      </w:r>
-      <w:r>
-        <w:rPr>
-          <w:rFonts w:ascii="Cascadia Mono" w:hAnsi="Cascadia Mono"/>
-        </w:rPr>
-        <w:t>preferences.json</w:t>
-      </w:r>
-      <w:r>
-        <w:t xml:space="preserve">): </w:t>
-      </w:r>
-    </w:p>
-    <w:p>
-      <w:pPr>
-        <w:rPr>
-          <w:noProof/>
-        </w:rPr>
-      </w:pPr>
-      <w:r>
-        <w:rPr>
-          <w:b/>
-          <w:bCs/>
-        </w:rPr>
-        <w:lastRenderedPageBreak/>
         <w:t>Tabelle:</w:t>
       </w:r>
       <w:r>
@@ -1936,6 +2516,12 @@
         <w:rPr>
           <w:noProof/>
         </w:rPr>
+        <w:t>Dieses Feature ist dafür gedacht, um zu überprüfen ob eine Person ihren Namen falsch geschrieben hat. Der eingetragene Name wir genau so wie er in der Liste angezeigt wird auch direkt ausgedruckt. Die Zeile wird also Rot markiert, falls die Abgabe nicht mit den erwarteteten Namen übereinstimmt.</w:t>
+      </w:r>
+      <w:r>
+        <w:rPr>
+          <w:noProof/>
+        </w:rPr>
         <w:drawing>
           <wp:inline distT="0" distB="0" distL="0" distR="0" wp14:anchorId="5FA4246B" wp14:editId="339BEEAB">
             <wp:extent cx="5400675" cy="286128"/>
@@ -1988,6 +2574,65 @@
     </w:p>
     <w:p>
       <w:pPr>
+        <w:pStyle w:val="ListParagraph"/>
+        <w:numPr>
+          <w:ilvl w:val="0"/>
+          <w:numId w:val="3"/>
+        </w:numPr>
+      </w:pPr>
+      <w:r>
+        <w:rPr>
+          <w:b/>
+          <w:bCs/>
+        </w:rPr>
+        <w:t>Grüne Markierung:</w:t>
+      </w:r>
+      <w:r>
+        <w:t xml:space="preserve"> Diese zeigt nach einer generierten Zuteilung an, welcher Wunsch für eine Person gewählt wurde.</w:t>
+      </w:r>
+      <w:r>
+        <w:br/>
+      </w:r>
+      <w:r>
+        <w:drawing>
+          <wp:inline distT="0" distB="0" distL="0" distR="0" wp14:anchorId="1B662F85" wp14:editId="2D3DE1F3">
+            <wp:extent cx="5276850" cy="365866"/>
+            <wp:effectExtent l="0" t="0" r="0" b="0"/>
+            <wp:docPr id="300478160" name="Picture 1"/>
+            <wp:cNvGraphicFramePr>
+              <a:graphicFrameLocks xmlns:a="http://schemas.openxmlformats.org/drawingml/2006/main" noChangeAspect="1"/>
+            </wp:cNvGraphicFramePr>
+            <a:graphic xmlns:a="http://schemas.openxmlformats.org/drawingml/2006/main">
+              <a:graphicData uri="http://schemas.openxmlformats.org/drawingml/2006/picture">
+                <pic:pic xmlns:pic="http://schemas.openxmlformats.org/drawingml/2006/picture">
+                  <pic:nvPicPr>
+                    <pic:cNvPr id="300478160" name=""/>
+                    <pic:cNvPicPr/>
+                  </pic:nvPicPr>
+                  <pic:blipFill>
+                    <a:blip r:embed="rId11"/>
+                    <a:stretch>
+                      <a:fillRect/>
+                    </a:stretch>
+                  </pic:blipFill>
+                  <pic:spPr>
+                    <a:xfrm>
+                      <a:off x="0" y="0"/>
+                      <a:ext cx="5351222" cy="371022"/>
+                    </a:xfrm>
+                    <a:prstGeom prst="rect">
+                      <a:avLst/>
+                    </a:prstGeom>
+                  </pic:spPr>
+                </pic:pic>
+              </a:graphicData>
+            </a:graphic>
+          </wp:inline>
+        </w:drawing>
+      </w:r>
+    </w:p>
+    <w:p>
+      <w:pPr>
         <w:rPr>
           <w:b/>
           <w:bCs/>
@@ -2080,11 +2725,12 @@
       <w:pPr>
         <w:pStyle w:val="Heading1"/>
       </w:pPr>
-      <w:bookmarkStart w:id="1" w:name="_Toc209964200"/>
+      <w:bookmarkStart w:id="1" w:name="_Toc210980689"/>
       <w:r>
         <w:rPr>
           <w:noProof/>
         </w:rPr>
+        <w:lastRenderedPageBreak/>
         <w:drawing>
           <wp:anchor distT="0" distB="0" distL="114300" distR="114300" simplePos="0" relativeHeight="251663360" behindDoc="0" locked="0" layoutInCell="1" allowOverlap="1" wp14:anchorId="5FEDAEF6" wp14:editId="2CF8522D">
             <wp:simplePos x="0" y="0"/>
@@ -2111,7 +2757,7 @@
                     </pic:cNvPicPr>
                   </pic:nvPicPr>
                   <pic:blipFill>
-                    <a:blip r:embed="rId11">
+                    <a:blip r:embed="rId12">
                       <a:extLst>
                         <a:ext uri="{28A0092B-C50C-407E-A947-70E740481C1C}">
                           <a14:useLocalDpi xmlns:a14="http://schemas.microsoft.com/office/drawing/2010/main" val="0"/>
@@ -2156,14 +2802,7 @@
           <w:b/>
           <w:bCs/>
         </w:rPr>
-        <w:t>Workshop</w:t>
-      </w:r>
-      <w:r>
-        <w:rPr>
-          <w:b/>
-          <w:bCs/>
-        </w:rPr>
-        <w:t>s</w:t>
+        <w:t>Workshops</w:t>
       </w:r>
       <w:r>
         <w:t xml:space="preserve"> eingesehen, bearbeitet und verwaltet werden.</w:t>
@@ -2185,14 +2824,35 @@
         <w:t>Export</w:t>
       </w:r>
       <w:r>
-        <w:t xml:space="preserve"> → Exportiert alle Workshops im </w:t>
+        <w:t xml:space="preserve"> → </w:t>
+      </w:r>
+      <w:proofErr w:type="gramStart"/>
+      <w:r>
+        <w:t>Exportiert</w:t>
+      </w:r>
+      <w:proofErr w:type="gramEnd"/>
+      <w:r>
+        <w:t xml:space="preserve"> alle Workshops </w:t>
+      </w:r>
+      <w:proofErr w:type="gramStart"/>
+      <w:r>
+        <w:t xml:space="preserve">im </w:t>
       </w:r>
       <w:r>
         <w:rPr>
           <w:rFonts w:ascii="Cascadia Mono" w:hAnsi="Cascadia Mono"/>
         </w:rPr>
-        <w:t>.json</w:t>
-      </w:r>
+        <w:t>.</w:t>
+      </w:r>
+      <w:proofErr w:type="spellStart"/>
+      <w:r>
+        <w:rPr>
+          <w:rFonts w:ascii="Cascadia Mono" w:hAnsi="Cascadia Mono"/>
+        </w:rPr>
+        <w:t>json</w:t>
+      </w:r>
+      <w:proofErr w:type="spellEnd"/>
+      <w:proofErr w:type="gramEnd"/>
       <w:r>
         <w:t>-Format.</w:t>
       </w:r>
@@ -2213,13 +2873,40 @@
         <w:t xml:space="preserve">Import </w:t>
       </w:r>
       <w:r>
-        <w:t xml:space="preserve">→ Importiert Workshops im </w:t>
+        <w:t xml:space="preserve">→ </w:t>
+      </w:r>
+      <w:proofErr w:type="gramStart"/>
+      <w:r>
+        <w:t>Importiert</w:t>
+      </w:r>
+      <w:proofErr w:type="gramEnd"/>
+      <w:r>
+        <w:t xml:space="preserve"> Workshops </w:t>
+      </w:r>
+      <w:proofErr w:type="gramStart"/>
+      <w:r>
+        <w:t xml:space="preserve">im </w:t>
       </w:r>
       <w:r>
         <w:rPr>
           <w:rFonts w:ascii="Cascadia Mono" w:hAnsi="Cascadia Mono"/>
         </w:rPr>
-        <w:t>.json-</w:t>
+        <w:t>.</w:t>
+      </w:r>
+      <w:proofErr w:type="spellStart"/>
+      <w:r>
+        <w:rPr>
+          <w:rFonts w:ascii="Cascadia Mono" w:hAnsi="Cascadia Mono"/>
+        </w:rPr>
+        <w:t>json</w:t>
+      </w:r>
+      <w:proofErr w:type="spellEnd"/>
+      <w:proofErr w:type="gramEnd"/>
+      <w:r>
+        <w:rPr>
+          <w:rFonts w:ascii="Cascadia Mono" w:hAnsi="Cascadia Mono"/>
+        </w:rPr>
+        <w:t>-</w:t>
       </w:r>
       <w:r>
         <w:t>Format.</w:t>
@@ -2338,7 +3025,27 @@
                                 <w:sz w:val="20"/>
                                 <w:szCs w:val="20"/>
                               </w:rPr>
-                              <w:t xml:space="preserve">    "id": 1,</w:t>
+                              <w:t xml:space="preserve">    "</w:t>
+                            </w:r>
+                            <w:proofErr w:type="spellStart"/>
+                            <w:r>
+                              <w:rPr>
+                                <w:rStyle w:val="markedcontent"/>
+                                <w:rFonts w:ascii="Cascadia Mono" w:hAnsi="Cascadia Mono"/>
+                                <w:sz w:val="20"/>
+                                <w:szCs w:val="20"/>
+                              </w:rPr>
+                              <w:t>id</w:t>
+                            </w:r>
+                            <w:proofErr w:type="spellEnd"/>
+                            <w:r>
+                              <w:rPr>
+                                <w:rStyle w:val="markedcontent"/>
+                                <w:rFonts w:ascii="Cascadia Mono" w:hAnsi="Cascadia Mono"/>
+                                <w:sz w:val="20"/>
+                                <w:szCs w:val="20"/>
+                              </w:rPr>
+                              <w:t>": 1,</w:t>
                             </w:r>
                           </w:p>
                           <w:p>
@@ -2378,7 +3085,27 @@
                                 <w:sz w:val="20"/>
                                 <w:szCs w:val="20"/>
                               </w:rPr>
-                              <w:t xml:space="preserve">    "maxParticipants": 20,</w:t>
+                              <w:t xml:space="preserve">    "</w:t>
+                            </w:r>
+                            <w:proofErr w:type="spellStart"/>
+                            <w:r>
+                              <w:rPr>
+                                <w:rStyle w:val="markedcontent"/>
+                                <w:rFonts w:ascii="Cascadia Mono" w:hAnsi="Cascadia Mono"/>
+                                <w:sz w:val="20"/>
+                                <w:szCs w:val="20"/>
+                              </w:rPr>
+                              <w:t>maxParticipants</w:t>
+                            </w:r>
+                            <w:proofErr w:type="spellEnd"/>
+                            <w:r>
+                              <w:rPr>
+                                <w:rStyle w:val="markedcontent"/>
+                                <w:rFonts w:ascii="Cascadia Mono" w:hAnsi="Cascadia Mono"/>
+                                <w:sz w:val="20"/>
+                                <w:szCs w:val="20"/>
+                              </w:rPr>
+                              <w:t>": 20,</w:t>
                             </w:r>
                           </w:p>
                           <w:p>
@@ -2398,7 +3125,27 @@
                                 <w:sz w:val="20"/>
                                 <w:szCs w:val="20"/>
                               </w:rPr>
-                              <w:t xml:space="preserve">    "minParticipants": 5,</w:t>
+                              <w:t xml:space="preserve">    "</w:t>
+                            </w:r>
+                            <w:proofErr w:type="spellStart"/>
+                            <w:r>
+                              <w:rPr>
+                                <w:rStyle w:val="markedcontent"/>
+                                <w:rFonts w:ascii="Cascadia Mono" w:hAnsi="Cascadia Mono"/>
+                                <w:sz w:val="20"/>
+                                <w:szCs w:val="20"/>
+                              </w:rPr>
+                              <w:t>minParticipants</w:t>
+                            </w:r>
+                            <w:proofErr w:type="spellEnd"/>
+                            <w:r>
+                              <w:rPr>
+                                <w:rStyle w:val="markedcontent"/>
+                                <w:rFonts w:ascii="Cascadia Mono" w:hAnsi="Cascadia Mono"/>
+                                <w:sz w:val="20"/>
+                                <w:szCs w:val="20"/>
+                              </w:rPr>
+                              <w:t>": 5,</w:t>
                             </w:r>
                           </w:p>
                           <w:p>
@@ -2417,7 +3164,27 @@
                                 <w:sz w:val="20"/>
                                 <w:szCs w:val="20"/>
                               </w:rPr>
-                              <w:t xml:space="preserve">    "staff": "Herr Schmidt"</w:t>
+                              <w:t xml:space="preserve">    "</w:t>
+                            </w:r>
+                            <w:proofErr w:type="spellStart"/>
+                            <w:r>
+                              <w:rPr>
+                                <w:rStyle w:val="markedcontent"/>
+                                <w:rFonts w:ascii="Cascadia Mono" w:hAnsi="Cascadia Mono"/>
+                                <w:sz w:val="20"/>
+                                <w:szCs w:val="20"/>
+                              </w:rPr>
+                              <w:t>staff</w:t>
+                            </w:r>
+                            <w:proofErr w:type="spellEnd"/>
+                            <w:r>
+                              <w:rPr>
+                                <w:rStyle w:val="markedcontent"/>
+                                <w:rFonts w:ascii="Cascadia Mono" w:hAnsi="Cascadia Mono"/>
+                                <w:sz w:val="20"/>
+                                <w:szCs w:val="20"/>
+                              </w:rPr>
+                              <w:t>": "Herr Schmidt"</w:t>
                             </w:r>
                           </w:p>
                           <w:p>
@@ -2477,7 +3244,27 @@
                                 <w:sz w:val="20"/>
                                 <w:szCs w:val="20"/>
                               </w:rPr>
-                              <w:t xml:space="preserve">    "id": 2,</w:t>
+                              <w:t xml:space="preserve">    "</w:t>
+                            </w:r>
+                            <w:proofErr w:type="spellStart"/>
+                            <w:r>
+                              <w:rPr>
+                                <w:rStyle w:val="markedcontent"/>
+                                <w:rFonts w:ascii="Cascadia Mono" w:hAnsi="Cascadia Mono"/>
+                                <w:sz w:val="20"/>
+                                <w:szCs w:val="20"/>
+                              </w:rPr>
+                              <w:t>id</w:t>
+                            </w:r>
+                            <w:proofErr w:type="spellEnd"/>
+                            <w:r>
+                              <w:rPr>
+                                <w:rStyle w:val="markedcontent"/>
+                                <w:rFonts w:ascii="Cascadia Mono" w:hAnsi="Cascadia Mono"/>
+                                <w:sz w:val="20"/>
+                                <w:szCs w:val="20"/>
+                              </w:rPr>
+                              <w:t>": 2,</w:t>
                             </w:r>
                           </w:p>
                           <w:p>
@@ -2517,7 +3304,27 @@
                                 <w:sz w:val="20"/>
                                 <w:szCs w:val="20"/>
                               </w:rPr>
-                              <w:t xml:space="preserve">    "maxParticipants": 15,</w:t>
+                              <w:t xml:space="preserve">    "</w:t>
+                            </w:r>
+                            <w:proofErr w:type="spellStart"/>
+                            <w:r>
+                              <w:rPr>
+                                <w:rStyle w:val="markedcontent"/>
+                                <w:rFonts w:ascii="Cascadia Mono" w:hAnsi="Cascadia Mono"/>
+                                <w:sz w:val="20"/>
+                                <w:szCs w:val="20"/>
+                              </w:rPr>
+                              <w:t>maxParticipants</w:t>
+                            </w:r>
+                            <w:proofErr w:type="spellEnd"/>
+                            <w:r>
+                              <w:rPr>
+                                <w:rStyle w:val="markedcontent"/>
+                                <w:rFonts w:ascii="Cascadia Mono" w:hAnsi="Cascadia Mono"/>
+                                <w:sz w:val="20"/>
+                                <w:szCs w:val="20"/>
+                              </w:rPr>
+                              <w:t>": 15,</w:t>
                             </w:r>
                           </w:p>
                           <w:p>
@@ -2537,7 +3344,27 @@
                                 <w:sz w:val="20"/>
                                 <w:szCs w:val="20"/>
                               </w:rPr>
-                              <w:t xml:space="preserve">    "minParticipants": 5,</w:t>
+                              <w:t xml:space="preserve">    "</w:t>
+                            </w:r>
+                            <w:proofErr w:type="spellStart"/>
+                            <w:r>
+                              <w:rPr>
+                                <w:rStyle w:val="markedcontent"/>
+                                <w:rFonts w:ascii="Cascadia Mono" w:hAnsi="Cascadia Mono"/>
+                                <w:sz w:val="20"/>
+                                <w:szCs w:val="20"/>
+                              </w:rPr>
+                              <w:t>minParticipants</w:t>
+                            </w:r>
+                            <w:proofErr w:type="spellEnd"/>
+                            <w:r>
+                              <w:rPr>
+                                <w:rStyle w:val="markedcontent"/>
+                                <w:rFonts w:ascii="Cascadia Mono" w:hAnsi="Cascadia Mono"/>
+                                <w:sz w:val="20"/>
+                                <w:szCs w:val="20"/>
+                              </w:rPr>
+                              <w:t>": 5,</w:t>
                             </w:r>
                           </w:p>
                           <w:p>
@@ -2556,7 +3383,27 @@
                                 <w:sz w:val="20"/>
                                 <w:szCs w:val="20"/>
                               </w:rPr>
-                              <w:t xml:space="preserve">    "staff": "Frau Müller"</w:t>
+                              <w:t xml:space="preserve">    "</w:t>
+                            </w:r>
+                            <w:proofErr w:type="spellStart"/>
+                            <w:r>
+                              <w:rPr>
+                                <w:rStyle w:val="markedcontent"/>
+                                <w:rFonts w:ascii="Cascadia Mono" w:hAnsi="Cascadia Mono"/>
+                                <w:sz w:val="20"/>
+                                <w:szCs w:val="20"/>
+                              </w:rPr>
+                              <w:t>staff</w:t>
+                            </w:r>
+                            <w:proofErr w:type="spellEnd"/>
+                            <w:r>
+                              <w:rPr>
+                                <w:rStyle w:val="markedcontent"/>
+                                <w:rFonts w:ascii="Cascadia Mono" w:hAnsi="Cascadia Mono"/>
+                                <w:sz w:val="20"/>
+                                <w:szCs w:val="20"/>
+                              </w:rPr>
+                              <w:t>": "Frau Müller"</w:t>
                             </w:r>
                           </w:p>
                           <w:p>
@@ -2677,7 +3524,27 @@
                           <w:sz w:val="20"/>
                           <w:szCs w:val="20"/>
                         </w:rPr>
-                        <w:t xml:space="preserve">    "id": 1,</w:t>
+                        <w:t xml:space="preserve">    "</w:t>
+                      </w:r>
+                      <w:proofErr w:type="spellStart"/>
+                      <w:r>
+                        <w:rPr>
+                          <w:rStyle w:val="markedcontent"/>
+                          <w:rFonts w:ascii="Cascadia Mono" w:hAnsi="Cascadia Mono"/>
+                          <w:sz w:val="20"/>
+                          <w:szCs w:val="20"/>
+                        </w:rPr>
+                        <w:t>id</w:t>
+                      </w:r>
+                      <w:proofErr w:type="spellEnd"/>
+                      <w:r>
+                        <w:rPr>
+                          <w:rStyle w:val="markedcontent"/>
+                          <w:rFonts w:ascii="Cascadia Mono" w:hAnsi="Cascadia Mono"/>
+                          <w:sz w:val="20"/>
+                          <w:szCs w:val="20"/>
+                        </w:rPr>
+                        <w:t>": 1,</w:t>
                       </w:r>
                     </w:p>
                     <w:p>
@@ -2717,7 +3584,27 @@
                           <w:sz w:val="20"/>
                           <w:szCs w:val="20"/>
                         </w:rPr>
-                        <w:t xml:space="preserve">    "maxParticipants": 20,</w:t>
+                        <w:t xml:space="preserve">    "</w:t>
+                      </w:r>
+                      <w:proofErr w:type="spellStart"/>
+                      <w:r>
+                        <w:rPr>
+                          <w:rStyle w:val="markedcontent"/>
+                          <w:rFonts w:ascii="Cascadia Mono" w:hAnsi="Cascadia Mono"/>
+                          <w:sz w:val="20"/>
+                          <w:szCs w:val="20"/>
+                        </w:rPr>
+                        <w:t>maxParticipants</w:t>
+                      </w:r>
+                      <w:proofErr w:type="spellEnd"/>
+                      <w:r>
+                        <w:rPr>
+                          <w:rStyle w:val="markedcontent"/>
+                          <w:rFonts w:ascii="Cascadia Mono" w:hAnsi="Cascadia Mono"/>
+                          <w:sz w:val="20"/>
+                          <w:szCs w:val="20"/>
+                        </w:rPr>
+                        <w:t>": 20,</w:t>
                       </w:r>
                     </w:p>
                     <w:p>
@@ -2737,7 +3624,27 @@
                           <w:sz w:val="20"/>
                           <w:szCs w:val="20"/>
                         </w:rPr>
-                        <w:t xml:space="preserve">    "minParticipants": 5,</w:t>
+                        <w:t xml:space="preserve">    "</w:t>
+                      </w:r>
+                      <w:proofErr w:type="spellStart"/>
+                      <w:r>
+                        <w:rPr>
+                          <w:rStyle w:val="markedcontent"/>
+                          <w:rFonts w:ascii="Cascadia Mono" w:hAnsi="Cascadia Mono"/>
+                          <w:sz w:val="20"/>
+                          <w:szCs w:val="20"/>
+                        </w:rPr>
+                        <w:t>minParticipants</w:t>
+                      </w:r>
+                      <w:proofErr w:type="spellEnd"/>
+                      <w:r>
+                        <w:rPr>
+                          <w:rStyle w:val="markedcontent"/>
+                          <w:rFonts w:ascii="Cascadia Mono" w:hAnsi="Cascadia Mono"/>
+                          <w:sz w:val="20"/>
+                          <w:szCs w:val="20"/>
+                        </w:rPr>
+                        <w:t>": 5,</w:t>
                       </w:r>
                     </w:p>
                     <w:p>
@@ -2756,7 +3663,27 @@
                           <w:sz w:val="20"/>
                           <w:szCs w:val="20"/>
                         </w:rPr>
-                        <w:t xml:space="preserve">    "staff": "Herr Schmidt"</w:t>
+                        <w:t xml:space="preserve">    "</w:t>
+                      </w:r>
+                      <w:proofErr w:type="spellStart"/>
+                      <w:r>
+                        <w:rPr>
+                          <w:rStyle w:val="markedcontent"/>
+                          <w:rFonts w:ascii="Cascadia Mono" w:hAnsi="Cascadia Mono"/>
+                          <w:sz w:val="20"/>
+                          <w:szCs w:val="20"/>
+                        </w:rPr>
+                        <w:t>staff</w:t>
+                      </w:r>
+                      <w:proofErr w:type="spellEnd"/>
+                      <w:r>
+                        <w:rPr>
+                          <w:rStyle w:val="markedcontent"/>
+                          <w:rFonts w:ascii="Cascadia Mono" w:hAnsi="Cascadia Mono"/>
+                          <w:sz w:val="20"/>
+                          <w:szCs w:val="20"/>
+                        </w:rPr>
+                        <w:t>": "Herr Schmidt"</w:t>
                       </w:r>
                     </w:p>
                     <w:p>
@@ -2816,7 +3743,27 @@
                           <w:sz w:val="20"/>
                           <w:szCs w:val="20"/>
                         </w:rPr>
-                        <w:t xml:space="preserve">    "id": 2,</w:t>
+                        <w:t xml:space="preserve">    "</w:t>
+                      </w:r>
+                      <w:proofErr w:type="spellStart"/>
+                      <w:r>
+                        <w:rPr>
+                          <w:rStyle w:val="markedcontent"/>
+                          <w:rFonts w:ascii="Cascadia Mono" w:hAnsi="Cascadia Mono"/>
+                          <w:sz w:val="20"/>
+                          <w:szCs w:val="20"/>
+                        </w:rPr>
+                        <w:t>id</w:t>
+                      </w:r>
+                      <w:proofErr w:type="spellEnd"/>
+                      <w:r>
+                        <w:rPr>
+                          <w:rStyle w:val="markedcontent"/>
+                          <w:rFonts w:ascii="Cascadia Mono" w:hAnsi="Cascadia Mono"/>
+                          <w:sz w:val="20"/>
+                          <w:szCs w:val="20"/>
+                        </w:rPr>
+                        <w:t>": 2,</w:t>
                       </w:r>
                     </w:p>
                     <w:p>
@@ -2856,7 +3803,27 @@
                           <w:sz w:val="20"/>
                           <w:szCs w:val="20"/>
                         </w:rPr>
-                        <w:t xml:space="preserve">    "maxParticipants": 15,</w:t>
+                        <w:t xml:space="preserve">    "</w:t>
+                      </w:r>
+                      <w:proofErr w:type="spellStart"/>
+                      <w:r>
+                        <w:rPr>
+                          <w:rStyle w:val="markedcontent"/>
+                          <w:rFonts w:ascii="Cascadia Mono" w:hAnsi="Cascadia Mono"/>
+                          <w:sz w:val="20"/>
+                          <w:szCs w:val="20"/>
+                        </w:rPr>
+                        <w:t>maxParticipants</w:t>
+                      </w:r>
+                      <w:proofErr w:type="spellEnd"/>
+                      <w:r>
+                        <w:rPr>
+                          <w:rStyle w:val="markedcontent"/>
+                          <w:rFonts w:ascii="Cascadia Mono" w:hAnsi="Cascadia Mono"/>
+                          <w:sz w:val="20"/>
+                          <w:szCs w:val="20"/>
+                        </w:rPr>
+                        <w:t>": 15,</w:t>
                       </w:r>
                     </w:p>
                     <w:p>
@@ -2876,7 +3843,27 @@
                           <w:sz w:val="20"/>
                           <w:szCs w:val="20"/>
                         </w:rPr>
-                        <w:t xml:space="preserve">    "minParticipants": 5,</w:t>
+                        <w:t xml:space="preserve">    "</w:t>
+                      </w:r>
+                      <w:proofErr w:type="spellStart"/>
+                      <w:r>
+                        <w:rPr>
+                          <w:rStyle w:val="markedcontent"/>
+                          <w:rFonts w:ascii="Cascadia Mono" w:hAnsi="Cascadia Mono"/>
+                          <w:sz w:val="20"/>
+                          <w:szCs w:val="20"/>
+                        </w:rPr>
+                        <w:t>minParticipants</w:t>
+                      </w:r>
+                      <w:proofErr w:type="spellEnd"/>
+                      <w:r>
+                        <w:rPr>
+                          <w:rStyle w:val="markedcontent"/>
+                          <w:rFonts w:ascii="Cascadia Mono" w:hAnsi="Cascadia Mono"/>
+                          <w:sz w:val="20"/>
+                          <w:szCs w:val="20"/>
+                        </w:rPr>
+                        <w:t>": 5,</w:t>
                       </w:r>
                     </w:p>
                     <w:p>
@@ -2895,7 +3882,27 @@
                           <w:sz w:val="20"/>
                           <w:szCs w:val="20"/>
                         </w:rPr>
-                        <w:t xml:space="preserve">    "staff": "Frau Müller"</w:t>
+                        <w:t xml:space="preserve">    "</w:t>
+                      </w:r>
+                      <w:proofErr w:type="spellStart"/>
+                      <w:r>
+                        <w:rPr>
+                          <w:rStyle w:val="markedcontent"/>
+                          <w:rFonts w:ascii="Cascadia Mono" w:hAnsi="Cascadia Mono"/>
+                          <w:sz w:val="20"/>
+                          <w:szCs w:val="20"/>
+                        </w:rPr>
+                        <w:t>staff</w:t>
+                      </w:r>
+                      <w:proofErr w:type="spellEnd"/>
+                      <w:r>
+                        <w:rPr>
+                          <w:rStyle w:val="markedcontent"/>
+                          <w:rFonts w:ascii="Cascadia Mono" w:hAnsi="Cascadia Mono"/>
+                          <w:sz w:val="20"/>
+                          <w:szCs w:val="20"/>
+                        </w:rPr>
+                        <w:t>": "Frau Müller"</w:t>
                       </w:r>
                     </w:p>
                     <w:p>
@@ -2963,18 +3970,16 @@
       <w:r>
         <w:t xml:space="preserve"> (</w:t>
       </w:r>
+      <w:proofErr w:type="spellStart"/>
+      <w:proofErr w:type="gramStart"/>
       <w:r>
         <w:rPr>
           <w:rFonts w:ascii="Cascadia Mono" w:hAnsi="Cascadia Mono"/>
         </w:rPr>
-        <w:t>workshops</w:t>
-      </w:r>
-      <w:r>
-        <w:rPr>
-          <w:rFonts w:ascii="Cascadia Mono" w:hAnsi="Cascadia Mono"/>
-        </w:rPr>
-        <w:t>.json</w:t>
-      </w:r>
+        <w:t>workshops.json</w:t>
+      </w:r>
+      <w:proofErr w:type="spellEnd"/>
+      <w:proofErr w:type="gramEnd"/>
       <w:r>
         <w:t xml:space="preserve">): </w:t>
       </w:r>
@@ -3017,7 +4022,6 @@
         <w:rPr>
           <w:noProof/>
         </w:rPr>
-        <w:lastRenderedPageBreak/>
         <w:drawing>
           <wp:anchor distT="0" distB="0" distL="114300" distR="114300" simplePos="0" relativeHeight="251664384" behindDoc="0" locked="0" layoutInCell="1" allowOverlap="1" wp14:anchorId="6753DA00" wp14:editId="3ECAD4BF">
             <wp:simplePos x="0" y="0"/>
@@ -3044,7 +4048,7 @@
                     </pic:cNvPicPr>
                   </pic:nvPicPr>
                   <pic:blipFill>
-                    <a:blip r:embed="rId12" cstate="print">
+                    <a:blip r:embed="rId13" cstate="print">
                       <a:extLst>
                         <a:ext uri="{28A0092B-C50C-407E-A947-70E740481C1C}">
                           <a14:useLocalDpi xmlns:a14="http://schemas.microsoft.com/office/drawing/2010/main" val="0"/>
@@ -3163,6 +4167,7 @@
       <w:r>
         <w:t>Veranstaltende Person (</w:t>
       </w:r>
+      <w:proofErr w:type="spellStart"/>
       <w:r>
         <w:rPr>
           <w:b/>
@@ -3170,6 +4175,7 @@
         </w:rPr>
         <w:t>staff</w:t>
       </w:r>
+      <w:proofErr w:type="spellEnd"/>
       <w:r>
         <w:t>)</w:t>
       </w:r>
@@ -3213,14 +4219,27 @@
       </w:r>
     </w:p>
     <w:p>
+      <w:r>
+        <w:rPr>
+          <w:b/>
+          <w:bCs/>
+        </w:rPr>
+        <w:t>Wichtig:</w:t>
+      </w:r>
+      <w:r>
+        <w:t xml:space="preserve"> Die Namen der Workshops müssen sich unterschieden. Es darf keinen Workshop mit demselben Namen geben.</w:t>
+      </w:r>
+    </w:p>
+    <w:p>
       <w:pPr>
         <w:pStyle w:val="Heading1"/>
       </w:pPr>
-      <w:bookmarkStart w:id="2" w:name="_Toc209964201"/>
+      <w:bookmarkStart w:id="2" w:name="_Toc210980690"/>
       <w:r>
         <w:rPr>
           <w:noProof/>
         </w:rPr>
+        <w:lastRenderedPageBreak/>
         <w:drawing>
           <wp:anchor distT="0" distB="0" distL="114300" distR="114300" simplePos="0" relativeHeight="251665408" behindDoc="0" locked="0" layoutInCell="1" allowOverlap="1" wp14:anchorId="63CF21DC" wp14:editId="1C5DCF5E">
             <wp:simplePos x="0" y="0"/>
@@ -3247,7 +4266,7 @@
                     </pic:cNvPicPr>
                   </pic:nvPicPr>
                   <pic:blipFill>
-                    <a:blip r:embed="rId13">
+                    <a:blip r:embed="rId14">
                       <a:extLst>
                         <a:ext uri="{28A0092B-C50C-407E-A947-70E740481C1C}">
                           <a14:useLocalDpi xmlns:a14="http://schemas.microsoft.com/office/drawing/2010/main" val="0"/>
@@ -3316,78 +4335,83 @@
           <w:b/>
           <w:bCs/>
         </w:rPr>
-        <w:t>HTML</w:t>
+        <w:t xml:space="preserve">HTML: </w:t>
+      </w:r>
+      <w:r>
+        <w:t xml:space="preserve">Erstellt eine </w:t>
       </w:r>
       <w:r>
         <w:rPr>
           <w:b/>
           <w:bCs/>
         </w:rPr>
-        <w:t xml:space="preserve">: </w:t>
-      </w:r>
-      <w:r>
-        <w:t xml:space="preserve">Erstellt eine </w:t>
-      </w:r>
+        <w:t>Zuteilung</w:t>
+      </w:r>
+      <w:r>
+        <w:t xml:space="preserve"> als HTML-Datei.</w:t>
+      </w:r>
+    </w:p>
+    <w:p>
       <w:r>
         <w:rPr>
           <w:b/>
           <w:bCs/>
         </w:rPr>
-        <w:t>Zuteilung</w:t>
-      </w:r>
-      <w:r>
-        <w:t xml:space="preserve"> als HTML-Datei.</w:t>
-      </w:r>
-    </w:p>
-    <w:p>
+        <w:t>CSV</w:t>
+      </w:r>
+      <w:r>
+        <w:t xml:space="preserve">: Erstellt eine </w:t>
+      </w:r>
       <w:r>
         <w:rPr>
           <w:b/>
           <w:bCs/>
         </w:rPr>
-        <w:t>CSV</w:t>
-      </w:r>
-      <w:r>
-        <w:t xml:space="preserve">: Erstellt eine </w:t>
-      </w:r>
+        <w:t>Zuteilung</w:t>
+      </w:r>
+      <w:r>
+        <w:t xml:space="preserve"> als CSV-Datei.</w:t>
+      </w:r>
+    </w:p>
+    <w:p>
       <w:r>
         <w:rPr>
           <w:b/>
           <w:bCs/>
         </w:rPr>
-        <w:t>Zuteilung</w:t>
-      </w:r>
-      <w:r>
-        <w:t xml:space="preserve"> als CSV-Datei.</w:t>
-      </w:r>
-    </w:p>
-    <w:p>
+        <w:t>DOCX</w:t>
+      </w:r>
+      <w:r>
+        <w:t xml:space="preserve">: Erstellt eine </w:t>
+      </w:r>
       <w:r>
         <w:rPr>
           <w:b/>
           <w:bCs/>
         </w:rPr>
-        <w:t>DOCX</w:t>
-      </w:r>
-      <w:r>
-        <w:t xml:space="preserve">: Erstellt eine </w:t>
-      </w:r>
+        <w:t>Zuteilung</w:t>
+      </w:r>
+      <w:r>
+        <w:t xml:space="preserve"> als bearbeitbares Word-Dokument.</w:t>
+      </w:r>
+    </w:p>
+    <w:p>
       <w:r>
         <w:rPr>
           <w:b/>
           <w:bCs/>
         </w:rPr>
-        <w:t>Zuteilung</w:t>
-      </w:r>
-      <w:r>
-        <w:t xml:space="preserve"> als bearbeitbares Word-Dokument.</w:t>
+        <w:t>Wichtig</w:t>
+      </w:r>
+      <w:r>
+        <w:t>: Die Zuteilung basiert auf dem Namen, es könnten Fehler auftreten, wenn Personen den gleichen Vor- und Nachnamen haben.</w:t>
       </w:r>
     </w:p>
     <w:p>
       <w:pPr>
         <w:pStyle w:val="Heading1"/>
       </w:pPr>
-      <w:bookmarkStart w:id="3" w:name="_Toc209964202"/>
+      <w:bookmarkStart w:id="3" w:name="_Toc210980691"/>
       <w:r>
         <w:rPr>
           <w:noProof/>
@@ -3418,7 +4442,7 @@
                     </pic:cNvPicPr>
                   </pic:nvPicPr>
                   <pic:blipFill>
-                    <a:blip r:embed="rId14">
+                    <a:blip r:embed="rId15">
                       <a:extLst>
                         <a:ext uri="{28A0092B-C50C-407E-A947-70E740481C1C}">
                           <a14:useLocalDpi xmlns:a14="http://schemas.microsoft.com/office/drawing/2010/main" val="0"/>
@@ -3496,7 +4520,11 @@
         <w:t>JSON-Format:</w:t>
       </w:r>
       <w:r>
-        <w:t xml:space="preserve"> Array von Objekten mit </w:t>
+        <w:t xml:space="preserve"> Array von Objekten </w:t>
+      </w:r>
+      <w:proofErr w:type="gramStart"/>
+      <w:r>
+        <w:t xml:space="preserve">mit </w:t>
       </w:r>
       <w:r>
         <w:rPr>
@@ -3504,6 +4532,7 @@
         </w:rPr>
         <w:t>Vorname</w:t>
       </w:r>
+      <w:proofErr w:type="gramEnd"/>
       <w:r>
         <w:t xml:space="preserve">, </w:t>
       </w:r>
@@ -3547,7 +4576,92 @@
         <w:t>Nachname, Vorname</w:t>
       </w:r>
       <w:r>
-        <w:t xml:space="preserve"> (ohne Überschrift).</w:t>
+        <w:t xml:space="preserve">. Als Trennzeichen kann </w:t>
+      </w:r>
+      <w:proofErr w:type="gramStart"/>
+      <w:r>
+        <w:t xml:space="preserve">entweder </w:t>
+      </w:r>
+      <w:r>
+        <w:rPr>
+          <w:rFonts w:ascii="Cascadia Mono" w:hAnsi="Cascadia Mono" w:cs="Cascadia Mono"/>
+          <w:b/>
+          <w:bCs/>
+        </w:rPr>
+        <w:t>,</w:t>
+      </w:r>
+      <w:proofErr w:type="gramEnd"/>
+      <w:r>
+        <w:t xml:space="preserve"> </w:t>
+      </w:r>
+      <w:proofErr w:type="gramStart"/>
+      <w:r>
+        <w:t xml:space="preserve">oder </w:t>
+      </w:r>
+      <w:r>
+        <w:rPr>
+          <w:rFonts w:ascii="Cascadia Mono" w:hAnsi="Cascadia Mono" w:cs="Cascadia Mono"/>
+          <w:b/>
+          <w:bCs/>
+        </w:rPr>
+        <w:t>;</w:t>
+      </w:r>
+      <w:proofErr w:type="gramEnd"/>
+      <w:r>
+        <w:t xml:space="preserve"> verwendet werden. Wenn keine Überschrift angegeben ist, müssen die Spalten erst Nachname, dann Vorname sein. Gibt man Spaltenüberschriften an, so kann es auch Vorname dann Nachname sein. Unterstütze Überschriftpaare sind </w:t>
+      </w:r>
+    </w:p>
+    <w:p>
+      <w:pPr>
+        <w:pStyle w:val="ListParagraph"/>
+        <w:numPr>
+          <w:ilvl w:val="0"/>
+          <w:numId w:val="11"/>
+        </w:numPr>
+      </w:pPr>
+      <w:r>
+        <w:rPr>
+          <w:rFonts w:ascii="Cascadia Mono" w:hAnsi="Cascadia Mono" w:cs="Cascadia Mono"/>
+        </w:rPr>
+        <w:t>Nachname, Vorname</w:t>
+      </w:r>
+    </w:p>
+    <w:p>
+      <w:pPr>
+        <w:pStyle w:val="ListParagraph"/>
+        <w:numPr>
+          <w:ilvl w:val="0"/>
+          <w:numId w:val="11"/>
+        </w:numPr>
+      </w:pPr>
+      <w:proofErr w:type="spellStart"/>
+      <w:r>
+        <w:rPr>
+          <w:rFonts w:ascii="Cascadia Mono" w:hAnsi="Cascadia Mono" w:cs="Cascadia Mono"/>
+        </w:rPr>
+        <w:t>Lastname</w:t>
+      </w:r>
+      <w:proofErr w:type="spellEnd"/>
+      <w:r>
+        <w:rPr>
+          <w:rFonts w:ascii="Cascadia Mono" w:hAnsi="Cascadia Mono" w:cs="Cascadia Mono"/>
+        </w:rPr>
+        <w:t>, Firstname</w:t>
+      </w:r>
+    </w:p>
+    <w:p>
+      <w:pPr>
+        <w:pStyle w:val="ListParagraph"/>
+        <w:numPr>
+          <w:ilvl w:val="0"/>
+          <w:numId w:val="11"/>
+        </w:numPr>
+      </w:pPr>
+      <w:r>
+        <w:rPr>
+          <w:rFonts w:ascii="Cascadia Mono" w:hAnsi="Cascadia Mono" w:cs="Cascadia Mono"/>
+        </w:rPr>
+        <w:t>Name, Firstname.</w:t>
       </w:r>
     </w:p>
     <w:p>
@@ -3786,44 +4900,28 @@
           <w:b/>
           <w:bCs/>
         </w:rPr>
-        <w:t>📂</w:t>
-      </w:r>
-      <w:r>
-        <w:rPr>
-          <w:rFonts w:ascii="Segoe UI Emoji" w:hAnsi="Segoe UI Emoji" w:cs="Segoe UI Emoji"/>
+        <w:t xml:space="preserve">📂 </w:t>
+      </w:r>
+      <w:r>
+        <w:rPr>
           <w:b/>
           <w:bCs/>
         </w:rPr>
-        <w:t xml:space="preserve"> </w:t>
-      </w:r>
-      <w:r>
-        <w:rPr>
-          <w:b/>
-          <w:bCs/>
-        </w:rPr>
         <w:t>Beispiel-Datei</w:t>
       </w:r>
       <w:r>
         <w:t xml:space="preserve"> (</w:t>
       </w:r>
+      <w:proofErr w:type="spellStart"/>
+      <w:proofErr w:type="gramStart"/>
       <w:r>
         <w:rPr>
           <w:rFonts w:ascii="Cascadia Mono" w:hAnsi="Cascadia Mono"/>
         </w:rPr>
-        <w:t>p</w:t>
-      </w:r>
-      <w:r>
-        <w:rPr>
-          <w:rFonts w:ascii="Cascadia Mono" w:hAnsi="Cascadia Mono"/>
-        </w:rPr>
-        <w:t>articipants</w:t>
-      </w:r>
-      <w:r>
-        <w:rPr>
-          <w:rFonts w:ascii="Cascadia Mono" w:hAnsi="Cascadia Mono"/>
-        </w:rPr>
-        <w:t>.json</w:t>
-      </w:r>
+        <w:t>participants.json</w:t>
+      </w:r>
+      <w:proofErr w:type="spellEnd"/>
+      <w:proofErr w:type="gramEnd"/>
       <w:r>
         <w:t xml:space="preserve">): </w:t>
       </w:r>
@@ -3834,133 +4932,6 @@
           <w:noProof/>
         </w:rPr>
       </w:pPr>
-      <w:r>
-        <w:rPr>
-          <w:rFonts w:ascii="Segoe UI Emoji" w:hAnsi="Segoe UI Emoji" w:cs="Segoe UI Emoji"/>
-          <w:b/>
-          <w:bCs/>
-        </w:rPr>
-        <w:lastRenderedPageBreak/>
-        <w:t>📂</w:t>
-      </w:r>
-      <w:r>
-        <w:rPr>
-          <w:rFonts w:ascii="Segoe UI Emoji" w:hAnsi="Segoe UI Emoji" w:cs="Segoe UI Emoji"/>
-          <w:b/>
-          <w:bCs/>
-        </w:rPr>
-        <w:t xml:space="preserve"> </w:t>
-      </w:r>
-      <w:r>
-        <w:rPr>
-          <w:b/>
-          <w:bCs/>
-        </w:rPr>
-        <w:t>Beispiel-Datei</w:t>
-      </w:r>
-      <w:r>
-        <w:t xml:space="preserve"> (</w:t>
-      </w:r>
-      <w:r>
-        <w:rPr>
-          <w:rFonts w:ascii="Cascadia Mono" w:hAnsi="Cascadia Mono"/>
-        </w:rPr>
-        <w:t>p</w:t>
-      </w:r>
-      <w:r>
-        <w:rPr>
-          <w:rFonts w:ascii="Cascadia Mono" w:hAnsi="Cascadia Mono"/>
-        </w:rPr>
-        <w:t>articipants</w:t>
-      </w:r>
-      <w:r>
-        <w:rPr>
-          <w:rFonts w:ascii="Cascadia Mono" w:hAnsi="Cascadia Mono"/>
-        </w:rPr>
-        <w:t>.</w:t>
-      </w:r>
-      <w:r>
-        <w:rPr>
-          <w:rFonts w:ascii="Cascadia Mono" w:hAnsi="Cascadia Mono"/>
-        </w:rPr>
-        <w:t>csv</w:t>
-      </w:r>
-      <w:r>
-        <w:t xml:space="preserve">): </w:t>
-      </w:r>
-    </w:p>
-    <w:p>
-      <w:pPr>
-        <w:pStyle w:val="Heading1"/>
-      </w:pPr>
-      <w:bookmarkStart w:id="4" w:name="_Toc209964203"/>
-      <w:r>
-        <w:rPr>
-          <w:noProof/>
-        </w:rPr>
-        <w:drawing>
-          <wp:anchor distT="0" distB="0" distL="114300" distR="114300" simplePos="0" relativeHeight="251666432" behindDoc="0" locked="0" layoutInCell="1" allowOverlap="1" wp14:anchorId="37306403" wp14:editId="6C8C5CA7">
-            <wp:simplePos x="0" y="0"/>
-            <wp:positionH relativeFrom="margin">
-              <wp:align>right</wp:align>
-            </wp:positionH>
-            <wp:positionV relativeFrom="paragraph">
-              <wp:posOffset>599440</wp:posOffset>
-            </wp:positionV>
-            <wp:extent cx="2376805" cy="1304925"/>
-            <wp:effectExtent l="0" t="0" r="4445" b="9525"/>
-            <wp:wrapSquare wrapText="bothSides"/>
-            <wp:docPr id="120521825" name="Picture 7"/>
-            <wp:cNvGraphicFramePr>
-              <a:graphicFrameLocks xmlns:a="http://schemas.openxmlformats.org/drawingml/2006/main" noChangeAspect="1"/>
-            </wp:cNvGraphicFramePr>
-            <a:graphic xmlns:a="http://schemas.openxmlformats.org/drawingml/2006/main">
-              <a:graphicData uri="http://schemas.openxmlformats.org/drawingml/2006/picture">
-                <pic:pic xmlns:pic="http://schemas.openxmlformats.org/drawingml/2006/picture">
-                  <pic:nvPicPr>
-                    <pic:cNvPr id="0" name="Picture 7"/>
-                    <pic:cNvPicPr>
-                      <a:picLocks noChangeAspect="1" noChangeArrowheads="1"/>
-                    </pic:cNvPicPr>
-                  </pic:nvPicPr>
-                  <pic:blipFill>
-                    <a:blip r:embed="rId15">
-                      <a:extLst>
-                        <a:ext uri="{28A0092B-C50C-407E-A947-70E740481C1C}">
-                          <a14:useLocalDpi xmlns:a14="http://schemas.microsoft.com/office/drawing/2010/main" val="0"/>
-                        </a:ext>
-                      </a:extLst>
-                    </a:blip>
-                    <a:srcRect/>
-                    <a:stretch>
-                      <a:fillRect/>
-                    </a:stretch>
-                  </pic:blipFill>
-                  <pic:spPr bwMode="auto">
-                    <a:xfrm>
-                      <a:off x="0" y="0"/>
-                      <a:ext cx="2376805" cy="1304925"/>
-                    </a:xfrm>
-                    <a:prstGeom prst="rect">
-                      <a:avLst/>
-                    </a:prstGeom>
-                    <a:noFill/>
-                    <a:ln>
-                      <a:noFill/>
-                    </a:ln>
-                  </pic:spPr>
-                </pic:pic>
-              </a:graphicData>
-            </a:graphic>
-            <wp14:sizeRelH relativeFrom="margin">
-              <wp14:pctWidth>0</wp14:pctWidth>
-            </wp14:sizeRelH>
-            <wp14:sizeRelV relativeFrom="margin">
-              <wp14:pctHeight>0</wp14:pctHeight>
-            </wp14:sizeRelV>
-          </wp:anchor>
-        </w:drawing>
-      </w:r>
       <w:r>
         <w:rPr>
           <w:noProof/>
@@ -3968,16 +4939,16 @@
         <mc:AlternateContent>
           <mc:Choice Requires="wps">
             <w:drawing>
-              <wp:anchor distT="45720" distB="45720" distL="114300" distR="114300" simplePos="0" relativeHeight="251674624" behindDoc="0" locked="0" layoutInCell="1" allowOverlap="1" wp14:anchorId="2AF135B5" wp14:editId="2F7632AE">
+              <wp:anchor distT="45720" distB="45720" distL="114300" distR="114300" simplePos="0" relativeHeight="251674624" behindDoc="0" locked="0" layoutInCell="1" allowOverlap="1" wp14:anchorId="2AF135B5" wp14:editId="056B478C">
                 <wp:simplePos x="0" y="0"/>
                 <wp:positionH relativeFrom="margin">
                   <wp:align>left</wp:align>
                 </wp:positionH>
                 <wp:positionV relativeFrom="paragraph">
-                  <wp:posOffset>0</wp:posOffset>
+                  <wp:posOffset>958215</wp:posOffset>
                 </wp:positionV>
                 <wp:extent cx="1628775" cy="1404620"/>
-                <wp:effectExtent l="0" t="0" r="28575" b="23495"/>
+                <wp:effectExtent l="0" t="0" r="28575" b="28575"/>
                 <wp:wrapTopAndBottom/>
                 <wp:docPr id="1553784807" name="Text Box 2"/>
                 <wp:cNvGraphicFramePr>
@@ -4021,6 +4992,7 @@
                                 <w:lang w:val="en-US"/>
                               </w:rPr>
                             </w:pPr>
+                            <w:proofErr w:type="spellStart"/>
                             <w:r>
                               <w:rPr>
                                 <w:rFonts w:ascii="Cascadia Mono" w:hAnsi="Cascadia Mono"/>
@@ -4028,7 +5000,66 @@
                                 <w:szCs w:val="20"/>
                                 <w:lang w:val="en-US"/>
                               </w:rPr>
-                              <w:t>Mustermann, Max</w:t>
+                              <w:t>Nachname</w:t>
+                            </w:r>
+                            <w:proofErr w:type="spellEnd"/>
+                            <w:r>
+                              <w:rPr>
+                                <w:rFonts w:ascii="Cascadia Mono" w:hAnsi="Cascadia Mono"/>
+                                <w:sz w:val="20"/>
+                                <w:szCs w:val="20"/>
+                                <w:lang w:val="en-US"/>
+                              </w:rPr>
+                              <w:t xml:space="preserve">; </w:t>
+                            </w:r>
+                            <w:proofErr w:type="spellStart"/>
+                            <w:r>
+                              <w:rPr>
+                                <w:rFonts w:ascii="Cascadia Mono" w:hAnsi="Cascadia Mono"/>
+                                <w:sz w:val="20"/>
+                                <w:szCs w:val="20"/>
+                                <w:lang w:val="en-US"/>
+                              </w:rPr>
+                              <w:t>Vorname</w:t>
+                            </w:r>
+                            <w:proofErr w:type="spellEnd"/>
+                          </w:p>
+                          <w:p>
+                            <w:pPr>
+                              <w:pStyle w:val="NoSpacing"/>
+                              <w:rPr>
+                                <w:rFonts w:ascii="Cascadia Mono" w:hAnsi="Cascadia Mono"/>
+                                <w:sz w:val="20"/>
+                                <w:szCs w:val="20"/>
+                                <w:lang w:val="en-US"/>
+                              </w:rPr>
+                            </w:pPr>
+                            <w:r>
+                              <w:rPr>
+                                <w:rFonts w:ascii="Cascadia Mono" w:hAnsi="Cascadia Mono"/>
+                                <w:sz w:val="20"/>
+                                <w:szCs w:val="20"/>
+                                <w:lang w:val="en-US"/>
+                              </w:rPr>
+                              <w:t>Mustermann</w:t>
+                            </w:r>
+                            <w:r>
+                              <w:rPr>
+                                <w:rFonts w:ascii="Cascadia Mono" w:hAnsi="Cascadia Mono"/>
+                                <w:sz w:val="20"/>
+                                <w:szCs w:val="20"/>
+                                <w:lang w:val="en-US"/>
+                              </w:rPr>
+                              <w:t>;</w:t>
+                            </w:r>
+                            <w:r>
+                              <w:rPr>
+                                <w:rFonts w:ascii="Cascadia Mono" w:hAnsi="Cascadia Mono"/>
+                                <w:sz w:val="20"/>
+                                <w:szCs w:val="20"/>
+                                <w:lang w:val="en-US"/>
+                              </w:rPr>
+                              <w:t xml:space="preserve"> Max</w:t>
                             </w:r>
                           </w:p>
                           <w:p>
@@ -4041,6 +5072,7 @@
                                 <w:lang w:val="en-US"/>
                               </w:rPr>
                             </w:pPr>
+                            <w:proofErr w:type="spellStart"/>
                             <w:r>
                               <w:rPr>
                                 <w:rFonts w:ascii="Cascadia Mono" w:hAnsi="Cascadia Mono"/>
@@ -4048,7 +5080,26 @@
                                 <w:szCs w:val="20"/>
                                 <w:lang w:val="en-US"/>
                               </w:rPr>
-                              <w:t>Musterfrau, Erika</w:t>
+                              <w:t>Musterfrau</w:t>
+                            </w:r>
+                            <w:proofErr w:type="spellEnd"/>
+                            <w:r>
+                              <w:rPr>
+                                <w:rFonts w:ascii="Cascadia Mono" w:hAnsi="Cascadia Mono"/>
+                                <w:sz w:val="20"/>
+                                <w:szCs w:val="20"/>
+                                <w:lang w:val="en-US"/>
+                              </w:rPr>
+                              <w:t>;</w:t>
+                            </w:r>
+                            <w:r>
+                              <w:rPr>
+                                <w:rFonts w:ascii="Cascadia Mono" w:hAnsi="Cascadia Mono"/>
+                                <w:sz w:val="20"/>
+                                <w:szCs w:val="20"/>
+                                <w:lang w:val="en-US"/>
+                              </w:rPr>
+                              <w:t xml:space="preserve"> Erika</w:t>
                             </w:r>
                           </w:p>
                         </w:txbxContent>
@@ -4070,7 +5121,7 @@
           </mc:Choice>
           <mc:Fallback>
             <w:pict>
-              <v:shape w14:anchorId="2AF135B5" id="_x0000_s1029" type="#_x0000_t202" style="position:absolute;margin-left:0;margin-top:0;width:128.25pt;height:110.6pt;z-index:251674624;visibility:visible;mso-wrap-style:square;mso-width-percent:0;mso-height-percent:200;mso-wrap-distance-left:9pt;mso-wrap-distance-top:3.6pt;mso-wrap-distance-right:9pt;mso-wrap-distance-bottom:3.6pt;mso-position-horizontal:left;mso-position-horizontal-relative:margin;mso-position-vertical:absolute;mso-position-vertical-relative:text;mso-width-percent:0;mso-height-percent:200;mso-width-relative:margin;mso-height-relative:margin;v-text-anchor:top" o:gfxdata="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">
+              <v:shape w14:anchorId="2AF135B5" id="_x0000_s1029" type="#_x0000_t202" style="position:absolute;margin-left:0;margin-top:75.45pt;width:128.25pt;height:110.6pt;z-index:251674624;visibility:visible;mso-wrap-style:square;mso-width-percent:0;mso-height-percent:200;mso-wrap-distance-left:9pt;mso-wrap-distance-top:3.6pt;mso-wrap-distance-right:9pt;mso-wrap-distance-bottom:3.6pt;mso-position-horizontal:left;mso-position-horizontal-relative:margin;mso-position-vertical:absolute;mso-position-vertical-relative:text;mso-width-percent:0;mso-height-percent:200;mso-width-relative:margin;mso-height-relative:margin;v-text-anchor:top" o:gfxdata="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">
                 <v:textbox style="mso-fit-shape-to-text:t">
                   <w:txbxContent>
                     <w:p>
@@ -4083,6 +5134,7 @@
                           <w:lang w:val="en-US"/>
                         </w:rPr>
                       </w:pPr>
+                      <w:proofErr w:type="spellStart"/>
                       <w:r>
                         <w:rPr>
                           <w:rFonts w:ascii="Cascadia Mono" w:hAnsi="Cascadia Mono"/>
@@ -4090,7 +5142,66 @@
                           <w:szCs w:val="20"/>
                           <w:lang w:val="en-US"/>
                         </w:rPr>
-                        <w:t>Mustermann, Max</w:t>
+                        <w:t>Nachname</w:t>
+                      </w:r>
+                      <w:proofErr w:type="spellEnd"/>
+                      <w:r>
+                        <w:rPr>
+                          <w:rFonts w:ascii="Cascadia Mono" w:hAnsi="Cascadia Mono"/>
+                          <w:sz w:val="20"/>
+                          <w:szCs w:val="20"/>
+                          <w:lang w:val="en-US"/>
+                        </w:rPr>
+                        <w:t xml:space="preserve">; </w:t>
+                      </w:r>
+                      <w:proofErr w:type="spellStart"/>
+                      <w:r>
+                        <w:rPr>
+                          <w:rFonts w:ascii="Cascadia Mono" w:hAnsi="Cascadia Mono"/>
+                          <w:sz w:val="20"/>
+                          <w:szCs w:val="20"/>
+                          <w:lang w:val="en-US"/>
+                        </w:rPr>
+                        <w:t>Vorname</w:t>
+                      </w:r>
+                      <w:proofErr w:type="spellEnd"/>
+                    </w:p>
+                    <w:p>
+                      <w:pPr>
+                        <w:pStyle w:val="NoSpacing"/>
+                        <w:rPr>
+                          <w:rFonts w:ascii="Cascadia Mono" w:hAnsi="Cascadia Mono"/>
+                          <w:sz w:val="20"/>
+                          <w:szCs w:val="20"/>
+                          <w:lang w:val="en-US"/>
+                        </w:rPr>
+                      </w:pPr>
+                      <w:r>
+                        <w:rPr>
+                          <w:rFonts w:ascii="Cascadia Mono" w:hAnsi="Cascadia Mono"/>
+                          <w:sz w:val="20"/>
+                          <w:szCs w:val="20"/>
+                          <w:lang w:val="en-US"/>
+                        </w:rPr>
+                        <w:t>Mustermann</w:t>
+                      </w:r>
+                      <w:r>
+                        <w:rPr>
+                          <w:rFonts w:ascii="Cascadia Mono" w:hAnsi="Cascadia Mono"/>
+                          <w:sz w:val="20"/>
+                          <w:szCs w:val="20"/>
+                          <w:lang w:val="en-US"/>
+                        </w:rPr>
+                        <w:t>;</w:t>
+                      </w:r>
+                      <w:r>
+                        <w:rPr>
+                          <w:rFonts w:ascii="Cascadia Mono" w:hAnsi="Cascadia Mono"/>
+                          <w:sz w:val="20"/>
+                          <w:szCs w:val="20"/>
+                          <w:lang w:val="en-US"/>
+                        </w:rPr>
+                        <w:t xml:space="preserve"> Max</w:t>
                       </w:r>
                     </w:p>
                     <w:p>
@@ -4103,6 +5214,7 @@
                           <w:lang w:val="en-US"/>
                         </w:rPr>
                       </w:pPr>
+                      <w:proofErr w:type="spellStart"/>
                       <w:r>
                         <w:rPr>
                           <w:rFonts w:ascii="Cascadia Mono" w:hAnsi="Cascadia Mono"/>
@@ -4110,7 +5222,26 @@
                           <w:szCs w:val="20"/>
                           <w:lang w:val="en-US"/>
                         </w:rPr>
-                        <w:t>Musterfrau, Erika</w:t>
+                        <w:t>Musterfrau</w:t>
+                      </w:r>
+                      <w:proofErr w:type="spellEnd"/>
+                      <w:r>
+                        <w:rPr>
+                          <w:rFonts w:ascii="Cascadia Mono" w:hAnsi="Cascadia Mono"/>
+                          <w:sz w:val="20"/>
+                          <w:szCs w:val="20"/>
+                          <w:lang w:val="en-US"/>
+                        </w:rPr>
+                        <w:t>;</w:t>
+                      </w:r>
+                      <w:r>
+                        <w:rPr>
+                          <w:rFonts w:ascii="Cascadia Mono" w:hAnsi="Cascadia Mono"/>
+                          <w:sz w:val="20"/>
+                          <w:szCs w:val="20"/>
+                          <w:lang w:val="en-US"/>
+                        </w:rPr>
+                        <w:t xml:space="preserve"> Erika</w:t>
                       </w:r>
                     </w:p>
                   </w:txbxContent>
@@ -4122,57 +5253,56 @@
         </mc:AlternateContent>
       </w:r>
       <w:r>
-        <w:t>Ansicht</w:t>
-      </w:r>
-      <w:bookmarkEnd w:id="4"/>
-    </w:p>
-    <w:p>
-      <w:r>
-        <w:rPr>
+        <w:rPr>
+          <w:rFonts w:ascii="Segoe UI Emoji" w:hAnsi="Segoe UI Emoji" w:cs="Segoe UI Emoji"/>
           <w:b/>
           <w:bCs/>
         </w:rPr>
-        <w:t>Ansicht aktualisieren:</w:t>
-      </w:r>
-      <w:r>
-        <w:t xml:space="preserve"> Aktualisiert die Ansicht.</w:t>
-      </w:r>
-    </w:p>
-    <w:p>
+        <w:t xml:space="preserve">📂 </w:t>
+      </w:r>
       <w:r>
         <w:rPr>
           <w:b/>
           <w:bCs/>
         </w:rPr>
-        <w:t>Abgabe-Formular öffnen:</w:t>
-      </w:r>
-      <w:r>
-        <w:t xml:space="preserve"> Öffnet das Abgabe-Formular im Standard-Browser.</w:t>
-      </w:r>
-    </w:p>
-    <w:p>
-      <w:pPr>
+        <w:t>Beispiel-Datei</w:t>
+      </w:r>
+      <w:r>
+        <w:t xml:space="preserve"> (</w:t>
+      </w:r>
+      <w:r>
+        <w:rPr>
+          <w:rFonts w:ascii="Cascadia Mono" w:hAnsi="Cascadia Mono"/>
+        </w:rPr>
+        <w:t>participants.csv</w:t>
+      </w:r>
+      <w:r>
+        <w:t xml:space="preserve">): </w:t>
+      </w:r>
+    </w:p>
+    <w:p>
+      <w:pPr>
+        <w:pStyle w:val="Heading1"/>
+      </w:pPr>
+      <w:bookmarkStart w:id="4" w:name="_Toc210980692"/>
+      <w:r>
         <w:rPr>
           <w:noProof/>
         </w:rPr>
-      </w:pPr>
-      <w:r>
-        <w:rPr>
-          <w:noProof/>
-        </w:rPr>
+        <w:lastRenderedPageBreak/>
         <w:drawing>
-          <wp:anchor distT="0" distB="0" distL="114300" distR="114300" simplePos="0" relativeHeight="251668480" behindDoc="0" locked="0" layoutInCell="1" allowOverlap="1" wp14:anchorId="41EDF20A" wp14:editId="6E933F50">
+          <wp:anchor distT="0" distB="0" distL="114300" distR="114300" simplePos="0" relativeHeight="251666432" behindDoc="0" locked="0" layoutInCell="1" allowOverlap="1" wp14:anchorId="37306403" wp14:editId="339EEE27">
             <wp:simplePos x="0" y="0"/>
             <wp:positionH relativeFrom="margin">
-              <wp:posOffset>1102995</wp:posOffset>
+              <wp:align>right</wp:align>
             </wp:positionH>
             <wp:positionV relativeFrom="paragraph">
-              <wp:posOffset>433705</wp:posOffset>
+              <wp:posOffset>599440</wp:posOffset>
             </wp:positionV>
-            <wp:extent cx="2952750" cy="1174115"/>
-            <wp:effectExtent l="0" t="0" r="0" b="6985"/>
-            <wp:wrapTopAndBottom/>
-            <wp:docPr id="1755392861" name="Picture 9" descr="A close-up of a person's face&#10;&#10;AI-generated content may be incorrect."/>
+            <wp:extent cx="2376805" cy="1304925"/>
+            <wp:effectExtent l="0" t="0" r="4445" b="9525"/>
+            <wp:wrapSquare wrapText="bothSides"/>
+            <wp:docPr id="120521825" name="Picture 7"/>
             <wp:cNvGraphicFramePr>
               <a:graphicFrameLocks xmlns:a="http://schemas.openxmlformats.org/drawingml/2006/main" noChangeAspect="1"/>
             </wp:cNvGraphicFramePr>
@@ -4180,7 +5310,7 @@
               <a:graphicData uri="http://schemas.openxmlformats.org/drawingml/2006/picture">
                 <pic:pic xmlns:pic="http://schemas.openxmlformats.org/drawingml/2006/picture">
                   <pic:nvPicPr>
-                    <pic:cNvPr id="1755392861" name="Picture 9" descr="A close-up of a person's face&#10;&#10;AI-generated content may be incorrect."/>
+                    <pic:cNvPr id="0" name="Picture 7"/>
                     <pic:cNvPicPr>
                       <a:picLocks noChangeAspect="1" noChangeArrowheads="1"/>
                     </pic:cNvPicPr>
@@ -4201,7 +5331,7 @@
                   <pic:spPr bwMode="auto">
                     <a:xfrm>
                       <a:off x="0" y="0"/>
-                      <a:ext cx="2952750" cy="1174115"/>
+                      <a:ext cx="2376805" cy="1304925"/>
                     </a:xfrm>
                     <a:prstGeom prst="rect">
                       <a:avLst/>
@@ -4214,44 +5344,62 @@
                 </pic:pic>
               </a:graphicData>
             </a:graphic>
+            <wp14:sizeRelH relativeFrom="margin">
+              <wp14:pctWidth>0</wp14:pctWidth>
+            </wp14:sizeRelH>
+            <wp14:sizeRelV relativeFrom="margin">
+              <wp14:pctHeight>0</wp14:pctHeight>
+            </wp14:sizeRelV>
           </wp:anchor>
         </w:drawing>
       </w:r>
       <w:r>
+        <w:t>Ansicht</w:t>
+      </w:r>
+      <w:bookmarkEnd w:id="4"/>
+    </w:p>
+    <w:p>
+      <w:r>
         <w:rPr>
           <w:b/>
           <w:bCs/>
         </w:rPr>
-        <w:t>Fehlende Teilnehmer:</w:t>
-      </w:r>
-      <w:r>
-        <w:t xml:space="preserve"> Zeigt eine Liste der Personen ohne Präferenzen.</w:t>
-      </w:r>
-      <w:r>
+        <w:t>Ansicht aktualisieren:</w:t>
+      </w:r>
+      <w:r>
+        <w:t xml:space="preserve"> Aktualisiert die Ansicht.</w:t>
+      </w:r>
+    </w:p>
+    <w:p>
+      <w:r>
+        <w:rPr>
+          <w:b/>
+          <w:bCs/>
+        </w:rPr>
+        <w:t>Abgabe-Formular öffnen:</w:t>
+      </w:r>
+      <w:r>
+        <w:t xml:space="preserve"> Öffnet das Abgabe-Formular im Standard-Browser.</w:t>
+      </w:r>
+    </w:p>
+    <w:p>
+      <w:pPr>
         <w:rPr>
           <w:noProof/>
         </w:rPr>
-        <w:t xml:space="preserve"> </w:t>
-      </w:r>
-    </w:p>
-    <w:p>
-      <w:pPr>
+      </w:pPr>
+      <w:r>
         <w:rPr>
           <w:noProof/>
         </w:rPr>
-      </w:pPr>
-      <w:r>
-        <w:rPr>
-          <w:noProof/>
-        </w:rPr>
         <w:drawing>
-          <wp:anchor distT="0" distB="0" distL="114300" distR="114300" simplePos="0" relativeHeight="251667456" behindDoc="0" locked="0" layoutInCell="1" allowOverlap="1" wp14:anchorId="0FE00164" wp14:editId="7D036D42">
+          <wp:anchor distT="0" distB="0" distL="114300" distR="114300" simplePos="0" relativeHeight="251667456" behindDoc="0" locked="0" layoutInCell="1" allowOverlap="1" wp14:anchorId="0FE00164" wp14:editId="766F0270">
             <wp:simplePos x="0" y="0"/>
             <wp:positionH relativeFrom="margin">
               <wp:posOffset>728980</wp:posOffset>
             </wp:positionH>
             <wp:positionV relativeFrom="paragraph">
-              <wp:posOffset>1446530</wp:posOffset>
+              <wp:posOffset>1789430</wp:posOffset>
             </wp:positionV>
             <wp:extent cx="3810000" cy="1960880"/>
             <wp:effectExtent l="0" t="0" r="0" b="1270"/>
@@ -4309,10 +5457,103 @@
       </w:r>
       <w:r>
         <w:rPr>
+          <w:noProof/>
+        </w:rPr>
+        <w:drawing>
+          <wp:anchor distT="0" distB="0" distL="114300" distR="114300" simplePos="0" relativeHeight="251668480" behindDoc="0" locked="0" layoutInCell="1" allowOverlap="1" wp14:anchorId="41EDF20A" wp14:editId="6E933F50">
+            <wp:simplePos x="0" y="0"/>
+            <wp:positionH relativeFrom="margin">
+              <wp:posOffset>1102995</wp:posOffset>
+            </wp:positionH>
+            <wp:positionV relativeFrom="paragraph">
+              <wp:posOffset>433705</wp:posOffset>
+            </wp:positionV>
+            <wp:extent cx="2952750" cy="1174115"/>
+            <wp:effectExtent l="0" t="0" r="0" b="6985"/>
+            <wp:wrapTopAndBottom/>
+            <wp:docPr id="1755392861" name="Picture 9" descr="A close-up of a person's face&#10;&#10;AI-generated content may be incorrect."/>
+            <wp:cNvGraphicFramePr>
+              <a:graphicFrameLocks xmlns:a="http://schemas.openxmlformats.org/drawingml/2006/main" noChangeAspect="1"/>
+            </wp:cNvGraphicFramePr>
+            <a:graphic xmlns:a="http://schemas.openxmlformats.org/drawingml/2006/main">
+              <a:graphicData uri="http://schemas.openxmlformats.org/drawingml/2006/picture">
+                <pic:pic xmlns:pic="http://schemas.openxmlformats.org/drawingml/2006/picture">
+                  <pic:nvPicPr>
+                    <pic:cNvPr id="1755392861" name="Picture 9" descr="A close-up of a person's face&#10;&#10;AI-generated content may be incorrect."/>
+                    <pic:cNvPicPr>
+                      <a:picLocks noChangeAspect="1" noChangeArrowheads="1"/>
+                    </pic:cNvPicPr>
+                  </pic:nvPicPr>
+                  <pic:blipFill>
+                    <a:blip r:embed="rId18">
+                      <a:extLst>
+                        <a:ext uri="{28A0092B-C50C-407E-A947-70E740481C1C}">
+                          <a14:useLocalDpi xmlns:a14="http://schemas.microsoft.com/office/drawing/2010/main" val="0"/>
+                        </a:ext>
+                      </a:extLst>
+                    </a:blip>
+                    <a:srcRect/>
+                    <a:stretch>
+                      <a:fillRect/>
+                    </a:stretch>
+                  </pic:blipFill>
+                  <pic:spPr bwMode="auto">
+                    <a:xfrm>
+                      <a:off x="0" y="0"/>
+                      <a:ext cx="2952750" cy="1174115"/>
+                    </a:xfrm>
+                    <a:prstGeom prst="rect">
+                      <a:avLst/>
+                    </a:prstGeom>
+                    <a:noFill/>
+                    <a:ln>
+                      <a:noFill/>
+                    </a:ln>
+                  </pic:spPr>
+                </pic:pic>
+              </a:graphicData>
+            </a:graphic>
+          </wp:anchor>
+        </w:drawing>
+      </w:r>
+      <w:r>
+        <w:rPr>
           <w:b/>
           <w:bCs/>
         </w:rPr>
-        <w:t>QR Code:</w:t>
+        <w:t>Fehlende Teilnehmer:</w:t>
+      </w:r>
+      <w:r>
+        <w:t xml:space="preserve"> Zeigt eine Liste der Personen ohne Präferenzen.</w:t>
+      </w:r>
+      <w:r>
+        <w:rPr>
+          <w:noProof/>
+        </w:rPr>
+        <w:t xml:space="preserve"> </w:t>
+      </w:r>
+    </w:p>
+    <w:p>
+      <w:pPr>
+        <w:rPr>
+          <w:noProof/>
+        </w:rPr>
+      </w:pPr>
+      <w:proofErr w:type="gramStart"/>
+      <w:r>
+        <w:rPr>
+          <w:b/>
+          <w:bCs/>
+        </w:rPr>
+        <w:t>QR Code</w:t>
+      </w:r>
+      <w:proofErr w:type="gramEnd"/>
+      <w:r>
+        <w:rPr>
+          <w:b/>
+          <w:bCs/>
+        </w:rPr>
+        <w:t>:</w:t>
       </w:r>
       <w:r>
         <w:t xml:space="preserve"> Öffnet einen Dialog mit einem QR-Code zum einfachen Zugriff.</w:t>
@@ -4326,9 +5567,22 @@
     </w:p>
     <w:p>
       <w:pPr>
+        <w:rPr>
+          <w:noProof/>
+        </w:rPr>
+      </w:pPr>
+      <w:r>
+        <w:rPr>
+          <w:noProof/>
+        </w:rPr>
+        <w:t>Falls hierbei ein Fehler auftritt, sollte dieser Angezeigt werden. ACHTUNG: Trennt man die Verbindung des Computers zum Netzwerk, kann sich die IP-Adresse des Computers ändern, das bedeutet, dass ein älterer QR-Code für „Android/ Andere“ nicht mehr funktioniert.</w:t>
+      </w:r>
+    </w:p>
+    <w:p>
+      <w:pPr>
         <w:pStyle w:val="Heading1"/>
       </w:pPr>
-      <w:bookmarkStart w:id="5" w:name="_Toc209964204"/>
+      <w:bookmarkStart w:id="5" w:name="_Toc210980693"/>
       <w:r>
         <w:rPr>
           <w:noProof/>
@@ -4359,7 +5613,7 @@
                     </pic:cNvPicPr>
                   </pic:nvPicPr>
                   <pic:blipFill>
-                    <a:blip r:embed="rId18">
+                    <a:blip r:embed="rId19">
                       <a:extLst>
                         <a:ext uri="{28A0092B-C50C-407E-A947-70E740481C1C}">
                           <a14:useLocalDpi xmlns:a14="http://schemas.microsoft.com/office/drawing/2010/main" val="0"/>
@@ -4499,7 +5753,7 @@
                     </pic:cNvPicPr>
                   </pic:nvPicPr>
                   <pic:blipFill>
-                    <a:blip r:embed="rId19">
+                    <a:blip r:embed="rId20">
                       <a:extLst>
                         <a:ext uri="{28A0092B-C50C-407E-A947-70E740481C1C}">
                           <a14:useLocalDpi xmlns:a14="http://schemas.microsoft.com/office/drawing/2010/main" val="0"/>
@@ -4535,7 +5789,7 @@
       <w:pPr>
         <w:pStyle w:val="Heading1"/>
       </w:pPr>
-      <w:bookmarkStart w:id="6" w:name="_Toc209964205"/>
+      <w:bookmarkStart w:id="6" w:name="_Toc210980694"/>
       <w:r>
         <w:rPr>
           <w:noProof/>
@@ -4566,7 +5820,7 @@
                     </pic:cNvPicPr>
                   </pic:nvPicPr>
                   <pic:blipFill>
-                    <a:blip r:embed="rId20">
+                    <a:blip r:embed="rId21">
                       <a:extLst>
                         <a:ext uri="{28A0092B-C50C-407E-A947-70E740481C1C}">
                           <a14:useLocalDpi xmlns:a14="http://schemas.microsoft.com/office/drawing/2010/main" val="0"/>
@@ -4620,25 +5874,18 @@
           <w:b/>
           <w:bCs/>
         </w:rPr>
-        <w:t>Handbuch</w:t>
-      </w:r>
+        <w:t xml:space="preserve">Handbuch: </w:t>
+      </w:r>
+      <w:r>
+        <w:t>Öffnet dieses Handbuch.</w:t>
+      </w:r>
+    </w:p>
+    <w:p>
       <w:r>
         <w:rPr>
           <w:b/>
           <w:bCs/>
         </w:rPr>
-        <w:t xml:space="preserve">: </w:t>
-      </w:r>
-      <w:r>
-        <w:t>Öffnet dieses Handbuch.</w:t>
-      </w:r>
-    </w:p>
-    <w:p>
-      <w:r>
-        <w:rPr>
-          <w:b/>
-          <w:bCs/>
-        </w:rPr>
         <w:t>Über:</w:t>
       </w:r>
       <w:r>
@@ -4655,7 +5902,7 @@
       <w:pPr>
         <w:pStyle w:val="Heading1"/>
       </w:pPr>
-      <w:bookmarkStart w:id="7" w:name="_Toc209964206"/>
+      <w:bookmarkStart w:id="7" w:name="_Toc210980695"/>
       <w:r>
         <w:t>Statusanzeige</w:t>
       </w:r>
@@ -4663,16 +5910,7 @@
     </w:p>
     <w:p>
       <w:r>
-        <w:t>Unten</w:t>
-      </w:r>
-      <w:r>
-        <w:t xml:space="preserve"> </w:t>
-      </w:r>
-      <w:r>
-        <w:t>links</w:t>
-      </w:r>
-      <w:r>
-        <w:t xml:space="preserve"> wird angezeigt, wie viele Personen bereits eine </w:t>
+        <w:t xml:space="preserve">Unten links wird angezeigt, wie viele Personen bereits eine </w:t>
       </w:r>
       <w:r>
         <w:rPr>
@@ -4712,7 +5950,7 @@
                     </pic:cNvPicPr>
                   </pic:nvPicPr>
                   <pic:blipFill>
-                    <a:blip r:embed="rId21">
+                    <a:blip r:embed="rId22">
                       <a:extLst>
                         <a:ext uri="{28A0092B-C50C-407E-A947-70E740481C1C}">
                           <a14:useLocalDpi xmlns:a14="http://schemas.microsoft.com/office/drawing/2010/main" val="0"/>
@@ -4748,7 +5986,7 @@
       <w:pPr>
         <w:pStyle w:val="Heading1"/>
       </w:pPr>
-      <w:bookmarkStart w:id="8" w:name="_Toc209964207"/>
+      <w:bookmarkStart w:id="8" w:name="_Toc210980696"/>
       <w:r>
         <w:rPr>
           <w:noProof/>
@@ -4779,7 +6017,7 @@
                     </pic:cNvPicPr>
                   </pic:nvPicPr>
                   <pic:blipFill>
-                    <a:blip r:embed="rId22">
+                    <a:blip r:embed="rId23">
                       <a:extLst>
                         <a:ext uri="{28A0092B-C50C-407E-A947-70E740481C1C}">
                           <a14:useLocalDpi xmlns:a14="http://schemas.microsoft.com/office/drawing/2010/main" val="0"/>
@@ -4880,7 +6118,7 @@
                     </pic:cNvPicPr>
                   </pic:nvPicPr>
                   <pic:blipFill>
-                    <a:blip r:embed="rId23">
+                    <a:blip r:embed="rId24">
                       <a:extLst>
                         <a:ext uri="{28A0092B-C50C-407E-A947-70E740481C1C}">
                           <a14:useLocalDpi xmlns:a14="http://schemas.microsoft.com/office/drawing/2010/main" val="0"/>
@@ -5025,7 +6263,7 @@
                     </pic:cNvPicPr>
                   </pic:nvPicPr>
                   <pic:blipFill>
-                    <a:blip r:embed="rId24">
+                    <a:blip r:embed="rId25">
                       <a:extLst>
                         <a:ext uri="{28A0092B-C50C-407E-A947-70E740481C1C}">
                           <a14:useLocalDpi xmlns:a14="http://schemas.microsoft.com/office/drawing/2010/main" val="0"/>
@@ -5061,7 +6299,7 @@
       <w:pPr>
         <w:pStyle w:val="Heading1"/>
       </w:pPr>
-      <w:bookmarkStart w:id="9" w:name="_Toc209964208"/>
+      <w:bookmarkStart w:id="9" w:name="_Toc210980697"/>
       <w:r>
         <w:lastRenderedPageBreak/>
         <w:t>Probleme und Lösungen</w:t>
@@ -5130,6 +6368,7 @@
       <w:pPr>
         <w:pStyle w:val="Heading1"/>
       </w:pPr>
+      <w:bookmarkStart w:id="10" w:name="_Toc210980698"/>
       <w:r>
         <w:rPr>
           <w:noProof/>
@@ -5160,7 +6399,7 @@
                     </pic:cNvPicPr>
                   </pic:nvPicPr>
                   <pic:blipFill>
-                    <a:blip r:embed="rId25">
+                    <a:blip r:embed="rId26">
                       <a:extLst>
                         <a:ext uri="{28A0092B-C50C-407E-A947-70E740481C1C}">
                           <a14:useLocalDpi xmlns:a14="http://schemas.microsoft.com/office/drawing/2010/main" val="0"/>
@@ -5194,6 +6433,7 @@
       <w:r>
         <w:t>Starten auf MacOS</w:t>
       </w:r>
+      <w:bookmarkEnd w:id="10"/>
     </w:p>
     <w:p>
       <w:pPr>
@@ -5202,7 +6442,15 @@
         </w:rPr>
       </w:pPr>
       <w:r>
-        <w:t>Herunterladen der App und entpacken (Doppelklick auf die .zip).</w:t>
+        <w:t>Herunterladen der App und entpacken (Doppelklick auf die .</w:t>
+      </w:r>
+      <w:proofErr w:type="spellStart"/>
+      <w:r>
+        <w:t>zip</w:t>
+      </w:r>
+      <w:proofErr w:type="spellEnd"/>
+      <w:r>
+        <w:t>).</w:t>
       </w:r>
       <w:r>
         <w:rPr>
@@ -5226,10 +6474,15 @@
     </w:p>
     <w:p>
       <w:r>
-        <w:t>Die .app auf den Desktop legen</w:t>
-      </w:r>
-      <w:r>
-        <w:t>.</w:t>
+        <w:t>Die .</w:t>
+      </w:r>
+      <w:proofErr w:type="spellStart"/>
+      <w:r>
+        <w:t>app</w:t>
+      </w:r>
+      <w:proofErr w:type="spellEnd"/>
+      <w:r>
+        <w:t xml:space="preserve"> auf den Desktop legen.</w:t>
       </w:r>
     </w:p>
     <w:p>
@@ -5263,7 +6516,7 @@
                     </pic:cNvPicPr>
                   </pic:nvPicPr>
                   <pic:blipFill>
-                    <a:blip r:embed="rId26">
+                    <a:blip r:embed="rId27">
                       <a:extLst>
                         <a:ext uri="{28A0092B-C50C-407E-A947-70E740481C1C}">
                           <a14:useLocalDpi xmlns:a14="http://schemas.microsoft.com/office/drawing/2010/main" val="0"/>
@@ -5292,7 +6545,15 @@
         </w:drawing>
       </w:r>
       <w:r>
-        <w:t>Öffnen Sie die Spotlight-Suche über die Tastenkombination [cmd] + [Leertaste] oder über die kleine Lupe oben rechts in der Menüleiste. Geben Sie anschließend "Terminal" in das Suchfeld ein und öffnen Sie das entsprechende Ergebnis mit einem Doppelklick.</w:t>
+        <w:t>Öffnen Sie die Spotlight-Suche über die Tastenkombination [</w:t>
+      </w:r>
+      <w:proofErr w:type="spellStart"/>
+      <w:r>
+        <w:t>cmd</w:t>
+      </w:r>
+      <w:proofErr w:type="spellEnd"/>
+      <w:r>
+        <w:t>] + [Leertaste] oder über die kleine Lupe oben rechts in der Menüleiste. Geben Sie anschließend "Terminal" in das Suchfeld ein und öffnen Sie das entsprechende Ergebnis mit einem Doppelklick.</w:t>
       </w:r>
     </w:p>
     <w:p>
@@ -5356,6 +6617,7 @@
                                 <w:lang w:val="en-US"/>
                               </w:rPr>
                             </w:pPr>
+                            <w:proofErr w:type="spellStart"/>
                             <w:r>
                               <w:rPr>
                                 <w:rFonts w:ascii="Cascadia Mono" w:hAnsi="Cascadia Mono"/>
@@ -5363,8 +6625,9 @@
                                 <w:szCs w:val="20"/>
                                 <w:lang w:val="en-US"/>
                               </w:rPr>
-                              <w:t>xattr -d com.apple.quarantine</w:t>
+                              <w:t>xattr</w:t>
                             </w:r>
+                            <w:proofErr w:type="spellEnd"/>
                             <w:r>
                               <w:rPr>
                                 <w:rFonts w:ascii="Cascadia Mono" w:hAnsi="Cascadia Mono"/>
@@ -5372,8 +6635,50 @@
                                 <w:szCs w:val="20"/>
                                 <w:lang w:val="en-US"/>
                               </w:rPr>
-                              <w:t xml:space="preserve"> Desktop\Semera\ Workshops.app</w:t>
+                              <w:t xml:space="preserve"> -d </w:t>
                             </w:r>
+                            <w:proofErr w:type="spellStart"/>
+                            <w:proofErr w:type="gramStart"/>
+                            <w:r>
+                              <w:rPr>
+                                <w:rFonts w:ascii="Cascadia Mono" w:hAnsi="Cascadia Mono"/>
+                                <w:sz w:val="20"/>
+                                <w:szCs w:val="20"/>
+                                <w:lang w:val="en-US"/>
+                              </w:rPr>
+                              <w:t>com.apple</w:t>
+                            </w:r>
+                            <w:proofErr w:type="gramEnd"/>
+                            <w:r>
+                              <w:rPr>
+                                <w:rFonts w:ascii="Cascadia Mono" w:hAnsi="Cascadia Mono"/>
+                                <w:sz w:val="20"/>
+                                <w:szCs w:val="20"/>
+                                <w:lang w:val="en-US"/>
+                              </w:rPr>
+                              <w:t>.quarantine</w:t>
+                            </w:r>
+                            <w:proofErr w:type="spellEnd"/>
+                            <w:r>
+                              <w:rPr>
+                                <w:rFonts w:ascii="Cascadia Mono" w:hAnsi="Cascadia Mono"/>
+                                <w:sz w:val="20"/>
+                                <w:szCs w:val="20"/>
+                                <w:lang w:val="en-US"/>
+                              </w:rPr>
+                              <w:t xml:space="preserve"> Desktop\Semera\ </w:t>
+                            </w:r>
+                            <w:proofErr w:type="spellStart"/>
+                            <w:r>
+                              <w:rPr>
+                                <w:rFonts w:ascii="Cascadia Mono" w:hAnsi="Cascadia Mono"/>
+                                <w:sz w:val="20"/>
+                                <w:szCs w:val="20"/>
+                                <w:lang w:val="en-US"/>
+                              </w:rPr>
+                              <w:t>Workshops.app</w:t>
+                            </w:r>
+                            <w:proofErr w:type="spellEnd"/>
                           </w:p>
                         </w:txbxContent>
                       </wps:txbx>
@@ -5407,6 +6712,7 @@
                           <w:lang w:val="en-US"/>
                         </w:rPr>
                       </w:pPr>
+                      <w:proofErr w:type="spellStart"/>
                       <w:r>
                         <w:rPr>
                           <w:rFonts w:ascii="Cascadia Mono" w:hAnsi="Cascadia Mono"/>
@@ -5414,8 +6720,9 @@
                           <w:szCs w:val="20"/>
                           <w:lang w:val="en-US"/>
                         </w:rPr>
-                        <w:t>xattr -d com.apple.quarantine</w:t>
+                        <w:t>xattr</w:t>
                       </w:r>
+                      <w:proofErr w:type="spellEnd"/>
                       <w:r>
                         <w:rPr>
                           <w:rFonts w:ascii="Cascadia Mono" w:hAnsi="Cascadia Mono"/>
@@ -5423,8 +6730,50 @@
                           <w:szCs w:val="20"/>
                           <w:lang w:val="en-US"/>
                         </w:rPr>
-                        <w:t xml:space="preserve"> Desktop\Semera\ Workshops.app</w:t>
+                        <w:t xml:space="preserve"> -d </w:t>
                       </w:r>
+                      <w:proofErr w:type="spellStart"/>
+                      <w:proofErr w:type="gramStart"/>
+                      <w:r>
+                        <w:rPr>
+                          <w:rFonts w:ascii="Cascadia Mono" w:hAnsi="Cascadia Mono"/>
+                          <w:sz w:val="20"/>
+                          <w:szCs w:val="20"/>
+                          <w:lang w:val="en-US"/>
+                        </w:rPr>
+                        <w:t>com.apple</w:t>
+                      </w:r>
+                      <w:proofErr w:type="gramEnd"/>
+                      <w:r>
+                        <w:rPr>
+                          <w:rFonts w:ascii="Cascadia Mono" w:hAnsi="Cascadia Mono"/>
+                          <w:sz w:val="20"/>
+                          <w:szCs w:val="20"/>
+                          <w:lang w:val="en-US"/>
+                        </w:rPr>
+                        <w:t>.quarantine</w:t>
+                      </w:r>
+                      <w:proofErr w:type="spellEnd"/>
+                      <w:r>
+                        <w:rPr>
+                          <w:rFonts w:ascii="Cascadia Mono" w:hAnsi="Cascadia Mono"/>
+                          <w:sz w:val="20"/>
+                          <w:szCs w:val="20"/>
+                          <w:lang w:val="en-US"/>
+                        </w:rPr>
+                        <w:t xml:space="preserve"> Desktop\Semera\ </w:t>
+                      </w:r>
+                      <w:proofErr w:type="spellStart"/>
+                      <w:r>
+                        <w:rPr>
+                          <w:rFonts w:ascii="Cascadia Mono" w:hAnsi="Cascadia Mono"/>
+                          <w:sz w:val="20"/>
+                          <w:szCs w:val="20"/>
+                          <w:lang w:val="en-US"/>
+                        </w:rPr>
+                        <w:t>Workshops.app</w:t>
+                      </w:r>
+                      <w:proofErr w:type="spellEnd"/>
                     </w:p>
                   </w:txbxContent>
                 </v:textbox>
@@ -5444,8 +6793,8 @@
       </w:r>
     </w:p>
     <w:sectPr>
-      <w:headerReference w:type="default" r:id="rId27"/>
-      <w:footerReference w:type="default" r:id="rId28"/>
+      <w:headerReference w:type="default" r:id="rId28"/>
+      <w:footerReference w:type="default" r:id="rId29"/>
       <w:pgSz w:w="11906" w:h="16838"/>
       <w:pgMar w:top="1417" w:right="1417" w:bottom="1134" w:left="1417" w:header="708" w:footer="708" w:gutter="0"/>
       <w:cols w:space="708"/>
@@ -5557,12 +6906,35 @@
         <w:lang w:val="en-US"/>
       </w:rPr>
     </w:pPr>
+    <w:proofErr w:type="spellStart"/>
     <w:r>
       <w:rPr>
         <w:u w:val="single"/>
         <w:lang w:val="en-US"/>
       </w:rPr>
-      <w:t>Handbuch Semera Workshops – V1.0.0</w:t>
+      <w:t>Handbuch</w:t>
+    </w:r>
+    <w:proofErr w:type="spellEnd"/>
+    <w:r>
+      <w:rPr>
+        <w:u w:val="single"/>
+        <w:lang w:val="en-US"/>
+      </w:rPr>
+      <w:t xml:space="preserve"> Semera Workshops – V1.</w:t>
+    </w:r>
+    <w:r>
+      <w:rPr>
+        <w:u w:val="single"/>
+        <w:lang w:val="en-US"/>
+      </w:rPr>
+      <w:t>1</w:t>
+    </w:r>
+    <w:r>
+      <w:rPr>
+        <w:u w:val="single"/>
+        <w:lang w:val="en-US"/>
+      </w:rPr>
+      <w:t>.0</w:t>
     </w:r>
     <w:r>
       <w:rPr>
@@ -5603,7 +6975,7 @@
         <w:noProof/>
         <w:u w:val="single"/>
       </w:rPr>
-      <w:t>05.10.2025</w:t>
+      <w:t>14.10.2025</w:t>
     </w:r>
     <w:r>
       <w:rPr>
@@ -6492,6 +7864,119 @@
     </w:lvl>
   </w:abstractNum>
   <w:abstractNum w:abstractNumId="8" w15:restartNumberingAfterBreak="0">
+    <w:nsid w:val="59F273DB"/>
+    <w:multiLevelType w:val="hybridMultilevel"/>
+    <w:tmpl w:val="BD18D8FA"/>
+    <w:lvl w:ilvl="0" w:tplc="04070001">
+      <w:start w:val="1"/>
+      <w:numFmt w:val="bullet"/>
+      <w:lvlText w:val=""/>
+      <w:lvlJc w:val="left"/>
+      <w:pPr>
+        <w:ind w:left="720" w:hanging="360"/>
+      </w:pPr>
+      <w:rPr>
+        <w:rFonts w:ascii="Symbol" w:hAnsi="Symbol" w:hint="default"/>
+      </w:rPr>
+    </w:lvl>
+    <w:lvl w:ilvl="1" w:tplc="04070003" w:tentative="1">
+      <w:start w:val="1"/>
+      <w:numFmt w:val="bullet"/>
+      <w:lvlText w:val="o"/>
+      <w:lvlJc w:val="left"/>
+      <w:pPr>
+        <w:ind w:left="1440" w:hanging="360"/>
+      </w:pPr>
+      <w:rPr>
+        <w:rFonts w:ascii="Courier New" w:hAnsi="Courier New" w:cs="Courier New" w:hint="default"/>
+      </w:rPr>
+    </w:lvl>
+    <w:lvl w:ilvl="2" w:tplc="04070005" w:tentative="1">
+      <w:start w:val="1"/>
+      <w:numFmt w:val="bullet"/>
+      <w:lvlText w:val=""/>
+      <w:lvlJc w:val="left"/>
+      <w:pPr>
+        <w:ind w:left="2160" w:hanging="360"/>
+      </w:pPr>
+      <w:rPr>
+        <w:rFonts w:ascii="Wingdings" w:hAnsi="Wingdings" w:hint="default"/>
+      </w:rPr>
+    </w:lvl>
+    <w:lvl w:ilvl="3" w:tplc="04070001" w:tentative="1">
+      <w:start w:val="1"/>
+      <w:numFmt w:val="bullet"/>
+      <w:lvlText w:val=""/>
+      <w:lvlJc w:val="left"/>
+      <w:pPr>
+        <w:ind w:left="2880" w:hanging="360"/>
+      </w:pPr>
+      <w:rPr>
+        <w:rFonts w:ascii="Symbol" w:hAnsi="Symbol" w:hint="default"/>
+      </w:rPr>
+    </w:lvl>
+    <w:lvl w:ilvl="4" w:tplc="04070003" w:tentative="1">
+      <w:start w:val="1"/>
+      <w:numFmt w:val="bullet"/>
+      <w:lvlText w:val="o"/>
+      <w:lvlJc w:val="left"/>
+      <w:pPr>
+        <w:ind w:left="3600" w:hanging="360"/>
+      </w:pPr>
+      <w:rPr>
+        <w:rFonts w:ascii="Courier New" w:hAnsi="Courier New" w:cs="Courier New" w:hint="default"/>
+      </w:rPr>
+    </w:lvl>
+    <w:lvl w:ilvl="5" w:tplc="04070005" w:tentative="1">
+      <w:start w:val="1"/>
+      <w:numFmt w:val="bullet"/>
+      <w:lvlText w:val=""/>
+      <w:lvlJc w:val="left"/>
+      <w:pPr>
+        <w:ind w:left="4320" w:hanging="360"/>
+      </w:pPr>
+      <w:rPr>
+        <w:rFonts w:ascii="Wingdings" w:hAnsi="Wingdings" w:hint="default"/>
+      </w:rPr>
+    </w:lvl>
+    <w:lvl w:ilvl="6" w:tplc="04070001" w:tentative="1">
+      <w:start w:val="1"/>
+      <w:numFmt w:val="bullet"/>
+      <w:lvlText w:val=""/>
+      <w:lvlJc w:val="left"/>
+      <w:pPr>
+        <w:ind w:left="5040" w:hanging="360"/>
+      </w:pPr>
+      <w:rPr>
+        <w:rFonts w:ascii="Symbol" w:hAnsi="Symbol" w:hint="default"/>
+      </w:rPr>
+    </w:lvl>
+    <w:lvl w:ilvl="7" w:tplc="04070003" w:tentative="1">
+      <w:start w:val="1"/>
+      <w:numFmt w:val="bullet"/>
+      <w:lvlText w:val="o"/>
+      <w:lvlJc w:val="left"/>
+      <w:pPr>
+        <w:ind w:left="5760" w:hanging="360"/>
+      </w:pPr>
+      <w:rPr>
+        <w:rFonts w:ascii="Courier New" w:hAnsi="Courier New" w:cs="Courier New" w:hint="default"/>
+      </w:rPr>
+    </w:lvl>
+    <w:lvl w:ilvl="8" w:tplc="04070005" w:tentative="1">
+      <w:start w:val="1"/>
+      <w:numFmt w:val="bullet"/>
+      <w:lvlText w:val=""/>
+      <w:lvlJc w:val="left"/>
+      <w:pPr>
+        <w:ind w:left="6480" w:hanging="360"/>
+      </w:pPr>
+      <w:rPr>
+        <w:rFonts w:ascii="Wingdings" w:hAnsi="Wingdings" w:hint="default"/>
+      </w:rPr>
+    </w:lvl>
+  </w:abstractNum>
+  <w:abstractNum w:abstractNumId="9" w15:restartNumberingAfterBreak="0">
     <w:nsid w:val="63934AC8"/>
     <w:multiLevelType w:val="hybridMultilevel"/>
     <w:tmpl w:val="229E80CA"/>
@@ -6604,7 +8089,7 @@
       </w:rPr>
     </w:lvl>
   </w:abstractNum>
-  <w:abstractNum w:abstractNumId="9" w15:restartNumberingAfterBreak="0">
+  <w:abstractNum w:abstractNumId="10" w15:restartNumberingAfterBreak="0">
     <w:nsid w:val="6B8512F6"/>
     <w:multiLevelType w:val="hybridMultilevel"/>
     <w:tmpl w:val="E968F934"/>
@@ -6720,10 +8205,10 @@
     <w:abstractNumId w:val="5"/>
   </w:num>
   <w:num w:numId="2" w16cid:durableId="2042313764">
-    <w:abstractNumId w:val="8"/>
+    <w:abstractNumId w:val="9"/>
   </w:num>
   <w:num w:numId="3" w16cid:durableId="849417499">
-    <w:abstractNumId w:val="9"/>
+    <w:abstractNumId w:val="10"/>
   </w:num>
   <w:num w:numId="4" w16cid:durableId="1639531528">
     <w:abstractNumId w:val="4"/>
@@ -6745,6 +8230,9 @@
   </w:num>
   <w:num w:numId="10" w16cid:durableId="1403480139">
     <w:abstractNumId w:val="7"/>
+  </w:num>
+  <w:num w:numId="11" w16cid:durableId="1651638737">
+    <w:abstractNumId w:val="8"/>
   </w:num>
 </w:numbering>
 </file>

</xml_diff>

<commit_message>
major refactoring of the app and upgrade to 2.0.0
</commit_message>
<xml_diff>
--- a/manual.docx
+++ b/manual.docx
@@ -1078,35 +1078,14 @@
         <w:t>Export</w:t>
       </w:r>
       <w:r>
-        <w:t xml:space="preserve"> → </w:t>
-      </w:r>
-      <w:proofErr w:type="gramStart"/>
-      <w:r>
-        <w:t>Exportiert</w:t>
-      </w:r>
-      <w:proofErr w:type="gramEnd"/>
-      <w:r>
-        <w:t xml:space="preserve"> alle Workshop-Wahlen </w:t>
-      </w:r>
-      <w:proofErr w:type="gramStart"/>
-      <w:r>
-        <w:t xml:space="preserve">im </w:t>
+        <w:t xml:space="preserve"> → Exportiert alle Workshop-Wahlen im </w:t>
       </w:r>
       <w:r>
         <w:rPr>
           <w:rFonts w:ascii="Cascadia Mono" w:hAnsi="Cascadia Mono"/>
         </w:rPr>
-        <w:t>.</w:t>
-      </w:r>
-      <w:proofErr w:type="spellStart"/>
-      <w:r>
-        <w:rPr>
-          <w:rFonts w:ascii="Cascadia Mono" w:hAnsi="Cascadia Mono"/>
-        </w:rPr>
-        <w:t>json</w:t>
-      </w:r>
-      <w:proofErr w:type="spellEnd"/>
-      <w:proofErr w:type="gramEnd"/>
+        <w:t>.json</w:t>
+      </w:r>
       <w:r>
         <w:t>-Format.</w:t>
       </w:r>
@@ -1127,32 +1106,13 @@
         <w:t xml:space="preserve">Import </w:t>
       </w:r>
       <w:r>
-        <w:t xml:space="preserve">→ Importiert Workshop-Wahlen </w:t>
-      </w:r>
-      <w:proofErr w:type="gramStart"/>
-      <w:r>
-        <w:t xml:space="preserve">im </w:t>
+        <w:t xml:space="preserve">→ Importiert Workshop-Wahlen im </w:t>
       </w:r>
       <w:r>
         <w:rPr>
           <w:rFonts w:ascii="Cascadia Mono" w:hAnsi="Cascadia Mono"/>
         </w:rPr>
-        <w:t>.</w:t>
-      </w:r>
-      <w:proofErr w:type="spellStart"/>
-      <w:r>
-        <w:rPr>
-          <w:rFonts w:ascii="Cascadia Mono" w:hAnsi="Cascadia Mono"/>
-        </w:rPr>
-        <w:t>json</w:t>
-      </w:r>
-      <w:proofErr w:type="spellEnd"/>
-      <w:proofErr w:type="gramEnd"/>
-      <w:r>
-        <w:rPr>
-          <w:rFonts w:ascii="Cascadia Mono" w:hAnsi="Cascadia Mono"/>
-        </w:rPr>
-        <w:t>-</w:t>
+        <w:t>.json-</w:t>
       </w:r>
       <w:r>
         <w:t>Format.</w:t>
@@ -1266,25 +1226,7 @@
                                 <w:sz w:val="20"/>
                                 <w:szCs w:val="20"/>
                               </w:rPr>
-                              <w:t xml:space="preserve">    "</w:t>
-                            </w:r>
-                            <w:proofErr w:type="spellStart"/>
-                            <w:r>
-                              <w:rPr>
-                                <w:rFonts w:ascii="Cascadia Mono" w:hAnsi="Cascadia Mono"/>
-                                <w:sz w:val="20"/>
-                                <w:szCs w:val="20"/>
-                              </w:rPr>
-                              <w:t>id</w:t>
-                            </w:r>
-                            <w:proofErr w:type="spellEnd"/>
-                            <w:r>
-                              <w:rPr>
-                                <w:rFonts w:ascii="Cascadia Mono" w:hAnsi="Cascadia Mono"/>
-                                <w:sz w:val="20"/>
-                                <w:szCs w:val="20"/>
-                              </w:rPr>
-                              <w:t>": 1,</w:t>
+                              <w:t xml:space="preserve">    "id": 1,</w:t>
                             </w:r>
                           </w:p>
                           <w:p>
@@ -1302,25 +1244,7 @@
                                 <w:sz w:val="20"/>
                                 <w:szCs w:val="20"/>
                               </w:rPr>
-                              <w:t xml:space="preserve">    "</w:t>
-                            </w:r>
-                            <w:proofErr w:type="spellStart"/>
-                            <w:r>
-                              <w:rPr>
-                                <w:rFonts w:ascii="Cascadia Mono" w:hAnsi="Cascadia Mono"/>
-                                <w:sz w:val="20"/>
-                                <w:szCs w:val="20"/>
-                              </w:rPr>
-                              <w:t>name</w:t>
-                            </w:r>
-                            <w:proofErr w:type="spellEnd"/>
-                            <w:r>
-                              <w:rPr>
-                                <w:rFonts w:ascii="Cascadia Mono" w:hAnsi="Cascadia Mono"/>
-                                <w:sz w:val="20"/>
-                                <w:szCs w:val="20"/>
-                              </w:rPr>
-                              <w:t>": "Max Mustermann",</w:t>
+                              <w:t xml:space="preserve">    "name": "Max Mustermann",</w:t>
                             </w:r>
                           </w:p>
                           <w:p>
@@ -1338,25 +1262,7 @@
                                 <w:sz w:val="20"/>
                                 <w:szCs w:val="20"/>
                               </w:rPr>
-                              <w:t xml:space="preserve">    "</w:t>
-                            </w:r>
-                            <w:proofErr w:type="spellStart"/>
-                            <w:r>
-                              <w:rPr>
-                                <w:rFonts w:ascii="Cascadia Mono" w:hAnsi="Cascadia Mono"/>
-                                <w:sz w:val="20"/>
-                                <w:szCs w:val="20"/>
-                              </w:rPr>
-                              <w:t>preferences</w:t>
-                            </w:r>
-                            <w:proofErr w:type="spellEnd"/>
-                            <w:r>
-                              <w:rPr>
-                                <w:rFonts w:ascii="Cascadia Mono" w:hAnsi="Cascadia Mono"/>
-                                <w:sz w:val="20"/>
-                                <w:szCs w:val="20"/>
-                              </w:rPr>
-                              <w:t>": {</w:t>
+                              <w:t xml:space="preserve">    "preferences": {</w:t>
                             </w:r>
                           </w:p>
                           <w:p>
@@ -1374,25 +1280,7 @@
                                 <w:sz w:val="20"/>
                                 <w:szCs w:val="20"/>
                               </w:rPr>
-                              <w:t xml:space="preserve">      "</w:t>
-                            </w:r>
-                            <w:proofErr w:type="spellStart"/>
-                            <w:r>
-                              <w:rPr>
-                                <w:rFonts w:ascii="Cascadia Mono" w:hAnsi="Cascadia Mono"/>
-                                <w:sz w:val="20"/>
-                                <w:szCs w:val="20"/>
-                              </w:rPr>
-                              <w:t>first</w:t>
-                            </w:r>
-                            <w:proofErr w:type="spellEnd"/>
-                            <w:r>
-                              <w:rPr>
-                                <w:rFonts w:ascii="Cascadia Mono" w:hAnsi="Cascadia Mono"/>
-                                <w:sz w:val="20"/>
-                                <w:szCs w:val="20"/>
-                              </w:rPr>
-                              <w:t>": "Workshop A",</w:t>
+                              <w:t xml:space="preserve">      "first": "Workshop A",</w:t>
                             </w:r>
                           </w:p>
                           <w:p>
@@ -1410,25 +1298,7 @@
                                 <w:sz w:val="20"/>
                                 <w:szCs w:val="20"/>
                               </w:rPr>
-                              <w:t xml:space="preserve">      "</w:t>
-                            </w:r>
-                            <w:proofErr w:type="spellStart"/>
-                            <w:r>
-                              <w:rPr>
-                                <w:rFonts w:ascii="Cascadia Mono" w:hAnsi="Cascadia Mono"/>
-                                <w:sz w:val="20"/>
-                                <w:szCs w:val="20"/>
-                              </w:rPr>
-                              <w:t>second</w:t>
-                            </w:r>
-                            <w:proofErr w:type="spellEnd"/>
-                            <w:r>
-                              <w:rPr>
-                                <w:rFonts w:ascii="Cascadia Mono" w:hAnsi="Cascadia Mono"/>
-                                <w:sz w:val="20"/>
-                                <w:szCs w:val="20"/>
-                              </w:rPr>
-                              <w:t>": "Workshop B",</w:t>
+                              <w:t xml:space="preserve">      "second": "Workshop B",</w:t>
                             </w:r>
                           </w:p>
                           <w:p>
@@ -1446,25 +1316,7 @@
                                 <w:sz w:val="20"/>
                                 <w:szCs w:val="20"/>
                               </w:rPr>
-                              <w:t xml:space="preserve">      "</w:t>
-                            </w:r>
-                            <w:proofErr w:type="spellStart"/>
-                            <w:r>
-                              <w:rPr>
-                                <w:rFonts w:ascii="Cascadia Mono" w:hAnsi="Cascadia Mono"/>
-                                <w:sz w:val="20"/>
-                                <w:szCs w:val="20"/>
-                              </w:rPr>
-                              <w:t>third</w:t>
-                            </w:r>
-                            <w:proofErr w:type="spellEnd"/>
-                            <w:r>
-                              <w:rPr>
-                                <w:rFonts w:ascii="Cascadia Mono" w:hAnsi="Cascadia Mono"/>
-                                <w:sz w:val="20"/>
-                                <w:szCs w:val="20"/>
-                              </w:rPr>
-                              <w:t>": "Workshop C"</w:t>
+                              <w:t xml:space="preserve">      "third": "Workshop C"</w:t>
                             </w:r>
                           </w:p>
                           <w:p>
@@ -1536,25 +1388,7 @@
                                 <w:sz w:val="20"/>
                                 <w:szCs w:val="20"/>
                               </w:rPr>
-                              <w:t xml:space="preserve">    "</w:t>
-                            </w:r>
-                            <w:proofErr w:type="spellStart"/>
-                            <w:r>
-                              <w:rPr>
-                                <w:rFonts w:ascii="Cascadia Mono" w:hAnsi="Cascadia Mono"/>
-                                <w:sz w:val="20"/>
-                                <w:szCs w:val="20"/>
-                              </w:rPr>
-                              <w:t>id</w:t>
-                            </w:r>
-                            <w:proofErr w:type="spellEnd"/>
-                            <w:r>
-                              <w:rPr>
-                                <w:rFonts w:ascii="Cascadia Mono" w:hAnsi="Cascadia Mono"/>
-                                <w:sz w:val="20"/>
-                                <w:szCs w:val="20"/>
-                              </w:rPr>
-                              <w:t>": 2,</w:t>
+                              <w:t xml:space="preserve">    "id": 2,</w:t>
                             </w:r>
                           </w:p>
                           <w:p>
@@ -1572,25 +1406,7 @@
                                 <w:sz w:val="20"/>
                                 <w:szCs w:val="20"/>
                               </w:rPr>
-                              <w:t xml:space="preserve">    "</w:t>
-                            </w:r>
-                            <w:proofErr w:type="spellStart"/>
-                            <w:r>
-                              <w:rPr>
-                                <w:rFonts w:ascii="Cascadia Mono" w:hAnsi="Cascadia Mono"/>
-                                <w:sz w:val="20"/>
-                                <w:szCs w:val="20"/>
-                              </w:rPr>
-                              <w:t>name</w:t>
-                            </w:r>
-                            <w:proofErr w:type="spellEnd"/>
-                            <w:r>
-                              <w:rPr>
-                                <w:rFonts w:ascii="Cascadia Mono" w:hAnsi="Cascadia Mono"/>
-                                <w:sz w:val="20"/>
-                                <w:szCs w:val="20"/>
-                              </w:rPr>
-                              <w:t>": "Erika Musterfrau",</w:t>
+                              <w:t xml:space="preserve">    "name": "Erika Musterfrau",</w:t>
                             </w:r>
                           </w:p>
                           <w:p>
@@ -1608,25 +1424,7 @@
                                 <w:sz w:val="20"/>
                                 <w:szCs w:val="20"/>
                               </w:rPr>
-                              <w:t xml:space="preserve">    "</w:t>
-                            </w:r>
-                            <w:proofErr w:type="spellStart"/>
-                            <w:r>
-                              <w:rPr>
-                                <w:rFonts w:ascii="Cascadia Mono" w:hAnsi="Cascadia Mono"/>
-                                <w:sz w:val="20"/>
-                                <w:szCs w:val="20"/>
-                              </w:rPr>
-                              <w:t>preferences</w:t>
-                            </w:r>
-                            <w:proofErr w:type="spellEnd"/>
-                            <w:r>
-                              <w:rPr>
-                                <w:rFonts w:ascii="Cascadia Mono" w:hAnsi="Cascadia Mono"/>
-                                <w:sz w:val="20"/>
-                                <w:szCs w:val="20"/>
-                              </w:rPr>
-                              <w:t>": {</w:t>
+                              <w:t xml:space="preserve">    "preferences": {</w:t>
                             </w:r>
                           </w:p>
                           <w:p>
@@ -1644,25 +1442,7 @@
                                 <w:sz w:val="20"/>
                                 <w:szCs w:val="20"/>
                               </w:rPr>
-                              <w:t xml:space="preserve">      "</w:t>
-                            </w:r>
-                            <w:proofErr w:type="spellStart"/>
-                            <w:r>
-                              <w:rPr>
-                                <w:rFonts w:ascii="Cascadia Mono" w:hAnsi="Cascadia Mono"/>
-                                <w:sz w:val="20"/>
-                                <w:szCs w:val="20"/>
-                              </w:rPr>
-                              <w:t>first</w:t>
-                            </w:r>
-                            <w:proofErr w:type="spellEnd"/>
-                            <w:r>
-                              <w:rPr>
-                                <w:rFonts w:ascii="Cascadia Mono" w:hAnsi="Cascadia Mono"/>
-                                <w:sz w:val="20"/>
-                                <w:szCs w:val="20"/>
-                              </w:rPr>
-                              <w:t>": "Workshop B",</w:t>
+                              <w:t xml:space="preserve">      "first": "Workshop B",</w:t>
                             </w:r>
                           </w:p>
                           <w:p>
@@ -1680,25 +1460,7 @@
                                 <w:sz w:val="20"/>
                                 <w:szCs w:val="20"/>
                               </w:rPr>
-                              <w:t xml:space="preserve">      "</w:t>
-                            </w:r>
-                            <w:proofErr w:type="spellStart"/>
-                            <w:r>
-                              <w:rPr>
-                                <w:rFonts w:ascii="Cascadia Mono" w:hAnsi="Cascadia Mono"/>
-                                <w:sz w:val="20"/>
-                                <w:szCs w:val="20"/>
-                              </w:rPr>
-                              <w:t>second</w:t>
-                            </w:r>
-                            <w:proofErr w:type="spellEnd"/>
-                            <w:r>
-                              <w:rPr>
-                                <w:rFonts w:ascii="Cascadia Mono" w:hAnsi="Cascadia Mono"/>
-                                <w:sz w:val="20"/>
-                                <w:szCs w:val="20"/>
-                              </w:rPr>
-                              <w:t>": "Workshop A",</w:t>
+                              <w:t xml:space="preserve">      "second": "Workshop A",</w:t>
                             </w:r>
                           </w:p>
                           <w:p>
@@ -1716,25 +1478,7 @@
                                 <w:sz w:val="20"/>
                                 <w:szCs w:val="20"/>
                               </w:rPr>
-                              <w:t xml:space="preserve">      "</w:t>
-                            </w:r>
-                            <w:proofErr w:type="spellStart"/>
-                            <w:r>
-                              <w:rPr>
-                                <w:rFonts w:ascii="Cascadia Mono" w:hAnsi="Cascadia Mono"/>
-                                <w:sz w:val="20"/>
-                                <w:szCs w:val="20"/>
-                              </w:rPr>
-                              <w:t>third</w:t>
-                            </w:r>
-                            <w:proofErr w:type="spellEnd"/>
-                            <w:r>
-                              <w:rPr>
-                                <w:rFonts w:ascii="Cascadia Mono" w:hAnsi="Cascadia Mono"/>
-                                <w:sz w:val="20"/>
-                                <w:szCs w:val="20"/>
-                              </w:rPr>
-                              <w:t>": "Workshop D"</w:t>
+                              <w:t xml:space="preserve">      "third": "Workshop D"</w:t>
                             </w:r>
                           </w:p>
                           <w:p>
@@ -1868,25 +1612,7 @@
                           <w:sz w:val="20"/>
                           <w:szCs w:val="20"/>
                         </w:rPr>
-                        <w:t xml:space="preserve">    "</w:t>
-                      </w:r>
-                      <w:proofErr w:type="spellStart"/>
-                      <w:r>
-                        <w:rPr>
-                          <w:rFonts w:ascii="Cascadia Mono" w:hAnsi="Cascadia Mono"/>
-                          <w:sz w:val="20"/>
-                          <w:szCs w:val="20"/>
-                        </w:rPr>
-                        <w:t>id</w:t>
-                      </w:r>
-                      <w:proofErr w:type="spellEnd"/>
-                      <w:r>
-                        <w:rPr>
-                          <w:rFonts w:ascii="Cascadia Mono" w:hAnsi="Cascadia Mono"/>
-                          <w:sz w:val="20"/>
-                          <w:szCs w:val="20"/>
-                        </w:rPr>
-                        <w:t>": 1,</w:t>
+                        <w:t xml:space="preserve">    "id": 1,</w:t>
                       </w:r>
                     </w:p>
                     <w:p>
@@ -1904,25 +1630,7 @@
                           <w:sz w:val="20"/>
                           <w:szCs w:val="20"/>
                         </w:rPr>
-                        <w:t xml:space="preserve">    "</w:t>
-                      </w:r>
-                      <w:proofErr w:type="spellStart"/>
-                      <w:r>
-                        <w:rPr>
-                          <w:rFonts w:ascii="Cascadia Mono" w:hAnsi="Cascadia Mono"/>
-                          <w:sz w:val="20"/>
-                          <w:szCs w:val="20"/>
-                        </w:rPr>
-                        <w:t>name</w:t>
-                      </w:r>
-                      <w:proofErr w:type="spellEnd"/>
-                      <w:r>
-                        <w:rPr>
-                          <w:rFonts w:ascii="Cascadia Mono" w:hAnsi="Cascadia Mono"/>
-                          <w:sz w:val="20"/>
-                          <w:szCs w:val="20"/>
-                        </w:rPr>
-                        <w:t>": "Max Mustermann",</w:t>
+                        <w:t xml:space="preserve">    "name": "Max Mustermann",</w:t>
                       </w:r>
                     </w:p>
                     <w:p>
@@ -1940,25 +1648,7 @@
                           <w:sz w:val="20"/>
                           <w:szCs w:val="20"/>
                         </w:rPr>
-                        <w:t xml:space="preserve">    "</w:t>
-                      </w:r>
-                      <w:proofErr w:type="spellStart"/>
-                      <w:r>
-                        <w:rPr>
-                          <w:rFonts w:ascii="Cascadia Mono" w:hAnsi="Cascadia Mono"/>
-                          <w:sz w:val="20"/>
-                          <w:szCs w:val="20"/>
-                        </w:rPr>
-                        <w:t>preferences</w:t>
-                      </w:r>
-                      <w:proofErr w:type="spellEnd"/>
-                      <w:r>
-                        <w:rPr>
-                          <w:rFonts w:ascii="Cascadia Mono" w:hAnsi="Cascadia Mono"/>
-                          <w:sz w:val="20"/>
-                          <w:szCs w:val="20"/>
-                        </w:rPr>
-                        <w:t>": {</w:t>
+                        <w:t xml:space="preserve">    "preferences": {</w:t>
                       </w:r>
                     </w:p>
                     <w:p>
@@ -1976,25 +1666,7 @@
                           <w:sz w:val="20"/>
                           <w:szCs w:val="20"/>
                         </w:rPr>
-                        <w:t xml:space="preserve">      "</w:t>
-                      </w:r>
-                      <w:proofErr w:type="spellStart"/>
-                      <w:r>
-                        <w:rPr>
-                          <w:rFonts w:ascii="Cascadia Mono" w:hAnsi="Cascadia Mono"/>
-                          <w:sz w:val="20"/>
-                          <w:szCs w:val="20"/>
-                        </w:rPr>
-                        <w:t>first</w:t>
-                      </w:r>
-                      <w:proofErr w:type="spellEnd"/>
-                      <w:r>
-                        <w:rPr>
-                          <w:rFonts w:ascii="Cascadia Mono" w:hAnsi="Cascadia Mono"/>
-                          <w:sz w:val="20"/>
-                          <w:szCs w:val="20"/>
-                        </w:rPr>
-                        <w:t>": "Workshop A",</w:t>
+                        <w:t xml:space="preserve">      "first": "Workshop A",</w:t>
                       </w:r>
                     </w:p>
                     <w:p>
@@ -2012,25 +1684,7 @@
                           <w:sz w:val="20"/>
                           <w:szCs w:val="20"/>
                         </w:rPr>
-                        <w:t xml:space="preserve">      "</w:t>
-                      </w:r>
-                      <w:proofErr w:type="spellStart"/>
-                      <w:r>
-                        <w:rPr>
-                          <w:rFonts w:ascii="Cascadia Mono" w:hAnsi="Cascadia Mono"/>
-                          <w:sz w:val="20"/>
-                          <w:szCs w:val="20"/>
-                        </w:rPr>
-                        <w:t>second</w:t>
-                      </w:r>
-                      <w:proofErr w:type="spellEnd"/>
-                      <w:r>
-                        <w:rPr>
-                          <w:rFonts w:ascii="Cascadia Mono" w:hAnsi="Cascadia Mono"/>
-                          <w:sz w:val="20"/>
-                          <w:szCs w:val="20"/>
-                        </w:rPr>
-                        <w:t>": "Workshop B",</w:t>
+                        <w:t xml:space="preserve">      "second": "Workshop B",</w:t>
                       </w:r>
                     </w:p>
                     <w:p>
@@ -2048,25 +1702,7 @@
                           <w:sz w:val="20"/>
                           <w:szCs w:val="20"/>
                         </w:rPr>
-                        <w:t xml:space="preserve">      "</w:t>
-                      </w:r>
-                      <w:proofErr w:type="spellStart"/>
-                      <w:r>
-                        <w:rPr>
-                          <w:rFonts w:ascii="Cascadia Mono" w:hAnsi="Cascadia Mono"/>
-                          <w:sz w:val="20"/>
-                          <w:szCs w:val="20"/>
-                        </w:rPr>
-                        <w:t>third</w:t>
-                      </w:r>
-                      <w:proofErr w:type="spellEnd"/>
-                      <w:r>
-                        <w:rPr>
-                          <w:rFonts w:ascii="Cascadia Mono" w:hAnsi="Cascadia Mono"/>
-                          <w:sz w:val="20"/>
-                          <w:szCs w:val="20"/>
-                        </w:rPr>
-                        <w:t>": "Workshop C"</w:t>
+                        <w:t xml:space="preserve">      "third": "Workshop C"</w:t>
                       </w:r>
                     </w:p>
                     <w:p>
@@ -2138,25 +1774,7 @@
                           <w:sz w:val="20"/>
                           <w:szCs w:val="20"/>
                         </w:rPr>
-                        <w:t xml:space="preserve">    "</w:t>
-                      </w:r>
-                      <w:proofErr w:type="spellStart"/>
-                      <w:r>
-                        <w:rPr>
-                          <w:rFonts w:ascii="Cascadia Mono" w:hAnsi="Cascadia Mono"/>
-                          <w:sz w:val="20"/>
-                          <w:szCs w:val="20"/>
-                        </w:rPr>
-                        <w:t>id</w:t>
-                      </w:r>
-                      <w:proofErr w:type="spellEnd"/>
-                      <w:r>
-                        <w:rPr>
-                          <w:rFonts w:ascii="Cascadia Mono" w:hAnsi="Cascadia Mono"/>
-                          <w:sz w:val="20"/>
-                          <w:szCs w:val="20"/>
-                        </w:rPr>
-                        <w:t>": 2,</w:t>
+                        <w:t xml:space="preserve">    "id": 2,</w:t>
                       </w:r>
                     </w:p>
                     <w:p>
@@ -2174,25 +1792,7 @@
                           <w:sz w:val="20"/>
                           <w:szCs w:val="20"/>
                         </w:rPr>
-                        <w:t xml:space="preserve">    "</w:t>
-                      </w:r>
-                      <w:proofErr w:type="spellStart"/>
-                      <w:r>
-                        <w:rPr>
-                          <w:rFonts w:ascii="Cascadia Mono" w:hAnsi="Cascadia Mono"/>
-                          <w:sz w:val="20"/>
-                          <w:szCs w:val="20"/>
-                        </w:rPr>
-                        <w:t>name</w:t>
-                      </w:r>
-                      <w:proofErr w:type="spellEnd"/>
-                      <w:r>
-                        <w:rPr>
-                          <w:rFonts w:ascii="Cascadia Mono" w:hAnsi="Cascadia Mono"/>
-                          <w:sz w:val="20"/>
-                          <w:szCs w:val="20"/>
-                        </w:rPr>
-                        <w:t>": "Erika Musterfrau",</w:t>
+                        <w:t xml:space="preserve">    "name": "Erika Musterfrau",</w:t>
                       </w:r>
                     </w:p>
                     <w:p>
@@ -2210,25 +1810,7 @@
                           <w:sz w:val="20"/>
                           <w:szCs w:val="20"/>
                         </w:rPr>
-                        <w:t xml:space="preserve">    "</w:t>
-                      </w:r>
-                      <w:proofErr w:type="spellStart"/>
-                      <w:r>
-                        <w:rPr>
-                          <w:rFonts w:ascii="Cascadia Mono" w:hAnsi="Cascadia Mono"/>
-                          <w:sz w:val="20"/>
-                          <w:szCs w:val="20"/>
-                        </w:rPr>
-                        <w:t>preferences</w:t>
-                      </w:r>
-                      <w:proofErr w:type="spellEnd"/>
-                      <w:r>
-                        <w:rPr>
-                          <w:rFonts w:ascii="Cascadia Mono" w:hAnsi="Cascadia Mono"/>
-                          <w:sz w:val="20"/>
-                          <w:szCs w:val="20"/>
-                        </w:rPr>
-                        <w:t>": {</w:t>
+                        <w:t xml:space="preserve">    "preferences": {</w:t>
                       </w:r>
                     </w:p>
                     <w:p>
@@ -2246,25 +1828,7 @@
                           <w:sz w:val="20"/>
                           <w:szCs w:val="20"/>
                         </w:rPr>
-                        <w:t xml:space="preserve">      "</w:t>
-                      </w:r>
-                      <w:proofErr w:type="spellStart"/>
-                      <w:r>
-                        <w:rPr>
-                          <w:rFonts w:ascii="Cascadia Mono" w:hAnsi="Cascadia Mono"/>
-                          <w:sz w:val="20"/>
-                          <w:szCs w:val="20"/>
-                        </w:rPr>
-                        <w:t>first</w:t>
-                      </w:r>
-                      <w:proofErr w:type="spellEnd"/>
-                      <w:r>
-                        <w:rPr>
-                          <w:rFonts w:ascii="Cascadia Mono" w:hAnsi="Cascadia Mono"/>
-                          <w:sz w:val="20"/>
-                          <w:szCs w:val="20"/>
-                        </w:rPr>
-                        <w:t>": "Workshop B",</w:t>
+                        <w:t xml:space="preserve">      "first": "Workshop B",</w:t>
                       </w:r>
                     </w:p>
                     <w:p>
@@ -2282,25 +1846,7 @@
                           <w:sz w:val="20"/>
                           <w:szCs w:val="20"/>
                         </w:rPr>
-                        <w:t xml:space="preserve">      "</w:t>
-                      </w:r>
-                      <w:proofErr w:type="spellStart"/>
-                      <w:r>
-                        <w:rPr>
-                          <w:rFonts w:ascii="Cascadia Mono" w:hAnsi="Cascadia Mono"/>
-                          <w:sz w:val="20"/>
-                          <w:szCs w:val="20"/>
-                        </w:rPr>
-                        <w:t>second</w:t>
-                      </w:r>
-                      <w:proofErr w:type="spellEnd"/>
-                      <w:r>
-                        <w:rPr>
-                          <w:rFonts w:ascii="Cascadia Mono" w:hAnsi="Cascadia Mono"/>
-                          <w:sz w:val="20"/>
-                          <w:szCs w:val="20"/>
-                        </w:rPr>
-                        <w:t>": "Workshop A",</w:t>
+                        <w:t xml:space="preserve">      "second": "Workshop A",</w:t>
                       </w:r>
                     </w:p>
                     <w:p>
@@ -2318,25 +1864,7 @@
                           <w:sz w:val="20"/>
                           <w:szCs w:val="20"/>
                         </w:rPr>
-                        <w:t xml:space="preserve">      "</w:t>
-                      </w:r>
-                      <w:proofErr w:type="spellStart"/>
-                      <w:r>
-                        <w:rPr>
-                          <w:rFonts w:ascii="Cascadia Mono" w:hAnsi="Cascadia Mono"/>
-                          <w:sz w:val="20"/>
-                          <w:szCs w:val="20"/>
-                        </w:rPr>
-                        <w:t>third</w:t>
-                      </w:r>
-                      <w:proofErr w:type="spellEnd"/>
-                      <w:r>
-                        <w:rPr>
-                          <w:rFonts w:ascii="Cascadia Mono" w:hAnsi="Cascadia Mono"/>
-                          <w:sz w:val="20"/>
-                          <w:szCs w:val="20"/>
-                        </w:rPr>
-                        <w:t>": "Workshop D"</w:t>
+                        <w:t xml:space="preserve">      "third": "Workshop D"</w:t>
                       </w:r>
                     </w:p>
                     <w:p>
@@ -2419,16 +1947,12 @@
       <w:r>
         <w:t xml:space="preserve"> (</w:t>
       </w:r>
-      <w:proofErr w:type="spellStart"/>
-      <w:proofErr w:type="gramStart"/>
       <w:r>
         <w:rPr>
           <w:rFonts w:ascii="Cascadia Mono" w:hAnsi="Cascadia Mono"/>
         </w:rPr>
         <w:t>preferences.json</w:t>
       </w:r>
-      <w:proofErr w:type="spellEnd"/>
-      <w:proofErr w:type="gramEnd"/>
       <w:r>
         <w:t xml:space="preserve">): </w:t>
       </w:r>
@@ -2661,6 +2185,29 @@
       </w:r>
       <w:r>
         <w:t xml:space="preserve"> Diese zeigt nach einer generierten Zuteilung an, welcher Wunsch für eine Person gewählt wurde.</w:t>
+      </w:r>
+    </w:p>
+    <w:p>
+      <w:pPr>
+        <w:pStyle w:val="ListParagraph"/>
+        <w:numPr>
+          <w:ilvl w:val="0"/>
+          <w:numId w:val="3"/>
+        </w:numPr>
+      </w:pPr>
+      <w:r>
+        <w:rPr>
+          <w:b/>
+          <w:bCs/>
+        </w:rPr>
+        <w:t>Personen können händisch per Rechts</w:t>
+      </w:r>
+      <w:r>
+        <w:rPr>
+          <w:b/>
+          <w:bCs/>
+        </w:rPr>
+        <w:t>-Klick zugewiesen werden</w:t>
       </w:r>
       <w:r>
         <w:br/>
@@ -2899,35 +2446,14 @@
         <w:t>Export</w:t>
       </w:r>
       <w:r>
-        <w:t xml:space="preserve"> → </w:t>
-      </w:r>
-      <w:proofErr w:type="gramStart"/>
-      <w:r>
-        <w:t>Exportiert</w:t>
-      </w:r>
-      <w:proofErr w:type="gramEnd"/>
-      <w:r>
-        <w:t xml:space="preserve"> alle Workshops </w:t>
-      </w:r>
-      <w:proofErr w:type="gramStart"/>
-      <w:r>
-        <w:t xml:space="preserve">im </w:t>
+        <w:t xml:space="preserve"> → Exportiert alle Workshops im </w:t>
       </w:r>
       <w:r>
         <w:rPr>
           <w:rFonts w:ascii="Cascadia Mono" w:hAnsi="Cascadia Mono"/>
         </w:rPr>
-        <w:t>.</w:t>
-      </w:r>
-      <w:proofErr w:type="spellStart"/>
-      <w:r>
-        <w:rPr>
-          <w:rFonts w:ascii="Cascadia Mono" w:hAnsi="Cascadia Mono"/>
-        </w:rPr>
-        <w:t>json</w:t>
-      </w:r>
-      <w:proofErr w:type="spellEnd"/>
-      <w:proofErr w:type="gramEnd"/>
+        <w:t>.json</w:t>
+      </w:r>
       <w:r>
         <w:t>-Format.</w:t>
       </w:r>
@@ -2948,40 +2474,13 @@
         <w:t xml:space="preserve">Import </w:t>
       </w:r>
       <w:r>
-        <w:t xml:space="preserve">→ </w:t>
-      </w:r>
-      <w:proofErr w:type="gramStart"/>
-      <w:r>
-        <w:t>Importiert</w:t>
-      </w:r>
-      <w:proofErr w:type="gramEnd"/>
-      <w:r>
-        <w:t xml:space="preserve"> Workshops </w:t>
-      </w:r>
-      <w:proofErr w:type="gramStart"/>
-      <w:r>
-        <w:t xml:space="preserve">im </w:t>
+        <w:t xml:space="preserve">→ Importiert Workshops im </w:t>
       </w:r>
       <w:r>
         <w:rPr>
           <w:rFonts w:ascii="Cascadia Mono" w:hAnsi="Cascadia Mono"/>
         </w:rPr>
-        <w:t>.</w:t>
-      </w:r>
-      <w:proofErr w:type="spellStart"/>
-      <w:r>
-        <w:rPr>
-          <w:rFonts w:ascii="Cascadia Mono" w:hAnsi="Cascadia Mono"/>
-        </w:rPr>
-        <w:t>json</w:t>
-      </w:r>
-      <w:proofErr w:type="spellEnd"/>
-      <w:proofErr w:type="gramEnd"/>
-      <w:r>
-        <w:rPr>
-          <w:rFonts w:ascii="Cascadia Mono" w:hAnsi="Cascadia Mono"/>
-        </w:rPr>
-        <w:t>-</w:t>
+        <w:t>.json-</w:t>
       </w:r>
       <w:r>
         <w:t>Format.</w:t>
@@ -3100,27 +2599,7 @@
                                 <w:sz w:val="20"/>
                                 <w:szCs w:val="20"/>
                               </w:rPr>
-                              <w:t xml:space="preserve">    "</w:t>
-                            </w:r>
-                            <w:proofErr w:type="spellStart"/>
-                            <w:r>
-                              <w:rPr>
-                                <w:rStyle w:val="markedcontent"/>
-                                <w:rFonts w:ascii="Cascadia Mono" w:hAnsi="Cascadia Mono"/>
-                                <w:sz w:val="20"/>
-                                <w:szCs w:val="20"/>
-                              </w:rPr>
-                              <w:t>id</w:t>
-                            </w:r>
-                            <w:proofErr w:type="spellEnd"/>
-                            <w:r>
-                              <w:rPr>
-                                <w:rStyle w:val="markedcontent"/>
-                                <w:rFonts w:ascii="Cascadia Mono" w:hAnsi="Cascadia Mono"/>
-                                <w:sz w:val="20"/>
-                                <w:szCs w:val="20"/>
-                              </w:rPr>
-                              <w:t>": 1,</w:t>
+                              <w:t xml:space="preserve">    "id": 1,</w:t>
                             </w:r>
                           </w:p>
                           <w:p>
@@ -3160,27 +2639,7 @@
                                 <w:sz w:val="20"/>
                                 <w:szCs w:val="20"/>
                               </w:rPr>
-                              <w:t xml:space="preserve">    "</w:t>
-                            </w:r>
-                            <w:proofErr w:type="spellStart"/>
-                            <w:r>
-                              <w:rPr>
-                                <w:rStyle w:val="markedcontent"/>
-                                <w:rFonts w:ascii="Cascadia Mono" w:hAnsi="Cascadia Mono"/>
-                                <w:sz w:val="20"/>
-                                <w:szCs w:val="20"/>
-                              </w:rPr>
-                              <w:t>maxParticipants</w:t>
-                            </w:r>
-                            <w:proofErr w:type="spellEnd"/>
-                            <w:r>
-                              <w:rPr>
-                                <w:rStyle w:val="markedcontent"/>
-                                <w:rFonts w:ascii="Cascadia Mono" w:hAnsi="Cascadia Mono"/>
-                                <w:sz w:val="20"/>
-                                <w:szCs w:val="20"/>
-                              </w:rPr>
-                              <w:t>": 20,</w:t>
+                              <w:t xml:space="preserve">    "maxParticipants": 20,</w:t>
                             </w:r>
                           </w:p>
                           <w:p>
@@ -3200,27 +2659,7 @@
                                 <w:sz w:val="20"/>
                                 <w:szCs w:val="20"/>
                               </w:rPr>
-                              <w:t xml:space="preserve">    "</w:t>
-                            </w:r>
-                            <w:proofErr w:type="spellStart"/>
-                            <w:r>
-                              <w:rPr>
-                                <w:rStyle w:val="markedcontent"/>
-                                <w:rFonts w:ascii="Cascadia Mono" w:hAnsi="Cascadia Mono"/>
-                                <w:sz w:val="20"/>
-                                <w:szCs w:val="20"/>
-                              </w:rPr>
-                              <w:t>minParticipants</w:t>
-                            </w:r>
-                            <w:proofErr w:type="spellEnd"/>
-                            <w:r>
-                              <w:rPr>
-                                <w:rStyle w:val="markedcontent"/>
-                                <w:rFonts w:ascii="Cascadia Mono" w:hAnsi="Cascadia Mono"/>
-                                <w:sz w:val="20"/>
-                                <w:szCs w:val="20"/>
-                              </w:rPr>
-                              <w:t>": 5,</w:t>
+                              <w:t xml:space="preserve">    "minParticipants": 5,</w:t>
                             </w:r>
                           </w:p>
                           <w:p>
@@ -3239,27 +2678,7 @@
                                 <w:sz w:val="20"/>
                                 <w:szCs w:val="20"/>
                               </w:rPr>
-                              <w:t xml:space="preserve">    "</w:t>
-                            </w:r>
-                            <w:proofErr w:type="spellStart"/>
-                            <w:r>
-                              <w:rPr>
-                                <w:rStyle w:val="markedcontent"/>
-                                <w:rFonts w:ascii="Cascadia Mono" w:hAnsi="Cascadia Mono"/>
-                                <w:sz w:val="20"/>
-                                <w:szCs w:val="20"/>
-                              </w:rPr>
-                              <w:t>staff</w:t>
-                            </w:r>
-                            <w:proofErr w:type="spellEnd"/>
-                            <w:r>
-                              <w:rPr>
-                                <w:rStyle w:val="markedcontent"/>
-                                <w:rFonts w:ascii="Cascadia Mono" w:hAnsi="Cascadia Mono"/>
-                                <w:sz w:val="20"/>
-                                <w:szCs w:val="20"/>
-                              </w:rPr>
-                              <w:t>": "Herr Schmidt"</w:t>
+                              <w:t xml:space="preserve">    "staff": "Herr Schmidt"</w:t>
                             </w:r>
                           </w:p>
                           <w:p>
@@ -3319,27 +2738,7 @@
                                 <w:sz w:val="20"/>
                                 <w:szCs w:val="20"/>
                               </w:rPr>
-                              <w:t xml:space="preserve">    "</w:t>
-                            </w:r>
-                            <w:proofErr w:type="spellStart"/>
-                            <w:r>
-                              <w:rPr>
-                                <w:rStyle w:val="markedcontent"/>
-                                <w:rFonts w:ascii="Cascadia Mono" w:hAnsi="Cascadia Mono"/>
-                                <w:sz w:val="20"/>
-                                <w:szCs w:val="20"/>
-                              </w:rPr>
-                              <w:t>id</w:t>
-                            </w:r>
-                            <w:proofErr w:type="spellEnd"/>
-                            <w:r>
-                              <w:rPr>
-                                <w:rStyle w:val="markedcontent"/>
-                                <w:rFonts w:ascii="Cascadia Mono" w:hAnsi="Cascadia Mono"/>
-                                <w:sz w:val="20"/>
-                                <w:szCs w:val="20"/>
-                              </w:rPr>
-                              <w:t>": 2,</w:t>
+                              <w:t xml:space="preserve">    "id": 2,</w:t>
                             </w:r>
                           </w:p>
                           <w:p>
@@ -3379,27 +2778,7 @@
                                 <w:sz w:val="20"/>
                                 <w:szCs w:val="20"/>
                               </w:rPr>
-                              <w:t xml:space="preserve">    "</w:t>
-                            </w:r>
-                            <w:proofErr w:type="spellStart"/>
-                            <w:r>
-                              <w:rPr>
-                                <w:rStyle w:val="markedcontent"/>
-                                <w:rFonts w:ascii="Cascadia Mono" w:hAnsi="Cascadia Mono"/>
-                                <w:sz w:val="20"/>
-                                <w:szCs w:val="20"/>
-                              </w:rPr>
-                              <w:t>maxParticipants</w:t>
-                            </w:r>
-                            <w:proofErr w:type="spellEnd"/>
-                            <w:r>
-                              <w:rPr>
-                                <w:rStyle w:val="markedcontent"/>
-                                <w:rFonts w:ascii="Cascadia Mono" w:hAnsi="Cascadia Mono"/>
-                                <w:sz w:val="20"/>
-                                <w:szCs w:val="20"/>
-                              </w:rPr>
-                              <w:t>": 15,</w:t>
+                              <w:t xml:space="preserve">    "maxParticipants": 15,</w:t>
                             </w:r>
                           </w:p>
                           <w:p>
@@ -3419,27 +2798,7 @@
                                 <w:sz w:val="20"/>
                                 <w:szCs w:val="20"/>
                               </w:rPr>
-                              <w:t xml:space="preserve">    "</w:t>
-                            </w:r>
-                            <w:proofErr w:type="spellStart"/>
-                            <w:r>
-                              <w:rPr>
-                                <w:rStyle w:val="markedcontent"/>
-                                <w:rFonts w:ascii="Cascadia Mono" w:hAnsi="Cascadia Mono"/>
-                                <w:sz w:val="20"/>
-                                <w:szCs w:val="20"/>
-                              </w:rPr>
-                              <w:t>minParticipants</w:t>
-                            </w:r>
-                            <w:proofErr w:type="spellEnd"/>
-                            <w:r>
-                              <w:rPr>
-                                <w:rStyle w:val="markedcontent"/>
-                                <w:rFonts w:ascii="Cascadia Mono" w:hAnsi="Cascadia Mono"/>
-                                <w:sz w:val="20"/>
-                                <w:szCs w:val="20"/>
-                              </w:rPr>
-                              <w:t>": 5,</w:t>
+                              <w:t xml:space="preserve">    "minParticipants": 5,</w:t>
                             </w:r>
                           </w:p>
                           <w:p>
@@ -3458,27 +2817,7 @@
                                 <w:sz w:val="20"/>
                                 <w:szCs w:val="20"/>
                               </w:rPr>
-                              <w:t xml:space="preserve">    "</w:t>
-                            </w:r>
-                            <w:proofErr w:type="spellStart"/>
-                            <w:r>
-                              <w:rPr>
-                                <w:rStyle w:val="markedcontent"/>
-                                <w:rFonts w:ascii="Cascadia Mono" w:hAnsi="Cascadia Mono"/>
-                                <w:sz w:val="20"/>
-                                <w:szCs w:val="20"/>
-                              </w:rPr>
-                              <w:t>staff</w:t>
-                            </w:r>
-                            <w:proofErr w:type="spellEnd"/>
-                            <w:r>
-                              <w:rPr>
-                                <w:rStyle w:val="markedcontent"/>
-                                <w:rFonts w:ascii="Cascadia Mono" w:hAnsi="Cascadia Mono"/>
-                                <w:sz w:val="20"/>
-                                <w:szCs w:val="20"/>
-                              </w:rPr>
-                              <w:t>": "Frau Müller"</w:t>
+                              <w:t xml:space="preserve">    "staff": "Frau Müller"</w:t>
                             </w:r>
                           </w:p>
                           <w:p>
@@ -3599,27 +2938,7 @@
                           <w:sz w:val="20"/>
                           <w:szCs w:val="20"/>
                         </w:rPr>
-                        <w:t xml:space="preserve">    "</w:t>
-                      </w:r>
-                      <w:proofErr w:type="spellStart"/>
-                      <w:r>
-                        <w:rPr>
-                          <w:rStyle w:val="markedcontent"/>
-                          <w:rFonts w:ascii="Cascadia Mono" w:hAnsi="Cascadia Mono"/>
-                          <w:sz w:val="20"/>
-                          <w:szCs w:val="20"/>
-                        </w:rPr>
-                        <w:t>id</w:t>
-                      </w:r>
-                      <w:proofErr w:type="spellEnd"/>
-                      <w:r>
-                        <w:rPr>
-                          <w:rStyle w:val="markedcontent"/>
-                          <w:rFonts w:ascii="Cascadia Mono" w:hAnsi="Cascadia Mono"/>
-                          <w:sz w:val="20"/>
-                          <w:szCs w:val="20"/>
-                        </w:rPr>
-                        <w:t>": 1,</w:t>
+                        <w:t xml:space="preserve">    "id": 1,</w:t>
                       </w:r>
                     </w:p>
                     <w:p>
@@ -3659,27 +2978,7 @@
                           <w:sz w:val="20"/>
                           <w:szCs w:val="20"/>
                         </w:rPr>
-                        <w:t xml:space="preserve">    "</w:t>
-                      </w:r>
-                      <w:proofErr w:type="spellStart"/>
-                      <w:r>
-                        <w:rPr>
-                          <w:rStyle w:val="markedcontent"/>
-                          <w:rFonts w:ascii="Cascadia Mono" w:hAnsi="Cascadia Mono"/>
-                          <w:sz w:val="20"/>
-                          <w:szCs w:val="20"/>
-                        </w:rPr>
-                        <w:t>maxParticipants</w:t>
-                      </w:r>
-                      <w:proofErr w:type="spellEnd"/>
-                      <w:r>
-                        <w:rPr>
-                          <w:rStyle w:val="markedcontent"/>
-                          <w:rFonts w:ascii="Cascadia Mono" w:hAnsi="Cascadia Mono"/>
-                          <w:sz w:val="20"/>
-                          <w:szCs w:val="20"/>
-                        </w:rPr>
-                        <w:t>": 20,</w:t>
+                        <w:t xml:space="preserve">    "maxParticipants": 20,</w:t>
                       </w:r>
                     </w:p>
                     <w:p>
@@ -3699,27 +2998,7 @@
                           <w:sz w:val="20"/>
                           <w:szCs w:val="20"/>
                         </w:rPr>
-                        <w:t xml:space="preserve">    "</w:t>
-                      </w:r>
-                      <w:proofErr w:type="spellStart"/>
-                      <w:r>
-                        <w:rPr>
-                          <w:rStyle w:val="markedcontent"/>
-                          <w:rFonts w:ascii="Cascadia Mono" w:hAnsi="Cascadia Mono"/>
-                          <w:sz w:val="20"/>
-                          <w:szCs w:val="20"/>
-                        </w:rPr>
-                        <w:t>minParticipants</w:t>
-                      </w:r>
-                      <w:proofErr w:type="spellEnd"/>
-                      <w:r>
-                        <w:rPr>
-                          <w:rStyle w:val="markedcontent"/>
-                          <w:rFonts w:ascii="Cascadia Mono" w:hAnsi="Cascadia Mono"/>
-                          <w:sz w:val="20"/>
-                          <w:szCs w:val="20"/>
-                        </w:rPr>
-                        <w:t>": 5,</w:t>
+                        <w:t xml:space="preserve">    "minParticipants": 5,</w:t>
                       </w:r>
                     </w:p>
                     <w:p>
@@ -3738,27 +3017,7 @@
                           <w:sz w:val="20"/>
                           <w:szCs w:val="20"/>
                         </w:rPr>
-                        <w:t xml:space="preserve">    "</w:t>
-                      </w:r>
-                      <w:proofErr w:type="spellStart"/>
-                      <w:r>
-                        <w:rPr>
-                          <w:rStyle w:val="markedcontent"/>
-                          <w:rFonts w:ascii="Cascadia Mono" w:hAnsi="Cascadia Mono"/>
-                          <w:sz w:val="20"/>
-                          <w:szCs w:val="20"/>
-                        </w:rPr>
-                        <w:t>staff</w:t>
-                      </w:r>
-                      <w:proofErr w:type="spellEnd"/>
-                      <w:r>
-                        <w:rPr>
-                          <w:rStyle w:val="markedcontent"/>
-                          <w:rFonts w:ascii="Cascadia Mono" w:hAnsi="Cascadia Mono"/>
-                          <w:sz w:val="20"/>
-                          <w:szCs w:val="20"/>
-                        </w:rPr>
-                        <w:t>": "Herr Schmidt"</w:t>
+                        <w:t xml:space="preserve">    "staff": "Herr Schmidt"</w:t>
                       </w:r>
                     </w:p>
                     <w:p>
@@ -3818,27 +3077,7 @@
                           <w:sz w:val="20"/>
                           <w:szCs w:val="20"/>
                         </w:rPr>
-                        <w:t xml:space="preserve">    "</w:t>
-                      </w:r>
-                      <w:proofErr w:type="spellStart"/>
-                      <w:r>
-                        <w:rPr>
-                          <w:rStyle w:val="markedcontent"/>
-                          <w:rFonts w:ascii="Cascadia Mono" w:hAnsi="Cascadia Mono"/>
-                          <w:sz w:val="20"/>
-                          <w:szCs w:val="20"/>
-                        </w:rPr>
-                        <w:t>id</w:t>
-                      </w:r>
-                      <w:proofErr w:type="spellEnd"/>
-                      <w:r>
-                        <w:rPr>
-                          <w:rStyle w:val="markedcontent"/>
-                          <w:rFonts w:ascii="Cascadia Mono" w:hAnsi="Cascadia Mono"/>
-                          <w:sz w:val="20"/>
-                          <w:szCs w:val="20"/>
-                        </w:rPr>
-                        <w:t>": 2,</w:t>
+                        <w:t xml:space="preserve">    "id": 2,</w:t>
                       </w:r>
                     </w:p>
                     <w:p>
@@ -3878,27 +3117,7 @@
                           <w:sz w:val="20"/>
                           <w:szCs w:val="20"/>
                         </w:rPr>
-                        <w:t xml:space="preserve">    "</w:t>
-                      </w:r>
-                      <w:proofErr w:type="spellStart"/>
-                      <w:r>
-                        <w:rPr>
-                          <w:rStyle w:val="markedcontent"/>
-                          <w:rFonts w:ascii="Cascadia Mono" w:hAnsi="Cascadia Mono"/>
-                          <w:sz w:val="20"/>
-                          <w:szCs w:val="20"/>
-                        </w:rPr>
-                        <w:t>maxParticipants</w:t>
-                      </w:r>
-                      <w:proofErr w:type="spellEnd"/>
-                      <w:r>
-                        <w:rPr>
-                          <w:rStyle w:val="markedcontent"/>
-                          <w:rFonts w:ascii="Cascadia Mono" w:hAnsi="Cascadia Mono"/>
-                          <w:sz w:val="20"/>
-                          <w:szCs w:val="20"/>
-                        </w:rPr>
-                        <w:t>": 15,</w:t>
+                        <w:t xml:space="preserve">    "maxParticipants": 15,</w:t>
                       </w:r>
                     </w:p>
                     <w:p>
@@ -3918,27 +3137,7 @@
                           <w:sz w:val="20"/>
                           <w:szCs w:val="20"/>
                         </w:rPr>
-                        <w:t xml:space="preserve">    "</w:t>
-                      </w:r>
-                      <w:proofErr w:type="spellStart"/>
-                      <w:r>
-                        <w:rPr>
-                          <w:rStyle w:val="markedcontent"/>
-                          <w:rFonts w:ascii="Cascadia Mono" w:hAnsi="Cascadia Mono"/>
-                          <w:sz w:val="20"/>
-                          <w:szCs w:val="20"/>
-                        </w:rPr>
-                        <w:t>minParticipants</w:t>
-                      </w:r>
-                      <w:proofErr w:type="spellEnd"/>
-                      <w:r>
-                        <w:rPr>
-                          <w:rStyle w:val="markedcontent"/>
-                          <w:rFonts w:ascii="Cascadia Mono" w:hAnsi="Cascadia Mono"/>
-                          <w:sz w:val="20"/>
-                          <w:szCs w:val="20"/>
-                        </w:rPr>
-                        <w:t>": 5,</w:t>
+                        <w:t xml:space="preserve">    "minParticipants": 5,</w:t>
                       </w:r>
                     </w:p>
                     <w:p>
@@ -3957,27 +3156,7 @@
                           <w:sz w:val="20"/>
                           <w:szCs w:val="20"/>
                         </w:rPr>
-                        <w:t xml:space="preserve">    "</w:t>
-                      </w:r>
-                      <w:proofErr w:type="spellStart"/>
-                      <w:r>
-                        <w:rPr>
-                          <w:rStyle w:val="markedcontent"/>
-                          <w:rFonts w:ascii="Cascadia Mono" w:hAnsi="Cascadia Mono"/>
-                          <w:sz w:val="20"/>
-                          <w:szCs w:val="20"/>
-                        </w:rPr>
-                        <w:t>staff</w:t>
-                      </w:r>
-                      <w:proofErr w:type="spellEnd"/>
-                      <w:r>
-                        <w:rPr>
-                          <w:rStyle w:val="markedcontent"/>
-                          <w:rFonts w:ascii="Cascadia Mono" w:hAnsi="Cascadia Mono"/>
-                          <w:sz w:val="20"/>
-                          <w:szCs w:val="20"/>
-                        </w:rPr>
-                        <w:t>": "Frau Müller"</w:t>
+                        <w:t xml:space="preserve">    "staff": "Frau Müller"</w:t>
                       </w:r>
                     </w:p>
                     <w:p>
@@ -4045,16 +3224,12 @@
       <w:r>
         <w:t xml:space="preserve"> (</w:t>
       </w:r>
-      <w:proofErr w:type="spellStart"/>
-      <w:proofErr w:type="gramStart"/>
       <w:r>
         <w:rPr>
           <w:rFonts w:ascii="Cascadia Mono" w:hAnsi="Cascadia Mono"/>
         </w:rPr>
         <w:t>workshops.json</w:t>
       </w:r>
-      <w:proofErr w:type="spellEnd"/>
-      <w:proofErr w:type="gramEnd"/>
       <w:r>
         <w:t xml:space="preserve">): </w:t>
       </w:r>
@@ -4242,7 +3417,6 @@
       <w:r>
         <w:t>Veranstaltende Person (</w:t>
       </w:r>
-      <w:proofErr w:type="spellStart"/>
       <w:r>
         <w:rPr>
           <w:b/>
@@ -4250,7 +3424,6 @@
         </w:rPr>
         <w:t>staff</w:t>
       </w:r>
-      <w:proofErr w:type="spellEnd"/>
       <w:r>
         <w:t>)</w:t>
       </w:r>
@@ -4316,18 +3489,18 @@
         </w:rPr>
         <w:lastRenderedPageBreak/>
         <w:drawing>
-          <wp:anchor distT="0" distB="0" distL="114300" distR="114300" simplePos="0" relativeHeight="251665408" behindDoc="0" locked="0" layoutInCell="1" allowOverlap="1" wp14:anchorId="63CF21DC" wp14:editId="1C5DCF5E">
+          <wp:anchor distT="0" distB="0" distL="114300" distR="114300" simplePos="0" relativeHeight="251683840" behindDoc="0" locked="0" layoutInCell="1" allowOverlap="1" wp14:anchorId="4724E797" wp14:editId="1ECB4072">
             <wp:simplePos x="0" y="0"/>
-            <wp:positionH relativeFrom="margin">
-              <wp:align>right</wp:align>
+            <wp:positionH relativeFrom="column">
+              <wp:posOffset>3467735</wp:posOffset>
             </wp:positionH>
             <wp:positionV relativeFrom="paragraph">
-              <wp:posOffset>135890</wp:posOffset>
+              <wp:posOffset>0</wp:posOffset>
             </wp:positionV>
-            <wp:extent cx="2710180" cy="1600200"/>
-            <wp:effectExtent l="0" t="0" r="0" b="0"/>
+            <wp:extent cx="2432685" cy="1419225"/>
+            <wp:effectExtent l="0" t="0" r="5715" b="9525"/>
             <wp:wrapSquare wrapText="bothSides"/>
-            <wp:docPr id="473162792" name="Picture 6"/>
+            <wp:docPr id="405648793" name="Picture 1"/>
             <wp:cNvGraphicFramePr>
               <a:graphicFrameLocks xmlns:a="http://schemas.openxmlformats.org/drawingml/2006/main" noChangeAspect="1"/>
             </wp:cNvGraphicFramePr>
@@ -4335,10 +3508,8 @@
               <a:graphicData uri="http://schemas.openxmlformats.org/drawingml/2006/picture">
                 <pic:pic xmlns:pic="http://schemas.openxmlformats.org/drawingml/2006/picture">
                   <pic:nvPicPr>
-                    <pic:cNvPr id="0" name="Picture 6"/>
-                    <pic:cNvPicPr>
-                      <a:picLocks noChangeAspect="1" noChangeArrowheads="1"/>
-                    </pic:cNvPicPr>
+                    <pic:cNvPr id="405648793" name=""/>
+                    <pic:cNvPicPr/>
                   </pic:nvPicPr>
                   <pic:blipFill>
                     <a:blip r:embed="rId14">
@@ -4348,23 +3519,18 @@
                         </a:ext>
                       </a:extLst>
                     </a:blip>
-                    <a:srcRect/>
                     <a:stretch>
                       <a:fillRect/>
                     </a:stretch>
                   </pic:blipFill>
-                  <pic:spPr bwMode="auto">
+                  <pic:spPr>
                     <a:xfrm>
                       <a:off x="0" y="0"/>
-                      <a:ext cx="2710180" cy="1600200"/>
+                      <a:ext cx="2432685" cy="1419225"/>
                     </a:xfrm>
                     <a:prstGeom prst="rect">
                       <a:avLst/>
                     </a:prstGeom>
-                    <a:noFill/>
-                    <a:ln>
-                      <a:noFill/>
-                    </a:ln>
                   </pic:spPr>
                 </pic:pic>
               </a:graphicData>
@@ -4385,7 +3551,78 @@
     </w:p>
     <w:p>
       <w:r>
-        <w:t>Eine Zuteilung kann über den Button Zuteilung erstellt werden. Möchte man eine neue Zuteilung erstellen wird nun der Button Neu-Zuteilung verwendet.</w:t>
+        <w:t xml:space="preserve">Eine Zuteilung kann über den Button Zuteilung erstellt werden. Möchte man eine neue Zuteilung erstellen </w:t>
+      </w:r>
+      <w:r>
+        <w:t>wird erneut der Button Zuteilung gedrückt.</w:t>
+      </w:r>
+    </w:p>
+    <w:p>
+      <w:r>
+        <w:drawing>
+          <wp:anchor distT="0" distB="0" distL="114300" distR="114300" simplePos="0" relativeHeight="251684864" behindDoc="0" locked="0" layoutInCell="1" allowOverlap="1" wp14:anchorId="79E446DC" wp14:editId="22A5BC74">
+            <wp:simplePos x="0" y="0"/>
+            <wp:positionH relativeFrom="column">
+              <wp:posOffset>4015105</wp:posOffset>
+            </wp:positionH>
+            <wp:positionV relativeFrom="paragraph">
+              <wp:posOffset>433070</wp:posOffset>
+            </wp:positionV>
+            <wp:extent cx="1885950" cy="3588385"/>
+            <wp:effectExtent l="0" t="0" r="0" b="0"/>
+            <wp:wrapSquare wrapText="bothSides"/>
+            <wp:docPr id="976971881" name="Picture 1"/>
+            <wp:cNvGraphicFramePr>
+              <a:graphicFrameLocks xmlns:a="http://schemas.openxmlformats.org/drawingml/2006/main" noChangeAspect="1"/>
+            </wp:cNvGraphicFramePr>
+            <a:graphic xmlns:a="http://schemas.openxmlformats.org/drawingml/2006/main">
+              <a:graphicData uri="http://schemas.openxmlformats.org/drawingml/2006/picture">
+                <pic:pic xmlns:pic="http://schemas.openxmlformats.org/drawingml/2006/picture">
+                  <pic:nvPicPr>
+                    <pic:cNvPr id="976971881" name=""/>
+                    <pic:cNvPicPr/>
+                  </pic:nvPicPr>
+                  <pic:blipFill>
+                    <a:blip r:embed="rId15">
+                      <a:extLst>
+                        <a:ext uri="{28A0092B-C50C-407E-A947-70E740481C1C}">
+                          <a14:useLocalDpi xmlns:a14="http://schemas.microsoft.com/office/drawing/2010/main" val="0"/>
+                        </a:ext>
+                      </a:extLst>
+                    </a:blip>
+                    <a:stretch>
+                      <a:fillRect/>
+                    </a:stretch>
+                  </pic:blipFill>
+                  <pic:spPr>
+                    <a:xfrm>
+                      <a:off x="0" y="0"/>
+                      <a:ext cx="1885950" cy="3588385"/>
+                    </a:xfrm>
+                    <a:prstGeom prst="rect">
+                      <a:avLst/>
+                    </a:prstGeom>
+                  </pic:spPr>
+                </pic:pic>
+              </a:graphicData>
+            </a:graphic>
+            <wp14:sizeRelH relativeFrom="margin">
+              <wp14:pctWidth>0</wp14:pctWidth>
+            </wp14:sizeRelH>
+            <wp14:sizeRelV relativeFrom="margin">
+              <wp14:pctHeight>0</wp14:pctHeight>
+            </wp14:sizeRelV>
+          </wp:anchor>
+        </w:drawing>
+      </w:r>
+      <w:r>
+        <w:t>Personen können händisch per Rechtsclick in der Tabelle zugewiesen werden.</w:t>
+      </w:r>
+      <w:r>
+        <w:rPr>
+          <w:noProof/>
+        </w:rPr>
+        <w:t xml:space="preserve"> </w:t>
       </w:r>
     </w:p>
     <w:p>
@@ -4483,6 +3720,11 @@
       </w:r>
     </w:p>
     <w:p>
+      <w:r>
+        <w:t>Neben der Tabelle mit allen Präferenzen gibt es eine Ansicht, welche nach einer Zuteilung bereits anzeigt, wie voll welche Workshops sind.</w:t>
+      </w:r>
+    </w:p>
+    <w:p>
       <w:pPr>
         <w:pStyle w:val="Heading1"/>
       </w:pPr>
@@ -4492,13 +3734,13 @@
           <w:noProof/>
         </w:rPr>
         <w:drawing>
-          <wp:anchor distT="0" distB="0" distL="114300" distR="114300" simplePos="0" relativeHeight="251675648" behindDoc="0" locked="0" layoutInCell="1" allowOverlap="1" wp14:anchorId="76D77149" wp14:editId="57526C20">
+          <wp:anchor distT="0" distB="0" distL="114300" distR="114300" simplePos="0" relativeHeight="251675648" behindDoc="0" locked="0" layoutInCell="1" allowOverlap="1" wp14:anchorId="76D77149" wp14:editId="6D9AA255">
             <wp:simplePos x="0" y="0"/>
             <wp:positionH relativeFrom="margin">
-              <wp:align>right</wp:align>
+              <wp:posOffset>4182110</wp:posOffset>
             </wp:positionH>
             <wp:positionV relativeFrom="paragraph">
-              <wp:posOffset>146049</wp:posOffset>
+              <wp:posOffset>402590</wp:posOffset>
             </wp:positionV>
             <wp:extent cx="1664413" cy="2886075"/>
             <wp:effectExtent l="0" t="0" r="0" b="0"/>
@@ -4517,7 +3759,7 @@
                     </pic:cNvPicPr>
                   </pic:nvPicPr>
                   <pic:blipFill>
-                    <a:blip r:embed="rId15">
+                    <a:blip r:embed="rId16">
                       <a:extLst>
                         <a:ext uri="{28A0092B-C50C-407E-A947-70E740481C1C}">
                           <a14:useLocalDpi xmlns:a14="http://schemas.microsoft.com/office/drawing/2010/main" val="0"/>
@@ -4595,11 +3837,7 @@
         <w:t>JSON-Format:</w:t>
       </w:r>
       <w:r>
-        <w:t xml:space="preserve"> Array von Objekten </w:t>
-      </w:r>
-      <w:proofErr w:type="gramStart"/>
-      <w:r>
-        <w:t xml:space="preserve">mit </w:t>
+        <w:t xml:space="preserve"> Array von Objekten mit </w:t>
       </w:r>
       <w:r>
         <w:rPr>
@@ -4607,7 +3845,6 @@
         </w:rPr>
         <w:t>Vorname</w:t>
       </w:r>
-      <w:proofErr w:type="gramEnd"/>
       <w:r>
         <w:t xml:space="preserve">, </w:t>
       </w:r>
@@ -4627,7 +3864,13 @@
         <w:t>Kurs</w:t>
       </w:r>
       <w:r>
-        <w:t xml:space="preserve"> (optional)</w:t>
+        <w:t xml:space="preserve"> (</w:t>
+      </w:r>
+      <w:r>
+        <w:t xml:space="preserve">Kurs ist </w:t>
+      </w:r>
+      <w:r>
+        <w:t>optional)</w:t>
       </w:r>
       <w:r>
         <w:t>.</w:t>
@@ -4651,11 +3894,7 @@
         <w:t>Nachname, Vorname</w:t>
       </w:r>
       <w:r>
-        <w:t xml:space="preserve">. Als Trennzeichen kann </w:t>
-      </w:r>
-      <w:proofErr w:type="gramStart"/>
-      <w:r>
-        <w:t xml:space="preserve">entweder </w:t>
+        <w:t xml:space="preserve">. Als Trennzeichen kann entweder </w:t>
       </w:r>
       <w:r>
         <w:rPr>
@@ -4665,13 +3904,8 @@
         </w:rPr>
         <w:t>,</w:t>
       </w:r>
-      <w:proofErr w:type="gramEnd"/>
-      <w:r>
-        <w:t xml:space="preserve"> </w:t>
-      </w:r>
-      <w:proofErr w:type="gramStart"/>
-      <w:r>
-        <w:t xml:space="preserve">oder </w:t>
+      <w:r>
+        <w:t xml:space="preserve"> oder </w:t>
       </w:r>
       <w:r>
         <w:rPr>
@@ -4681,7 +3915,6 @@
         </w:rPr>
         <w:t>;</w:t>
       </w:r>
-      <w:proofErr w:type="gramEnd"/>
       <w:r>
         <w:t xml:space="preserve"> verwendet werden. Wenn keine Überschrift angegeben ist, müssen die Spalten erst Nachname, dann Vorname sein. Gibt man Spaltenüberschriften an, so kann es auch Vorname dann Nachname sein. Unterstütze Überschriftpaare sind </w:t>
       </w:r>
@@ -4741,6 +3974,7 @@
         <w:rPr>
           <w:noProof/>
         </w:rPr>
+        <w:lastRenderedPageBreak/>
         <mc:AlternateContent>
           <mc:Choice Requires="wps">
             <w:drawing>
@@ -4979,16 +4213,12 @@
       <w:r>
         <w:t xml:space="preserve"> (</w:t>
       </w:r>
-      <w:proofErr w:type="spellStart"/>
-      <w:proofErr w:type="gramStart"/>
       <w:r>
         <w:rPr>
           <w:rFonts w:ascii="Cascadia Mono" w:hAnsi="Cascadia Mono"/>
         </w:rPr>
         <w:t>participants.json</w:t>
       </w:r>
-      <w:proofErr w:type="spellEnd"/>
-      <w:proofErr w:type="gramEnd"/>
       <w:r>
         <w:t xml:space="preserve">): </w:t>
       </w:r>
@@ -5059,7 +4289,6 @@
                                 <w:lang w:val="en-US"/>
                               </w:rPr>
                             </w:pPr>
-                            <w:proofErr w:type="spellStart"/>
                             <w:r>
                               <w:rPr>
                                 <w:rFonts w:ascii="Cascadia Mono" w:hAnsi="Cascadia Mono"/>
@@ -5067,29 +4296,8 @@
                                 <w:szCs w:val="20"/>
                                 <w:lang w:val="en-US"/>
                               </w:rPr>
-                              <w:t>Nachname</w:t>
+                              <w:t>Nachname; Vorname</w:t>
                             </w:r>
-                            <w:proofErr w:type="spellEnd"/>
-                            <w:r>
-                              <w:rPr>
-                                <w:rFonts w:ascii="Cascadia Mono" w:hAnsi="Cascadia Mono"/>
-                                <w:sz w:val="20"/>
-                                <w:szCs w:val="20"/>
-                                <w:lang w:val="en-US"/>
-                              </w:rPr>
-                              <w:t xml:space="preserve">; </w:t>
-                            </w:r>
-                            <w:proofErr w:type="spellStart"/>
-                            <w:r>
-                              <w:rPr>
-                                <w:rFonts w:ascii="Cascadia Mono" w:hAnsi="Cascadia Mono"/>
-                                <w:sz w:val="20"/>
-                                <w:szCs w:val="20"/>
-                                <w:lang w:val="en-US"/>
-                              </w:rPr>
-                              <w:t>Vorname</w:t>
-                            </w:r>
-                            <w:proofErr w:type="spellEnd"/>
                           </w:p>
                           <w:p>
                             <w:pPr>
@@ -5139,7 +4347,6 @@
                                 <w:lang w:val="en-US"/>
                               </w:rPr>
                             </w:pPr>
-                            <w:proofErr w:type="spellStart"/>
                             <w:r>
                               <w:rPr>
                                 <w:rFonts w:ascii="Cascadia Mono" w:hAnsi="Cascadia Mono"/>
@@ -5149,7 +4356,6 @@
                               </w:rPr>
                               <w:t>Musterfrau</w:t>
                             </w:r>
-                            <w:proofErr w:type="spellEnd"/>
                             <w:r>
                               <w:rPr>
                                 <w:rFonts w:ascii="Cascadia Mono" w:hAnsi="Cascadia Mono"/>
@@ -5201,7 +4407,6 @@
                           <w:lang w:val="en-US"/>
                         </w:rPr>
                       </w:pPr>
-                      <w:proofErr w:type="spellStart"/>
                       <w:r>
                         <w:rPr>
                           <w:rFonts w:ascii="Cascadia Mono" w:hAnsi="Cascadia Mono"/>
@@ -5209,29 +4414,8 @@
                           <w:szCs w:val="20"/>
                           <w:lang w:val="en-US"/>
                         </w:rPr>
-                        <w:t>Nachname</w:t>
+                        <w:t>Nachname; Vorname</w:t>
                       </w:r>
-                      <w:proofErr w:type="spellEnd"/>
-                      <w:r>
-                        <w:rPr>
-                          <w:rFonts w:ascii="Cascadia Mono" w:hAnsi="Cascadia Mono"/>
-                          <w:sz w:val="20"/>
-                          <w:szCs w:val="20"/>
-                          <w:lang w:val="en-US"/>
-                        </w:rPr>
-                        <w:t xml:space="preserve">; </w:t>
-                      </w:r>
-                      <w:proofErr w:type="spellStart"/>
-                      <w:r>
-                        <w:rPr>
-                          <w:rFonts w:ascii="Cascadia Mono" w:hAnsi="Cascadia Mono"/>
-                          <w:sz w:val="20"/>
-                          <w:szCs w:val="20"/>
-                          <w:lang w:val="en-US"/>
-                        </w:rPr>
-                        <w:t>Vorname</w:t>
-                      </w:r>
-                      <w:proofErr w:type="spellEnd"/>
                     </w:p>
                     <w:p>
                       <w:pPr>
@@ -5281,7 +4465,6 @@
                           <w:lang w:val="en-US"/>
                         </w:rPr>
                       </w:pPr>
-                      <w:proofErr w:type="spellStart"/>
                       <w:r>
                         <w:rPr>
                           <w:rFonts w:ascii="Cascadia Mono" w:hAnsi="Cascadia Mono"/>
@@ -5291,7 +4474,6 @@
                         </w:rPr>
                         <w:t>Musterfrau</w:t>
                       </w:r>
-                      <w:proofErr w:type="spellEnd"/>
                       <w:r>
                         <w:rPr>
                           <w:rFonts w:ascii="Cascadia Mono" w:hAnsi="Cascadia Mono"/>
@@ -5356,7 +4538,6 @@
         <w:rPr>
           <w:noProof/>
         </w:rPr>
-        <w:lastRenderedPageBreak/>
         <w:drawing>
           <wp:anchor distT="0" distB="0" distL="114300" distR="114300" simplePos="0" relativeHeight="251666432" behindDoc="0" locked="0" layoutInCell="1" allowOverlap="1" wp14:anchorId="37306403" wp14:editId="339EEE27">
             <wp:simplePos x="0" y="0"/>
@@ -5383,7 +4564,7 @@
                     </pic:cNvPicPr>
                   </pic:nvPicPr>
                   <pic:blipFill>
-                    <a:blip r:embed="rId16">
+                    <a:blip r:embed="rId17">
                       <a:extLst>
                         <a:ext uri="{28A0092B-C50C-407E-A947-70E740481C1C}">
                           <a14:useLocalDpi xmlns:a14="http://schemas.microsoft.com/office/drawing/2010/main" val="0"/>
@@ -5460,13 +4641,109 @@
           <w:noProof/>
         </w:rPr>
         <w:drawing>
-          <wp:anchor distT="0" distB="0" distL="114300" distR="114300" simplePos="0" relativeHeight="251667456" behindDoc="0" locked="0" layoutInCell="1" allowOverlap="1" wp14:anchorId="0FE00164" wp14:editId="766F0270">
+          <wp:anchor distT="0" distB="0" distL="114300" distR="114300" simplePos="0" relativeHeight="251682816" behindDoc="0" locked="0" layoutInCell="1" allowOverlap="1" wp14:anchorId="4AE610B7" wp14:editId="3B6D8154">
+            <wp:simplePos x="0" y="0"/>
+            <wp:positionH relativeFrom="column">
+              <wp:posOffset>1176655</wp:posOffset>
+            </wp:positionH>
+            <wp:positionV relativeFrom="paragraph">
+              <wp:posOffset>236855</wp:posOffset>
+            </wp:positionV>
+            <wp:extent cx="2657475" cy="2351405"/>
+            <wp:effectExtent l="0" t="0" r="9525" b="0"/>
+            <wp:wrapTopAndBottom/>
+            <wp:docPr id="1575083828" name="Picture 1"/>
+            <wp:cNvGraphicFramePr>
+              <a:graphicFrameLocks xmlns:a="http://schemas.openxmlformats.org/drawingml/2006/main" noChangeAspect="1"/>
+            </wp:cNvGraphicFramePr>
+            <a:graphic xmlns:a="http://schemas.openxmlformats.org/drawingml/2006/main">
+              <a:graphicData uri="http://schemas.openxmlformats.org/drawingml/2006/picture">
+                <pic:pic xmlns:pic="http://schemas.openxmlformats.org/drawingml/2006/picture">
+                  <pic:nvPicPr>
+                    <pic:cNvPr id="1575083828" name=""/>
+                    <pic:cNvPicPr/>
+                  </pic:nvPicPr>
+                  <pic:blipFill>
+                    <a:blip r:embed="rId18">
+                      <a:extLst>
+                        <a:ext uri="{28A0092B-C50C-407E-A947-70E740481C1C}">
+                          <a14:useLocalDpi xmlns:a14="http://schemas.microsoft.com/office/drawing/2010/main" val="0"/>
+                        </a:ext>
+                      </a:extLst>
+                    </a:blip>
+                    <a:stretch>
+                      <a:fillRect/>
+                    </a:stretch>
+                  </pic:blipFill>
+                  <pic:spPr>
+                    <a:xfrm>
+                      <a:off x="0" y="0"/>
+                      <a:ext cx="2657475" cy="2351405"/>
+                    </a:xfrm>
+                    <a:prstGeom prst="rect">
+                      <a:avLst/>
+                    </a:prstGeom>
+                  </pic:spPr>
+                </pic:pic>
+              </a:graphicData>
+            </a:graphic>
+            <wp14:sizeRelH relativeFrom="margin">
+              <wp14:pctWidth>0</wp14:pctWidth>
+            </wp14:sizeRelH>
+            <wp14:sizeRelV relativeFrom="margin">
+              <wp14:pctHeight>0</wp14:pctHeight>
+            </wp14:sizeRelV>
+          </wp:anchor>
+        </w:drawing>
+      </w:r>
+      <w:r>
+        <w:rPr>
+          <w:b/>
+          <w:bCs/>
+        </w:rPr>
+        <w:t>Fehlende Teilnehmer:</w:t>
+      </w:r>
+      <w:r>
+        <w:t xml:space="preserve"> Zeigt eine Liste der Personen ohne Präferenzen.</w:t>
+      </w:r>
+      <w:r>
+        <w:rPr>
+          <w:noProof/>
+        </w:rPr>
+        <w:t xml:space="preserve"> </w:t>
+      </w:r>
+      <w:r>
+        <w:rPr>
+          <w:noProof/>
+        </w:rPr>
+        <w:t xml:space="preserve"> </w:t>
+      </w:r>
+    </w:p>
+    <w:p>
+      <w:pPr>
+        <w:rPr>
+          <w:noProof/>
+        </w:rPr>
+      </w:pPr>
+    </w:p>
+    <w:p>
+      <w:pPr>
+        <w:rPr>
+          <w:noProof/>
+        </w:rPr>
+      </w:pPr>
+      <w:r>
+        <w:rPr>
+          <w:noProof/>
+        </w:rPr>
+        <w:drawing>
+          <wp:anchor distT="0" distB="0" distL="114300" distR="114300" simplePos="0" relativeHeight="251667456" behindDoc="0" locked="0" layoutInCell="1" allowOverlap="1" wp14:anchorId="0FE00164" wp14:editId="2EF29ED9">
             <wp:simplePos x="0" y="0"/>
             <wp:positionH relativeFrom="margin">
               <wp:posOffset>728980</wp:posOffset>
             </wp:positionH>
             <wp:positionV relativeFrom="paragraph">
-              <wp:posOffset>1789430</wp:posOffset>
+              <wp:posOffset>194945</wp:posOffset>
             </wp:positionV>
             <wp:extent cx="3810000" cy="1960880"/>
             <wp:effectExtent l="0" t="0" r="0" b="1270"/>
@@ -5485,7 +4762,7 @@
                     </pic:cNvPicPr>
                   </pic:nvPicPr>
                   <pic:blipFill>
-                    <a:blip r:embed="rId17">
+                    <a:blip r:embed="rId19">
                       <a:extLst>
                         <a:ext uri="{28A0092B-C50C-407E-A947-70E740481C1C}">
                           <a14:useLocalDpi xmlns:a14="http://schemas.microsoft.com/office/drawing/2010/main" val="0"/>
@@ -5524,144 +4801,52 @@
       </w:r>
       <w:r>
         <w:rPr>
+          <w:b/>
+          <w:bCs/>
+        </w:rPr>
+        <w:t>QR Code:</w:t>
+      </w:r>
+      <w:r>
+        <w:t xml:space="preserve"> Öffnet einen Dialog mit einem QR-Code zum einfachen Zugriff.</w:t>
+      </w:r>
+      <w:r>
+        <w:rPr>
           <w:noProof/>
         </w:rPr>
+        <w:t xml:space="preserve"> </w:t>
+      </w:r>
+    </w:p>
+    <w:p>
+      <w:pPr>
+        <w:rPr>
+          <w:noProof/>
+        </w:rPr>
+      </w:pPr>
+      <w:r>
+        <w:rPr>
+          <w:noProof/>
+        </w:rPr>
+        <w:lastRenderedPageBreak/>
+        <w:t>Falls hierbei ein Fehler auftritt, sollte dieser Angezeigt werden. ACHTUNG: Trennt man die Verbindung des Computers zum Netzwerk, kann sich die IP-Adresse des Computers ändern, das bedeutet, dass ein älterer QR-Code für „Android/ Andere“ nicht mehr funktioniert.</w:t>
+      </w:r>
+    </w:p>
+    <w:p>
+      <w:pPr>
+        <w:pStyle w:val="Heading1"/>
+      </w:pPr>
+      <w:bookmarkStart w:id="5" w:name="_Toc211336774"/>
+      <w:r>
+        <w:rPr>
+          <w:noProof/>
+        </w:rPr>
         <w:drawing>
-          <wp:anchor distT="0" distB="0" distL="114300" distR="114300" simplePos="0" relativeHeight="251668480" behindDoc="0" locked="0" layoutInCell="1" allowOverlap="1" wp14:anchorId="41EDF20A" wp14:editId="6E933F50">
+          <wp:anchor distT="0" distB="0" distL="114300" distR="114300" simplePos="0" relativeHeight="251670528" behindDoc="0" locked="0" layoutInCell="1" allowOverlap="1" wp14:anchorId="2938A9DD" wp14:editId="55FCB97C">
             <wp:simplePos x="0" y="0"/>
             <wp:positionH relativeFrom="margin">
-              <wp:posOffset>1102995</wp:posOffset>
+              <wp:posOffset>4483100</wp:posOffset>
             </wp:positionH>
             <wp:positionV relativeFrom="paragraph">
-              <wp:posOffset>433705</wp:posOffset>
-            </wp:positionV>
-            <wp:extent cx="2952750" cy="1174115"/>
-            <wp:effectExtent l="0" t="0" r="0" b="6985"/>
-            <wp:wrapTopAndBottom/>
-            <wp:docPr id="1755392861" name="Picture 9" descr="A close-up of a person's face&#10;&#10;AI-generated content may be incorrect."/>
-            <wp:cNvGraphicFramePr>
-              <a:graphicFrameLocks xmlns:a="http://schemas.openxmlformats.org/drawingml/2006/main" noChangeAspect="1"/>
-            </wp:cNvGraphicFramePr>
-            <a:graphic xmlns:a="http://schemas.openxmlformats.org/drawingml/2006/main">
-              <a:graphicData uri="http://schemas.openxmlformats.org/drawingml/2006/picture">
-                <pic:pic xmlns:pic="http://schemas.openxmlformats.org/drawingml/2006/picture">
-                  <pic:nvPicPr>
-                    <pic:cNvPr id="1755392861" name="Picture 9" descr="A close-up of a person's face&#10;&#10;AI-generated content may be incorrect."/>
-                    <pic:cNvPicPr>
-                      <a:picLocks noChangeAspect="1" noChangeArrowheads="1"/>
-                    </pic:cNvPicPr>
-                  </pic:nvPicPr>
-                  <pic:blipFill>
-                    <a:blip r:embed="rId18">
-                      <a:extLst>
-                        <a:ext uri="{28A0092B-C50C-407E-A947-70E740481C1C}">
-                          <a14:useLocalDpi xmlns:a14="http://schemas.microsoft.com/office/drawing/2010/main" val="0"/>
-                        </a:ext>
-                      </a:extLst>
-                    </a:blip>
-                    <a:srcRect/>
-                    <a:stretch>
-                      <a:fillRect/>
-                    </a:stretch>
-                  </pic:blipFill>
-                  <pic:spPr bwMode="auto">
-                    <a:xfrm>
-                      <a:off x="0" y="0"/>
-                      <a:ext cx="2952750" cy="1174115"/>
-                    </a:xfrm>
-                    <a:prstGeom prst="rect">
-                      <a:avLst/>
-                    </a:prstGeom>
-                    <a:noFill/>
-                    <a:ln>
-                      <a:noFill/>
-                    </a:ln>
-                  </pic:spPr>
-                </pic:pic>
-              </a:graphicData>
-            </a:graphic>
-          </wp:anchor>
-        </w:drawing>
-      </w:r>
-      <w:r>
-        <w:rPr>
-          <w:b/>
-          <w:bCs/>
-        </w:rPr>
-        <w:t>Fehlende Teilnehmer:</w:t>
-      </w:r>
-      <w:r>
-        <w:t xml:space="preserve"> Zeigt eine Liste der Personen ohne Präferenzen.</w:t>
-      </w:r>
-      <w:r>
-        <w:rPr>
-          <w:noProof/>
-        </w:rPr>
-        <w:t xml:space="preserve"> </w:t>
-      </w:r>
-    </w:p>
-    <w:p>
-      <w:pPr>
-        <w:rPr>
-          <w:noProof/>
-        </w:rPr>
-      </w:pPr>
-      <w:proofErr w:type="gramStart"/>
-      <w:r>
-        <w:rPr>
-          <w:b/>
-          <w:bCs/>
-        </w:rPr>
-        <w:t>QR Code</w:t>
-      </w:r>
-      <w:proofErr w:type="gramEnd"/>
-      <w:r>
-        <w:rPr>
-          <w:b/>
-          <w:bCs/>
-        </w:rPr>
-        <w:t>:</w:t>
-      </w:r>
-      <w:r>
-        <w:t xml:space="preserve"> Öffnet einen Dialog mit einem QR-Code zum einfachen Zugriff.</w:t>
-      </w:r>
-      <w:r>
-        <w:rPr>
-          <w:noProof/>
-        </w:rPr>
-        <w:t xml:space="preserve"> </w:t>
-      </w:r>
-    </w:p>
-    <w:p>
-      <w:pPr>
-        <w:rPr>
-          <w:noProof/>
-        </w:rPr>
-      </w:pPr>
-      <w:r>
-        <w:rPr>
-          <w:noProof/>
-        </w:rPr>
-        <w:t>Falls hierbei ein Fehler auftritt, sollte dieser Angezeigt werden. ACHTUNG: Trennt man die Verbindung des Computers zum Netzwerk, kann sich die IP-Adresse des Computers ändern, das bedeutet, dass ein älterer QR-Code für „Android/ Andere“ nicht mehr funktioniert.</w:t>
-      </w:r>
-    </w:p>
-    <w:p>
-      <w:pPr>
-        <w:pStyle w:val="Heading1"/>
-      </w:pPr>
-      <w:bookmarkStart w:id="5" w:name="_Toc211336774"/>
-      <w:r>
-        <w:rPr>
-          <w:noProof/>
-        </w:rPr>
-        <w:drawing>
-          <wp:anchor distT="0" distB="0" distL="114300" distR="114300" simplePos="0" relativeHeight="251670528" behindDoc="0" locked="0" layoutInCell="1" allowOverlap="1" wp14:anchorId="2938A9DD" wp14:editId="1D408933">
-            <wp:simplePos x="0" y="0"/>
-            <wp:positionH relativeFrom="margin">
-              <wp:align>right</wp:align>
-            </wp:positionH>
-            <wp:positionV relativeFrom="paragraph">
-              <wp:posOffset>2123440</wp:posOffset>
+              <wp:posOffset>0</wp:posOffset>
             </wp:positionV>
             <wp:extent cx="1811020" cy="2924175"/>
             <wp:effectExtent l="0" t="0" r="0" b="9525"/>
@@ -5680,7 +4865,7 @@
                     </pic:cNvPicPr>
                   </pic:nvPicPr>
                   <pic:blipFill>
-                    <a:blip r:embed="rId19">
+                    <a:blip r:embed="rId20">
                       <a:extLst>
                         <a:ext uri="{28A0092B-C50C-407E-A947-70E740481C1C}">
                           <a14:useLocalDpi xmlns:a14="http://schemas.microsoft.com/office/drawing/2010/main" val="0"/>
@@ -5799,14 +4984,88 @@
     <w:p>
       <w:r>
         <w:rPr>
-          <w:noProof/>
-        </w:rPr>
-        <w:lastRenderedPageBreak/>
+          <w:b/>
+          <w:bCs/>
+        </w:rPr>
+        <w:t>Berichtserstellung</w:t>
+      </w:r>
+      <w:r>
+        <w:t xml:space="preserve"> Einstellung, ob bestimmte Informationen im erstellten Bericht sichtbar sein sollen.</w:t>
+      </w:r>
+    </w:p>
+    <w:p>
+      <w:pPr>
+        <w:pStyle w:val="ListParagraph"/>
+        <w:numPr>
+          <w:ilvl w:val="0"/>
+          <w:numId w:val="13"/>
+        </w:numPr>
+      </w:pPr>
+      <w:r>
+        <w:t>Teilnehmerzahl/ maximale Teilnehmer anzeigen (zB 8/10)</w:t>
+      </w:r>
+    </w:p>
+    <w:p>
+      <w:pPr>
+        <w:pStyle w:val="ListParagraph"/>
+        <w:numPr>
+          <w:ilvl w:val="0"/>
+          <w:numId w:val="13"/>
+        </w:numPr>
+      </w:pPr>
+      <w:r>
+        <w:t>Personal anzeigen (Wer für den Workshop zuständig ist)</w:t>
+      </w:r>
+    </w:p>
+    <w:p>
+      <w:pPr>
+        <w:pStyle w:val="ListParagraph"/>
+        <w:numPr>
+          <w:ilvl w:val="0"/>
+          <w:numId w:val="13"/>
+        </w:numPr>
+      </w:pPr>
+      <w:r>
+        <w:t>Raum anzeigen (Wo der Workshop stattfindet)</w:t>
+      </w:r>
+    </w:p>
+    <w:p>
+      <w:pPr>
+        <w:rPr>
+          <w:b/>
+          <w:bCs/>
+        </w:rPr>
+      </w:pPr>
+      <w:r>
+        <w:rPr>
+          <w:b/>
+          <w:bCs/>
+        </w:rPr>
+        <w:t>Netzwerk</w:t>
+      </w:r>
+    </w:p>
+    <w:p>
+      <w:pPr>
+        <w:pStyle w:val="ListParagraph"/>
+        <w:numPr>
+          <w:ilvl w:val="0"/>
+          <w:numId w:val="14"/>
+        </w:numPr>
+      </w:pPr>
+      <w:r>
         <w:drawing>
-          <wp:inline distT="0" distB="0" distL="0" distR="0" wp14:anchorId="54D4297C" wp14:editId="6CE7E10A">
-            <wp:extent cx="3705225" cy="2459976"/>
+          <wp:anchor distT="0" distB="0" distL="114300" distR="114300" simplePos="0" relativeHeight="251681792" behindDoc="0" locked="0" layoutInCell="1" allowOverlap="1" wp14:anchorId="6231B674" wp14:editId="39E6E70A">
+            <wp:simplePos x="0" y="0"/>
+            <wp:positionH relativeFrom="column">
+              <wp:posOffset>2987675</wp:posOffset>
+            </wp:positionH>
+            <wp:positionV relativeFrom="paragraph">
+              <wp:posOffset>13970</wp:posOffset>
+            </wp:positionV>
+            <wp:extent cx="3400425" cy="4692650"/>
             <wp:effectExtent l="0" t="0" r="0" b="0"/>
-            <wp:docPr id="606626900" name="Picture 16"/>
+            <wp:wrapSquare wrapText="bothSides"/>
+            <wp:docPr id="545763583" name="Picture 1"/>
             <wp:cNvGraphicFramePr>
               <a:graphicFrameLocks xmlns:a="http://schemas.openxmlformats.org/drawingml/2006/main" noChangeAspect="1"/>
             </wp:cNvGraphicFramePr>
@@ -5814,44 +5073,71 @@
               <a:graphicData uri="http://schemas.openxmlformats.org/drawingml/2006/picture">
                 <pic:pic xmlns:pic="http://schemas.openxmlformats.org/drawingml/2006/picture">
                   <pic:nvPicPr>
-                    <pic:cNvPr id="0" name="Picture 16"/>
-                    <pic:cNvPicPr>
-                      <a:picLocks noChangeAspect="1" noChangeArrowheads="1"/>
-                    </pic:cNvPicPr>
+                    <pic:cNvPr id="545763583" name=""/>
+                    <pic:cNvPicPr/>
                   </pic:nvPicPr>
                   <pic:blipFill>
-                    <a:blip r:embed="rId20">
+                    <a:blip r:embed="rId21">
                       <a:extLst>
                         <a:ext uri="{28A0092B-C50C-407E-A947-70E740481C1C}">
                           <a14:useLocalDpi xmlns:a14="http://schemas.microsoft.com/office/drawing/2010/main" val="0"/>
                         </a:ext>
                       </a:extLst>
                     </a:blip>
-                    <a:srcRect/>
                     <a:stretch>
                       <a:fillRect/>
                     </a:stretch>
                   </pic:blipFill>
-                  <pic:spPr bwMode="auto">
+                  <pic:spPr>
                     <a:xfrm>
                       <a:off x="0" y="0"/>
-                      <a:ext cx="3721419" cy="2470728"/>
+                      <a:ext cx="3400425" cy="4692650"/>
                     </a:xfrm>
                     <a:prstGeom prst="rect">
                       <a:avLst/>
                     </a:prstGeom>
-                    <a:noFill/>
-                    <a:ln>
-                      <a:noFill/>
-                    </a:ln>
                   </pic:spPr>
                 </pic:pic>
               </a:graphicData>
             </a:graphic>
-          </wp:inline>
+          </wp:anchor>
         </w:drawing>
       </w:r>
-    </w:p>
+      <w:r>
+        <w:t xml:space="preserve">Bonjour/ mDNS aktivieren (sollte immer an bleiben, nur </w:t>
+      </w:r>
+      <w:r>
+        <w:t>deaktivieren,</w:t>
+      </w:r>
+      <w:r>
+        <w:t xml:space="preserve"> wenn es Probleme mit Bonjour oder den .local Adressen gibt)</w:t>
+      </w:r>
+    </w:p>
+    <w:p>
+      <w:pPr>
+        <w:pStyle w:val="ListParagraph"/>
+        <w:numPr>
+          <w:ilvl w:val="0"/>
+          <w:numId w:val="14"/>
+        </w:numPr>
+      </w:pPr>
+      <w:r>
+        <w:t>Port anpassen (Standard 80, sollte immer 80 bleiben, es sei denn der Port wird durch eine andere App blockiert)</w:t>
+      </w:r>
+    </w:p>
+    <w:p/>
+    <w:p/>
+    <w:p/>
+    <w:p/>
+    <w:p/>
+    <w:p/>
+    <w:p/>
+    <w:p/>
+    <w:p/>
+    <w:p/>
+    <w:p/>
+    <w:p/>
+    <w:p/>
     <w:p>
       <w:pPr>
         <w:pStyle w:val="Heading1"/>
@@ -5861,14 +5147,15 @@
         <w:rPr>
           <w:noProof/>
         </w:rPr>
+        <w:lastRenderedPageBreak/>
         <w:drawing>
-          <wp:anchor distT="0" distB="0" distL="114300" distR="114300" simplePos="0" relativeHeight="251669504" behindDoc="0" locked="0" layoutInCell="1" allowOverlap="1" wp14:anchorId="4FD23E29" wp14:editId="0FCD1133">
+          <wp:anchor distT="0" distB="0" distL="114300" distR="114300" simplePos="0" relativeHeight="251669504" behindDoc="0" locked="0" layoutInCell="1" allowOverlap="1" wp14:anchorId="4FD23E29" wp14:editId="6DEE9D20">
             <wp:simplePos x="0" y="0"/>
             <wp:positionH relativeFrom="margin">
-              <wp:align>right</wp:align>
+              <wp:posOffset>2865120</wp:posOffset>
             </wp:positionH>
             <wp:positionV relativeFrom="paragraph">
-              <wp:posOffset>133985</wp:posOffset>
+              <wp:posOffset>38735</wp:posOffset>
             </wp:positionV>
             <wp:extent cx="3019425" cy="1142365"/>
             <wp:effectExtent l="0" t="0" r="9525" b="635"/>
@@ -5887,7 +5174,7 @@
                     </pic:cNvPicPr>
                   </pic:nvPicPr>
                   <pic:blipFill>
-                    <a:blip r:embed="rId21">
+                    <a:blip r:embed="rId22">
                       <a:extLst>
                         <a:ext uri="{28A0092B-C50C-407E-A947-70E740481C1C}">
                           <a14:useLocalDpi xmlns:a14="http://schemas.microsoft.com/office/drawing/2010/main" val="0"/>
@@ -6017,7 +5304,7 @@
                     </pic:cNvPicPr>
                   </pic:nvPicPr>
                   <pic:blipFill>
-                    <a:blip r:embed="rId22">
+                    <a:blip r:embed="rId23">
                       <a:extLst>
                         <a:ext uri="{28A0092B-C50C-407E-A947-70E740481C1C}">
                           <a14:useLocalDpi xmlns:a14="http://schemas.microsoft.com/office/drawing/2010/main" val="0"/>
@@ -6084,7 +5371,7 @@
                     </pic:cNvPicPr>
                   </pic:nvPicPr>
                   <pic:blipFill>
-                    <a:blip r:embed="rId23">
+                    <a:blip r:embed="rId24">
                       <a:extLst>
                         <a:ext uri="{28A0092B-C50C-407E-A947-70E740481C1C}">
                           <a14:useLocalDpi xmlns:a14="http://schemas.microsoft.com/office/drawing/2010/main" val="0"/>
@@ -6185,7 +5472,7 @@
                     </pic:cNvPicPr>
                   </pic:nvPicPr>
                   <pic:blipFill>
-                    <a:blip r:embed="rId24">
+                    <a:blip r:embed="rId25">
                       <a:extLst>
                         <a:ext uri="{28A0092B-C50C-407E-A947-70E740481C1C}">
                           <a14:useLocalDpi xmlns:a14="http://schemas.microsoft.com/office/drawing/2010/main" val="0"/>
@@ -6330,7 +5617,7 @@
                     </pic:cNvPicPr>
                   </pic:nvPicPr>
                   <pic:blipFill>
-                    <a:blip r:embed="rId25">
+                    <a:blip r:embed="rId26">
                       <a:extLst>
                         <a:ext uri="{28A0092B-C50C-407E-A947-70E740481C1C}">
                           <a14:useLocalDpi xmlns:a14="http://schemas.microsoft.com/office/drawing/2010/main" val="0"/>
@@ -6366,23 +5653,28 @@
       <w:pPr>
         <w:pStyle w:val="Heading1"/>
       </w:pPr>
-      <w:bookmarkStart w:id="9" w:name="_Toc211336778"/>
+      <w:bookmarkStart w:id="9" w:name="_Toc211336779"/>
+      <w:r>
+        <w:t>Probleme und Lösungen</w:t>
+      </w:r>
+      <w:bookmarkEnd w:id="9"/>
+    </w:p>
+    <w:p>
       <w:r>
         <w:rPr>
           <w:noProof/>
         </w:rPr>
-        <w:lastRenderedPageBreak/>
         <w:drawing>
-          <wp:anchor distT="0" distB="0" distL="114300" distR="114300" simplePos="0" relativeHeight="251678720" behindDoc="0" locked="0" layoutInCell="1" allowOverlap="1" wp14:anchorId="12DBFA43" wp14:editId="785A540C">
+          <wp:anchor distT="0" distB="0" distL="114300" distR="114300" simplePos="0" relativeHeight="251678720" behindDoc="0" locked="0" layoutInCell="1" allowOverlap="1" wp14:anchorId="12DBFA43" wp14:editId="68E1632A">
             <wp:simplePos x="0" y="0"/>
             <wp:positionH relativeFrom="margin">
-              <wp:align>right</wp:align>
+              <wp:posOffset>4418330</wp:posOffset>
             </wp:positionH>
             <wp:positionV relativeFrom="paragraph">
-              <wp:posOffset>132080</wp:posOffset>
+              <wp:posOffset>208915</wp:posOffset>
             </wp:positionV>
-            <wp:extent cx="1838325" cy="1943100"/>
-            <wp:effectExtent l="0" t="0" r="9525" b="0"/>
+            <wp:extent cx="1567815" cy="1657350"/>
+            <wp:effectExtent l="0" t="0" r="0" b="0"/>
             <wp:wrapSquare wrapText="bothSides"/>
             <wp:docPr id="1127113972" name="Picture 6" descr="A screenshot of a phone&#10;&#10;AI-generated content may be incorrect."/>
             <wp:cNvGraphicFramePr>
@@ -6398,7 +5690,7 @@
                     </pic:cNvPicPr>
                   </pic:nvPicPr>
                   <pic:blipFill>
-                    <a:blip r:embed="rId26">
+                    <a:blip r:embed="rId27">
                       <a:extLst>
                         <a:ext uri="{28A0092B-C50C-407E-A947-70E740481C1C}">
                           <a14:useLocalDpi xmlns:a14="http://schemas.microsoft.com/office/drawing/2010/main" val="0"/>
@@ -6413,7 +5705,7 @@
                   <pic:spPr bwMode="auto">
                     <a:xfrm>
                       <a:off x="0" y="0"/>
-                      <a:ext cx="1838325" cy="1943100"/>
+                      <a:ext cx="1567815" cy="1657350"/>
                     </a:xfrm>
                     <a:prstGeom prst="rect">
                       <a:avLst/>
@@ -6426,71 +5718,115 @@
                 </pic:pic>
               </a:graphicData>
             </a:graphic>
+            <wp14:sizeRelH relativeFrom="margin">
+              <wp14:pctWidth>0</wp14:pctWidth>
+            </wp14:sizeRelH>
+            <wp14:sizeRelV relativeFrom="margin">
+              <wp14:pctHeight>0</wp14:pctHeight>
+            </wp14:sizeRelV>
           </wp:anchor>
         </w:drawing>
       </w:r>
       <w:r>
-        <w:t>Starten auf MacOS</w:t>
-      </w:r>
-      <w:bookmarkEnd w:id="9"/>
-    </w:p>
-    <w:p>
-      <w:pPr>
+        <w:rPr>
+          <w:b/>
+          <w:bCs/>
+        </w:rPr>
+        <w:t>Problem:</w:t>
+      </w:r>
+      <w:r>
+        <w:t xml:space="preserve"> Teilnehmer kann die Seite nicht am Handy öffnen.</w:t>
+      </w:r>
+    </w:p>
+    <w:p>
+      <w:pPr>
+        <w:rPr>
+          <w:b/>
+          <w:bCs/>
+        </w:rPr>
+      </w:pPr>
+      <w:r>
+        <w:rPr>
+          <w:b/>
+          <w:bCs/>
+        </w:rPr>
+        <w:t>Lösung:</w:t>
+      </w:r>
+    </w:p>
+    <w:p>
+      <w:pPr>
+        <w:pStyle w:val="ListParagraph"/>
+        <w:numPr>
+          <w:ilvl w:val="0"/>
+          <w:numId w:val="9"/>
+        </w:numPr>
+      </w:pPr>
+      <w:r>
+        <w:t xml:space="preserve">Handy eines anderen Teilnehmers nutzen </w:t>
+      </w:r>
+      <w:r>
+        <w:rPr>
+          <w:b/>
+          <w:bCs/>
+        </w:rPr>
+        <w:t>oder</w:t>
+      </w:r>
+    </w:p>
+    <w:p>
+      <w:pPr>
+        <w:pStyle w:val="ListParagraph"/>
+        <w:numPr>
+          <w:ilvl w:val="0"/>
+          <w:numId w:val="9"/>
+        </w:numPr>
+      </w:pPr>
+      <w:r>
+        <w:t>Wünsche direkt am Laptop eintragen, auf dem das Programm läuft.</w:t>
+      </w:r>
+    </w:p>
+    <w:p>
+      <w:r>
+        <w:rPr>
+          <w:b/>
+          <w:bCs/>
+        </w:rPr>
+        <w:t>Problem:</w:t>
+      </w:r>
+      <w:r>
+        <w:t xml:space="preserve"> </w:t>
+      </w:r>
+      <w:r>
+        <w:t>MacOS App ist beschädigt</w:t>
+      </w:r>
+    </w:p>
+    <w:p>
+      <w:pPr>
+        <w:rPr>
+          <w:b/>
+          <w:bCs/>
+        </w:rPr>
+      </w:pPr>
+      <w:r>
+        <w:rPr>
+          <w:b/>
+          <w:bCs/>
+        </w:rPr>
+        <w:t>Lösung:</w:t>
+      </w:r>
+    </w:p>
+    <w:p>
+      <w:r>
+        <w:t>Die .app auf den Desktop legen.</w:t>
+      </w:r>
+    </w:p>
+    <w:p>
+      <w:r>
         <w:rPr>
           <w:noProof/>
         </w:rPr>
-      </w:pPr>
-      <w:r>
-        <w:t>Herunterladen der App und entpacken (Doppelklick auf die .</w:t>
-      </w:r>
-      <w:proofErr w:type="spellStart"/>
-      <w:r>
-        <w:t>zip</w:t>
-      </w:r>
-      <w:proofErr w:type="spellEnd"/>
-      <w:r>
-        <w:t>).</w:t>
-      </w:r>
-      <w:r>
-        <w:rPr>
-          <w:noProof/>
-        </w:rPr>
-        <w:t xml:space="preserve"> </w:t>
-      </w:r>
-    </w:p>
-    <w:p>
-      <w:pPr>
-        <w:rPr>
-          <w:noProof/>
-        </w:rPr>
-      </w:pPr>
-      <w:r>
-        <w:rPr>
-          <w:noProof/>
-        </w:rPr>
-        <w:t>Öffnen der App per Doppelklick. Wird die Meldung rechts angezeigt, folgende Schritte durchführen:</w:t>
-      </w:r>
-    </w:p>
-    <w:p>
-      <w:r>
-        <w:t>Die .</w:t>
-      </w:r>
-      <w:proofErr w:type="spellStart"/>
-      <w:r>
-        <w:t>app</w:t>
-      </w:r>
-      <w:proofErr w:type="spellEnd"/>
-      <w:r>
-        <w:t xml:space="preserve"> auf den Desktop legen.</w:t>
-      </w:r>
-    </w:p>
-    <w:p>
-      <w:r>
-        <w:rPr>
-          <w:noProof/>
-        </w:rPr>
+        <w:lastRenderedPageBreak/>
         <w:drawing>
-          <wp:anchor distT="0" distB="0" distL="114300" distR="114300" simplePos="0" relativeHeight="251677696" behindDoc="0" locked="0" layoutInCell="1" allowOverlap="1" wp14:anchorId="32B3D011" wp14:editId="620D268D">
+          <wp:anchor distT="0" distB="0" distL="114300" distR="114300" simplePos="0" relativeHeight="251686912" behindDoc="0" locked="0" layoutInCell="1" allowOverlap="1" wp14:anchorId="530888C4" wp14:editId="7EEE9B3C">
             <wp:simplePos x="0" y="0"/>
             <wp:positionH relativeFrom="margin">
               <wp:align>left</wp:align>
@@ -6515,7 +5851,7 @@
                     </pic:cNvPicPr>
                   </pic:nvPicPr>
                   <pic:blipFill>
-                    <a:blip r:embed="rId27">
+                    <a:blip r:embed="rId28">
                       <a:extLst>
                         <a:ext uri="{28A0092B-C50C-407E-A947-70E740481C1C}">
                           <a14:useLocalDpi xmlns:a14="http://schemas.microsoft.com/office/drawing/2010/main" val="0"/>
@@ -6544,15 +5880,7 @@
         </w:drawing>
       </w:r>
       <w:r>
-        <w:t>Öffnen Sie die Spotlight-Suche über die Tastenkombination [</w:t>
-      </w:r>
-      <w:proofErr w:type="spellStart"/>
-      <w:r>
-        <w:t>cmd</w:t>
-      </w:r>
-      <w:proofErr w:type="spellEnd"/>
-      <w:r>
-        <w:t>] + [Leertaste] oder über die kleine Lupe oben rechts in der Menüleiste. Geben Sie anschließend "Terminal" in das Suchfeld ein und öffnen Sie das entsprechende Ergebnis mit einem Doppelklick.</w:t>
+        <w:t>Öffnen Sie die Spotlight-Suche über die Tastenkombination [cmd] + [Leertaste] oder über die kleine Lupe oben rechts in der Menüleiste. Geben Sie anschließend "Terminal" in das Suchfeld ein und öffnen Sie das entsprechende Ergebnis mit einem Doppelklick.</w:t>
       </w:r>
     </w:p>
     <w:p>
@@ -6563,7 +5891,7 @@
         <mc:AlternateContent>
           <mc:Choice Requires="wps">
             <w:drawing>
-              <wp:anchor distT="45720" distB="45720" distL="114300" distR="114300" simplePos="0" relativeHeight="251680768" behindDoc="0" locked="0" layoutInCell="1" allowOverlap="1" wp14:anchorId="42931DFB" wp14:editId="6F5AE613">
+              <wp:anchor distT="45720" distB="45720" distL="114300" distR="114300" simplePos="0" relativeHeight="251687936" behindDoc="0" locked="0" layoutInCell="1" allowOverlap="1" wp14:anchorId="3565E41D" wp14:editId="20ED0F85">
                 <wp:simplePos x="0" y="0"/>
                 <wp:positionH relativeFrom="margin">
                   <wp:align>left</wp:align>
@@ -6616,7 +5944,6 @@
                                 <w:lang w:val="en-US"/>
                               </w:rPr>
                             </w:pPr>
-                            <w:proofErr w:type="spellStart"/>
                             <w:r>
                               <w:rPr>
                                 <w:rFonts w:ascii="Cascadia Mono" w:hAnsi="Cascadia Mono"/>
@@ -6624,48 +5951,7 @@
                                 <w:szCs w:val="20"/>
                                 <w:lang w:val="en-US"/>
                               </w:rPr>
-                              <w:t>xattr</w:t>
-                            </w:r>
-                            <w:proofErr w:type="spellEnd"/>
-                            <w:r>
-                              <w:rPr>
-                                <w:rFonts w:ascii="Cascadia Mono" w:hAnsi="Cascadia Mono"/>
-                                <w:sz w:val="20"/>
-                                <w:szCs w:val="20"/>
-                                <w:lang w:val="en-US"/>
-                              </w:rPr>
-                              <w:t xml:space="preserve"> -d </w:t>
-                            </w:r>
-                            <w:proofErr w:type="spellStart"/>
-                            <w:proofErr w:type="gramStart"/>
-                            <w:r>
-                              <w:rPr>
-                                <w:rFonts w:ascii="Cascadia Mono" w:hAnsi="Cascadia Mono"/>
-                                <w:sz w:val="20"/>
-                                <w:szCs w:val="20"/>
-                                <w:lang w:val="en-US"/>
-                              </w:rPr>
-                              <w:t>com.apple</w:t>
-                            </w:r>
-                            <w:proofErr w:type="gramEnd"/>
-                            <w:r>
-                              <w:rPr>
-                                <w:rFonts w:ascii="Cascadia Mono" w:hAnsi="Cascadia Mono"/>
-                                <w:sz w:val="20"/>
-                                <w:szCs w:val="20"/>
-                                <w:lang w:val="en-US"/>
-                              </w:rPr>
-                              <w:t>.quarantine</w:t>
-                            </w:r>
-                            <w:proofErr w:type="spellEnd"/>
-                            <w:r>
-                              <w:rPr>
-                                <w:rFonts w:ascii="Cascadia Mono" w:hAnsi="Cascadia Mono"/>
-                                <w:sz w:val="20"/>
-                                <w:szCs w:val="20"/>
-                                <w:lang w:val="en-US"/>
-                              </w:rPr>
-                              <w:t xml:space="preserve"> Desktop</w:t>
+                              <w:t>xattr -d com.apple.quarantine</w:t>
                             </w:r>
                             <w:r>
                               <w:rPr>
@@ -6674,28 +5960,8 @@
                                 <w:szCs w:val="20"/>
                                 <w:lang w:val="en-US"/>
                               </w:rPr>
-                              <w:t>/</w:t>
+                              <w:t xml:space="preserve"> Desktop/Semera\ Workshops.app</w:t>
                             </w:r>
-                            <w:r>
-                              <w:rPr>
-                                <w:rFonts w:ascii="Cascadia Mono" w:hAnsi="Cascadia Mono"/>
-                                <w:sz w:val="20"/>
-                                <w:szCs w:val="20"/>
-                                <w:lang w:val="en-US"/>
-                              </w:rPr>
-                              <w:t xml:space="preserve">Semera\ </w:t>
-                            </w:r>
-                            <w:proofErr w:type="spellStart"/>
-                            <w:r>
-                              <w:rPr>
-                                <w:rFonts w:ascii="Cascadia Mono" w:hAnsi="Cascadia Mono"/>
-                                <w:sz w:val="20"/>
-                                <w:szCs w:val="20"/>
-                                <w:lang w:val="en-US"/>
-                              </w:rPr>
-                              <w:t>Workshops.app</w:t>
-                            </w:r>
-                            <w:proofErr w:type="spellEnd"/>
                           </w:p>
                         </w:txbxContent>
                       </wps:txbx>
@@ -6716,11 +5982,7 @@
           </mc:Choice>
           <mc:Fallback>
             <w:pict>
-              <v:shapetype w14:anchorId="42931DFB" id="_x0000_t202" coordsize="21600,21600" o:spt="202" path="m,l,21600r21600,l21600,xe">
-                <v:stroke joinstyle="miter"/>
-                <v:path gradientshapeok="t" o:connecttype="rect"/>
-              </v:shapetype>
-              <v:shape id="_x0000_s1030" type="#_x0000_t202" style="position:absolute;margin-left:0;margin-top:268.8pt;width:372.75pt;height:110.6pt;z-index:251680768;visibility:visible;mso-wrap-style:square;mso-width-percent:0;mso-height-percent:200;mso-wrap-distance-left:9pt;mso-wrap-distance-top:3.6pt;mso-wrap-distance-right:9pt;mso-wrap-distance-bottom:3.6pt;mso-position-horizontal:left;mso-position-horizontal-relative:margin;mso-position-vertical:absolute;mso-position-vertical-relative:text;mso-width-percent:0;mso-height-percent:200;mso-width-relative:margin;mso-height-relative:margin;v-text-anchor:top" o:gfxdata="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">
+              <v:shape w14:anchorId="3565E41D" id="_x0000_s1030" type="#_x0000_t202" style="position:absolute;margin-left:0;margin-top:268.8pt;width:372.75pt;height:110.6pt;z-index:251687936;visibility:visible;mso-wrap-style:square;mso-width-percent:0;mso-height-percent:200;mso-wrap-distance-left:9pt;mso-wrap-distance-top:3.6pt;mso-wrap-distance-right:9pt;mso-wrap-distance-bottom:3.6pt;mso-position-horizontal:left;mso-position-horizontal-relative:margin;mso-position-vertical:absolute;mso-position-vertical-relative:text;mso-width-percent:0;mso-height-percent:200;mso-width-relative:margin;mso-height-relative:margin;v-text-anchor:top" o:gfxdata="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">
                 <v:textbox style="mso-fit-shape-to-text:t">
                   <w:txbxContent>
                     <w:p>
@@ -6733,7 +5995,6 @@
                           <w:lang w:val="en-US"/>
                         </w:rPr>
                       </w:pPr>
-                      <w:proofErr w:type="spellStart"/>
                       <w:r>
                         <w:rPr>
                           <w:rFonts w:ascii="Cascadia Mono" w:hAnsi="Cascadia Mono"/>
@@ -6741,48 +6002,7 @@
                           <w:szCs w:val="20"/>
                           <w:lang w:val="en-US"/>
                         </w:rPr>
-                        <w:t>xattr</w:t>
-                      </w:r>
-                      <w:proofErr w:type="spellEnd"/>
-                      <w:r>
-                        <w:rPr>
-                          <w:rFonts w:ascii="Cascadia Mono" w:hAnsi="Cascadia Mono"/>
-                          <w:sz w:val="20"/>
-                          <w:szCs w:val="20"/>
-                          <w:lang w:val="en-US"/>
-                        </w:rPr>
-                        <w:t xml:space="preserve"> -d </w:t>
-                      </w:r>
-                      <w:proofErr w:type="spellStart"/>
-                      <w:proofErr w:type="gramStart"/>
-                      <w:r>
-                        <w:rPr>
-                          <w:rFonts w:ascii="Cascadia Mono" w:hAnsi="Cascadia Mono"/>
-                          <w:sz w:val="20"/>
-                          <w:szCs w:val="20"/>
-                          <w:lang w:val="en-US"/>
-                        </w:rPr>
-                        <w:t>com.apple</w:t>
-                      </w:r>
-                      <w:proofErr w:type="gramEnd"/>
-                      <w:r>
-                        <w:rPr>
-                          <w:rFonts w:ascii="Cascadia Mono" w:hAnsi="Cascadia Mono"/>
-                          <w:sz w:val="20"/>
-                          <w:szCs w:val="20"/>
-                          <w:lang w:val="en-US"/>
-                        </w:rPr>
-                        <w:t>.quarantine</w:t>
-                      </w:r>
-                      <w:proofErr w:type="spellEnd"/>
-                      <w:r>
-                        <w:rPr>
-                          <w:rFonts w:ascii="Cascadia Mono" w:hAnsi="Cascadia Mono"/>
-                          <w:sz w:val="20"/>
-                          <w:szCs w:val="20"/>
-                          <w:lang w:val="en-US"/>
-                        </w:rPr>
-                        <w:t xml:space="preserve"> Desktop</w:t>
+                        <w:t>xattr -d com.apple.quarantine</w:t>
                       </w:r>
                       <w:r>
                         <w:rPr>
@@ -6791,28 +6011,8 @@
                           <w:szCs w:val="20"/>
                           <w:lang w:val="en-US"/>
                         </w:rPr>
-                        <w:t>/</w:t>
+                        <w:t xml:space="preserve"> Desktop/Semera\ Workshops.app</w:t>
                       </w:r>
-                      <w:r>
-                        <w:rPr>
-                          <w:rFonts w:ascii="Cascadia Mono" w:hAnsi="Cascadia Mono"/>
-                          <w:sz w:val="20"/>
-                          <w:szCs w:val="20"/>
-                          <w:lang w:val="en-US"/>
-                        </w:rPr>
-                        <w:t xml:space="preserve">Semera\ </w:t>
-                      </w:r>
-                      <w:proofErr w:type="spellStart"/>
-                      <w:r>
-                        <w:rPr>
-                          <w:rFonts w:ascii="Cascadia Mono" w:hAnsi="Cascadia Mono"/>
-                          <w:sz w:val="20"/>
-                          <w:szCs w:val="20"/>
-                          <w:lang w:val="en-US"/>
-                        </w:rPr>
-                        <w:t>Workshops.app</w:t>
-                      </w:r>
-                      <w:proofErr w:type="spellEnd"/>
                     </w:p>
                   </w:txbxContent>
                 </v:textbox>
@@ -6835,99 +6035,29 @@
       <w:pPr>
         <w:pStyle w:val="Heading1"/>
       </w:pPr>
-      <w:bookmarkStart w:id="10" w:name="_Toc211336779"/>
-      <w:r>
-        <w:t>Probleme und Lösungen</w:t>
+      <w:bookmarkStart w:id="10" w:name="_Toc211336780"/>
+      <w:r>
+        <w:t>Manuelles Updaten ohne Datenverlust</w:t>
       </w:r>
       <w:bookmarkEnd w:id="10"/>
     </w:p>
     <w:p>
       <w:r>
-        <w:rPr>
-          <w:b/>
-          <w:bCs/>
-        </w:rPr>
-        <w:t>Problem:</w:t>
-      </w:r>
-      <w:r>
-        <w:t xml:space="preserve"> Teilnehmer kann die Seite nicht am Handy öffnen.</w:t>
-      </w:r>
-    </w:p>
-    <w:p>
-      <w:pPr>
-        <w:rPr>
-          <w:b/>
-          <w:bCs/>
-        </w:rPr>
-      </w:pPr>
-      <w:r>
-        <w:rPr>
-          <w:b/>
-          <w:bCs/>
-        </w:rPr>
-        <w:t>Lösung:</w:t>
-      </w:r>
-    </w:p>
-    <w:p>
-      <w:pPr>
-        <w:pStyle w:val="ListParagraph"/>
-        <w:numPr>
-          <w:ilvl w:val="0"/>
-          <w:numId w:val="9"/>
-        </w:numPr>
-      </w:pPr>
-      <w:r>
-        <w:t xml:space="preserve">Handy eines anderen Teilnehmers nutzen </w:t>
-      </w:r>
-      <w:r>
-        <w:rPr>
-          <w:b/>
-          <w:bCs/>
-        </w:rPr>
-        <w:t>oder</w:t>
-      </w:r>
-    </w:p>
-    <w:p>
-      <w:pPr>
-        <w:pStyle w:val="ListParagraph"/>
-        <w:numPr>
-          <w:ilvl w:val="0"/>
-          <w:numId w:val="9"/>
-        </w:numPr>
-      </w:pPr>
-      <w:r>
-        <w:t>Wünsche direkt am Laptop eintragen, auf dem das Programm läuft.</w:t>
-      </w:r>
-    </w:p>
-    <w:p>
-      <w:pPr>
-        <w:pStyle w:val="Heading1"/>
-      </w:pPr>
-      <w:bookmarkStart w:id="11" w:name="_Toc211336780"/>
-      <w:r>
-        <w:t>Manuelles Updaten ohne Datenverlust</w:t>
-      </w:r>
-      <w:bookmarkEnd w:id="11"/>
-    </w:p>
-    <w:p>
-      <w:r>
         <w:t xml:space="preserve">Neue Version entpacken und die Datei </w:t>
       </w:r>
-      <w:proofErr w:type="spellStart"/>
       <w:r>
         <w:rPr>
           <w:rFonts w:ascii="Cascadia Mono" w:hAnsi="Cascadia Mono" w:cs="Cascadia Mono"/>
         </w:rPr>
         <w:t>workshop.sqlite</w:t>
       </w:r>
-      <w:proofErr w:type="spellEnd"/>
       <w:r>
         <w:t xml:space="preserve"> in den Ordner der neuen Version kopieren, so werden alle Daten wieder geladen.</w:t>
       </w:r>
     </w:p>
     <w:sectPr>
-      <w:headerReference w:type="default" r:id="rId28"/>
-      <w:footerReference w:type="default" r:id="rId29"/>
+      <w:headerReference w:type="default" r:id="rId29"/>
+      <w:footerReference w:type="default" r:id="rId30"/>
       <w:pgSz w:w="11906" w:h="16838"/>
       <w:pgMar w:top="1417" w:right="1417" w:bottom="1134" w:left="1417" w:header="708" w:footer="708" w:gutter="0"/>
       <w:cols w:space="708"/>
@@ -7039,28 +6169,19 @@
         <w:lang w:val="en-US"/>
       </w:rPr>
     </w:pPr>
-    <w:proofErr w:type="spellStart"/>
     <w:r>
       <w:rPr>
         <w:u w:val="single"/>
         <w:lang w:val="en-US"/>
       </w:rPr>
-      <w:t>Handbuch</w:t>
+      <w:t>Handbuch Semera Workshops – V1.</w:t>
     </w:r>
-    <w:proofErr w:type="spellEnd"/>
     <w:r>
       <w:rPr>
         <w:u w:val="single"/>
         <w:lang w:val="en-US"/>
       </w:rPr>
-      <w:t xml:space="preserve"> Semera Workshops – V1.</w:t>
-    </w:r>
-    <w:r>
-      <w:rPr>
-        <w:u w:val="single"/>
-        <w:lang w:val="en-US"/>
-      </w:rPr>
-      <w:t>1</w:t>
+      <w:t>3</w:t>
     </w:r>
     <w:r>
       <w:rPr>
@@ -7108,7 +6229,7 @@
         <w:noProof/>
         <w:u w:val="single"/>
       </w:rPr>
-      <w:t>13.03.2026</w:t>
+      <w:t>11.09.2026</w:t>
     </w:r>
     <w:r>
       <w:rPr>
@@ -7773,6 +6894,119 @@
     </w:lvl>
   </w:abstractNum>
   <w:abstractNum w:abstractNumId="6" w15:restartNumberingAfterBreak="0">
+    <w:nsid w:val="2EC8648F"/>
+    <w:multiLevelType w:val="hybridMultilevel"/>
+    <w:tmpl w:val="02CCBA78"/>
+    <w:lvl w:ilvl="0" w:tplc="04070001">
+      <w:start w:val="1"/>
+      <w:numFmt w:val="bullet"/>
+      <w:lvlText w:val=""/>
+      <w:lvlJc w:val="left"/>
+      <w:pPr>
+        <w:ind w:left="720" w:hanging="360"/>
+      </w:pPr>
+      <w:rPr>
+        <w:rFonts w:ascii="Symbol" w:hAnsi="Symbol" w:hint="default"/>
+      </w:rPr>
+    </w:lvl>
+    <w:lvl w:ilvl="1" w:tplc="04070003" w:tentative="1">
+      <w:start w:val="1"/>
+      <w:numFmt w:val="bullet"/>
+      <w:lvlText w:val="o"/>
+      <w:lvlJc w:val="left"/>
+      <w:pPr>
+        <w:ind w:left="1440" w:hanging="360"/>
+      </w:pPr>
+      <w:rPr>
+        <w:rFonts w:ascii="Courier New" w:hAnsi="Courier New" w:cs="Courier New" w:hint="default"/>
+      </w:rPr>
+    </w:lvl>
+    <w:lvl w:ilvl="2" w:tplc="04070005" w:tentative="1">
+      <w:start w:val="1"/>
+      <w:numFmt w:val="bullet"/>
+      <w:lvlText w:val=""/>
+      <w:lvlJc w:val="left"/>
+      <w:pPr>
+        <w:ind w:left="2160" w:hanging="360"/>
+      </w:pPr>
+      <w:rPr>
+        <w:rFonts w:ascii="Wingdings" w:hAnsi="Wingdings" w:hint="default"/>
+      </w:rPr>
+    </w:lvl>
+    <w:lvl w:ilvl="3" w:tplc="04070001" w:tentative="1">
+      <w:start w:val="1"/>
+      <w:numFmt w:val="bullet"/>
+      <w:lvlText w:val=""/>
+      <w:lvlJc w:val="left"/>
+      <w:pPr>
+        <w:ind w:left="2880" w:hanging="360"/>
+      </w:pPr>
+      <w:rPr>
+        <w:rFonts w:ascii="Symbol" w:hAnsi="Symbol" w:hint="default"/>
+      </w:rPr>
+    </w:lvl>
+    <w:lvl w:ilvl="4" w:tplc="04070003" w:tentative="1">
+      <w:start w:val="1"/>
+      <w:numFmt w:val="bullet"/>
+      <w:lvlText w:val="o"/>
+      <w:lvlJc w:val="left"/>
+      <w:pPr>
+        <w:ind w:left="3600" w:hanging="360"/>
+      </w:pPr>
+      <w:rPr>
+        <w:rFonts w:ascii="Courier New" w:hAnsi="Courier New" w:cs="Courier New" w:hint="default"/>
+      </w:rPr>
+    </w:lvl>
+    <w:lvl w:ilvl="5" w:tplc="04070005" w:tentative="1">
+      <w:start w:val="1"/>
+      <w:numFmt w:val="bullet"/>
+      <w:lvlText w:val=""/>
+      <w:lvlJc w:val="left"/>
+      <w:pPr>
+        <w:ind w:left="4320" w:hanging="360"/>
+      </w:pPr>
+      <w:rPr>
+        <w:rFonts w:ascii="Wingdings" w:hAnsi="Wingdings" w:hint="default"/>
+      </w:rPr>
+    </w:lvl>
+    <w:lvl w:ilvl="6" w:tplc="04070001" w:tentative="1">
+      <w:start w:val="1"/>
+      <w:numFmt w:val="bullet"/>
+      <w:lvlText w:val=""/>
+      <w:lvlJc w:val="left"/>
+      <w:pPr>
+        <w:ind w:left="5040" w:hanging="360"/>
+      </w:pPr>
+      <w:rPr>
+        <w:rFonts w:ascii="Symbol" w:hAnsi="Symbol" w:hint="default"/>
+      </w:rPr>
+    </w:lvl>
+    <w:lvl w:ilvl="7" w:tplc="04070003" w:tentative="1">
+      <w:start w:val="1"/>
+      <w:numFmt w:val="bullet"/>
+      <w:lvlText w:val="o"/>
+      <w:lvlJc w:val="left"/>
+      <w:pPr>
+        <w:ind w:left="5760" w:hanging="360"/>
+      </w:pPr>
+      <w:rPr>
+        <w:rFonts w:ascii="Courier New" w:hAnsi="Courier New" w:cs="Courier New" w:hint="default"/>
+      </w:rPr>
+    </w:lvl>
+    <w:lvl w:ilvl="8" w:tplc="04070005" w:tentative="1">
+      <w:start w:val="1"/>
+      <w:numFmt w:val="bullet"/>
+      <w:lvlText w:val=""/>
+      <w:lvlJc w:val="left"/>
+      <w:pPr>
+        <w:ind w:left="6480" w:hanging="360"/>
+      </w:pPr>
+      <w:rPr>
+        <w:rFonts w:ascii="Wingdings" w:hAnsi="Wingdings" w:hint="default"/>
+      </w:rPr>
+    </w:lvl>
+  </w:abstractNum>
+  <w:abstractNum w:abstractNumId="7" w15:restartNumberingAfterBreak="0">
     <w:nsid w:val="48C02E6A"/>
     <w:multiLevelType w:val="hybridMultilevel"/>
     <w:tmpl w:val="09903E4A"/>
@@ -7884,7 +7118,7 @@
       </w:rPr>
     </w:lvl>
   </w:abstractNum>
-  <w:abstractNum w:abstractNumId="7" w15:restartNumberingAfterBreak="0">
+  <w:abstractNum w:abstractNumId="8" w15:restartNumberingAfterBreak="0">
     <w:nsid w:val="4E461C7A"/>
     <w:multiLevelType w:val="hybridMultilevel"/>
     <w:tmpl w:val="4B20722C"/>
@@ -7996,7 +7230,120 @@
       </w:rPr>
     </w:lvl>
   </w:abstractNum>
-  <w:abstractNum w:abstractNumId="8" w15:restartNumberingAfterBreak="0">
+  <w:abstractNum w:abstractNumId="9" w15:restartNumberingAfterBreak="0">
+    <w:nsid w:val="56EF49AB"/>
+    <w:multiLevelType w:val="hybridMultilevel"/>
+    <w:tmpl w:val="D1CC0432"/>
+    <w:lvl w:ilvl="0" w:tplc="04070001">
+      <w:start w:val="1"/>
+      <w:numFmt w:val="bullet"/>
+      <w:lvlText w:val=""/>
+      <w:lvlJc w:val="left"/>
+      <w:pPr>
+        <w:ind w:left="720" w:hanging="360"/>
+      </w:pPr>
+      <w:rPr>
+        <w:rFonts w:ascii="Symbol" w:hAnsi="Symbol" w:hint="default"/>
+      </w:rPr>
+    </w:lvl>
+    <w:lvl w:ilvl="1" w:tplc="04070003" w:tentative="1">
+      <w:start w:val="1"/>
+      <w:numFmt w:val="bullet"/>
+      <w:lvlText w:val="o"/>
+      <w:lvlJc w:val="left"/>
+      <w:pPr>
+        <w:ind w:left="1440" w:hanging="360"/>
+      </w:pPr>
+      <w:rPr>
+        <w:rFonts w:ascii="Courier New" w:hAnsi="Courier New" w:cs="Courier New" w:hint="default"/>
+      </w:rPr>
+    </w:lvl>
+    <w:lvl w:ilvl="2" w:tplc="04070005" w:tentative="1">
+      <w:start w:val="1"/>
+      <w:numFmt w:val="bullet"/>
+      <w:lvlText w:val=""/>
+      <w:lvlJc w:val="left"/>
+      <w:pPr>
+        <w:ind w:left="2160" w:hanging="360"/>
+      </w:pPr>
+      <w:rPr>
+        <w:rFonts w:ascii="Wingdings" w:hAnsi="Wingdings" w:hint="default"/>
+      </w:rPr>
+    </w:lvl>
+    <w:lvl w:ilvl="3" w:tplc="04070001" w:tentative="1">
+      <w:start w:val="1"/>
+      <w:numFmt w:val="bullet"/>
+      <w:lvlText w:val=""/>
+      <w:lvlJc w:val="left"/>
+      <w:pPr>
+        <w:ind w:left="2880" w:hanging="360"/>
+      </w:pPr>
+      <w:rPr>
+        <w:rFonts w:ascii="Symbol" w:hAnsi="Symbol" w:hint="default"/>
+      </w:rPr>
+    </w:lvl>
+    <w:lvl w:ilvl="4" w:tplc="04070003" w:tentative="1">
+      <w:start w:val="1"/>
+      <w:numFmt w:val="bullet"/>
+      <w:lvlText w:val="o"/>
+      <w:lvlJc w:val="left"/>
+      <w:pPr>
+        <w:ind w:left="3600" w:hanging="360"/>
+      </w:pPr>
+      <w:rPr>
+        <w:rFonts w:ascii="Courier New" w:hAnsi="Courier New" w:cs="Courier New" w:hint="default"/>
+      </w:rPr>
+    </w:lvl>
+    <w:lvl w:ilvl="5" w:tplc="04070005" w:tentative="1">
+      <w:start w:val="1"/>
+      <w:numFmt w:val="bullet"/>
+      <w:lvlText w:val=""/>
+      <w:lvlJc w:val="left"/>
+      <w:pPr>
+        <w:ind w:left="4320" w:hanging="360"/>
+      </w:pPr>
+      <w:rPr>
+        <w:rFonts w:ascii="Wingdings" w:hAnsi="Wingdings" w:hint="default"/>
+      </w:rPr>
+    </w:lvl>
+    <w:lvl w:ilvl="6" w:tplc="04070001" w:tentative="1">
+      <w:start w:val="1"/>
+      <w:numFmt w:val="bullet"/>
+      <w:lvlText w:val=""/>
+      <w:lvlJc w:val="left"/>
+      <w:pPr>
+        <w:ind w:left="5040" w:hanging="360"/>
+      </w:pPr>
+      <w:rPr>
+        <w:rFonts w:ascii="Symbol" w:hAnsi="Symbol" w:hint="default"/>
+      </w:rPr>
+    </w:lvl>
+    <w:lvl w:ilvl="7" w:tplc="04070003" w:tentative="1">
+      <w:start w:val="1"/>
+      <w:numFmt w:val="bullet"/>
+      <w:lvlText w:val="o"/>
+      <w:lvlJc w:val="left"/>
+      <w:pPr>
+        <w:ind w:left="5760" w:hanging="360"/>
+      </w:pPr>
+      <w:rPr>
+        <w:rFonts w:ascii="Courier New" w:hAnsi="Courier New" w:cs="Courier New" w:hint="default"/>
+      </w:rPr>
+    </w:lvl>
+    <w:lvl w:ilvl="8" w:tplc="04070005" w:tentative="1">
+      <w:start w:val="1"/>
+      <w:numFmt w:val="bullet"/>
+      <w:lvlText w:val=""/>
+      <w:lvlJc w:val="left"/>
+      <w:pPr>
+        <w:ind w:left="6480" w:hanging="360"/>
+      </w:pPr>
+      <w:rPr>
+        <w:rFonts w:ascii="Wingdings" w:hAnsi="Wingdings" w:hint="default"/>
+      </w:rPr>
+    </w:lvl>
+  </w:abstractNum>
+  <w:abstractNum w:abstractNumId="10" w15:restartNumberingAfterBreak="0">
     <w:nsid w:val="59F273DB"/>
     <w:multiLevelType w:val="hybridMultilevel"/>
     <w:tmpl w:val="BD18D8FA"/>
@@ -8109,7 +7456,7 @@
       </w:rPr>
     </w:lvl>
   </w:abstractNum>
-  <w:abstractNum w:abstractNumId="9" w15:restartNumberingAfterBreak="0">
+  <w:abstractNum w:abstractNumId="11" w15:restartNumberingAfterBreak="0">
     <w:nsid w:val="63934AC8"/>
     <w:multiLevelType w:val="hybridMultilevel"/>
     <w:tmpl w:val="229E80CA"/>
@@ -8222,7 +7569,7 @@
       </w:rPr>
     </w:lvl>
   </w:abstractNum>
-  <w:abstractNum w:abstractNumId="10" w15:restartNumberingAfterBreak="0">
+  <w:abstractNum w:abstractNumId="12" w15:restartNumberingAfterBreak="0">
     <w:nsid w:val="6B8512F6"/>
     <w:multiLevelType w:val="hybridMultilevel"/>
     <w:tmpl w:val="E968F934"/>
@@ -8235,6 +7582,119 @@
       </w:pPr>
       <w:rPr>
         <w:rFonts w:ascii="Aptos" w:eastAsiaTheme="minorHAnsi" w:hAnsi="Aptos" w:cstheme="minorBidi" w:hint="default"/>
+      </w:rPr>
+    </w:lvl>
+    <w:lvl w:ilvl="1" w:tplc="04070003" w:tentative="1">
+      <w:start w:val="1"/>
+      <w:numFmt w:val="bullet"/>
+      <w:lvlText w:val="o"/>
+      <w:lvlJc w:val="left"/>
+      <w:pPr>
+        <w:ind w:left="1440" w:hanging="360"/>
+      </w:pPr>
+      <w:rPr>
+        <w:rFonts w:ascii="Courier New" w:hAnsi="Courier New" w:cs="Courier New" w:hint="default"/>
+      </w:rPr>
+    </w:lvl>
+    <w:lvl w:ilvl="2" w:tplc="04070005" w:tentative="1">
+      <w:start w:val="1"/>
+      <w:numFmt w:val="bullet"/>
+      <w:lvlText w:val=""/>
+      <w:lvlJc w:val="left"/>
+      <w:pPr>
+        <w:ind w:left="2160" w:hanging="360"/>
+      </w:pPr>
+      <w:rPr>
+        <w:rFonts w:ascii="Wingdings" w:hAnsi="Wingdings" w:hint="default"/>
+      </w:rPr>
+    </w:lvl>
+    <w:lvl w:ilvl="3" w:tplc="04070001" w:tentative="1">
+      <w:start w:val="1"/>
+      <w:numFmt w:val="bullet"/>
+      <w:lvlText w:val=""/>
+      <w:lvlJc w:val="left"/>
+      <w:pPr>
+        <w:ind w:left="2880" w:hanging="360"/>
+      </w:pPr>
+      <w:rPr>
+        <w:rFonts w:ascii="Symbol" w:hAnsi="Symbol" w:hint="default"/>
+      </w:rPr>
+    </w:lvl>
+    <w:lvl w:ilvl="4" w:tplc="04070003" w:tentative="1">
+      <w:start w:val="1"/>
+      <w:numFmt w:val="bullet"/>
+      <w:lvlText w:val="o"/>
+      <w:lvlJc w:val="left"/>
+      <w:pPr>
+        <w:ind w:left="3600" w:hanging="360"/>
+      </w:pPr>
+      <w:rPr>
+        <w:rFonts w:ascii="Courier New" w:hAnsi="Courier New" w:cs="Courier New" w:hint="default"/>
+      </w:rPr>
+    </w:lvl>
+    <w:lvl w:ilvl="5" w:tplc="04070005" w:tentative="1">
+      <w:start w:val="1"/>
+      <w:numFmt w:val="bullet"/>
+      <w:lvlText w:val=""/>
+      <w:lvlJc w:val="left"/>
+      <w:pPr>
+        <w:ind w:left="4320" w:hanging="360"/>
+      </w:pPr>
+      <w:rPr>
+        <w:rFonts w:ascii="Wingdings" w:hAnsi="Wingdings" w:hint="default"/>
+      </w:rPr>
+    </w:lvl>
+    <w:lvl w:ilvl="6" w:tplc="04070001" w:tentative="1">
+      <w:start w:val="1"/>
+      <w:numFmt w:val="bullet"/>
+      <w:lvlText w:val=""/>
+      <w:lvlJc w:val="left"/>
+      <w:pPr>
+        <w:ind w:left="5040" w:hanging="360"/>
+      </w:pPr>
+      <w:rPr>
+        <w:rFonts w:ascii="Symbol" w:hAnsi="Symbol" w:hint="default"/>
+      </w:rPr>
+    </w:lvl>
+    <w:lvl w:ilvl="7" w:tplc="04070003" w:tentative="1">
+      <w:start w:val="1"/>
+      <w:numFmt w:val="bullet"/>
+      <w:lvlText w:val="o"/>
+      <w:lvlJc w:val="left"/>
+      <w:pPr>
+        <w:ind w:left="5760" w:hanging="360"/>
+      </w:pPr>
+      <w:rPr>
+        <w:rFonts w:ascii="Courier New" w:hAnsi="Courier New" w:cs="Courier New" w:hint="default"/>
+      </w:rPr>
+    </w:lvl>
+    <w:lvl w:ilvl="8" w:tplc="04070005" w:tentative="1">
+      <w:start w:val="1"/>
+      <w:numFmt w:val="bullet"/>
+      <w:lvlText w:val=""/>
+      <w:lvlJc w:val="left"/>
+      <w:pPr>
+        <w:ind w:left="6480" w:hanging="360"/>
+      </w:pPr>
+      <w:rPr>
+        <w:rFonts w:ascii="Wingdings" w:hAnsi="Wingdings" w:hint="default"/>
+      </w:rPr>
+    </w:lvl>
+  </w:abstractNum>
+  <w:abstractNum w:abstractNumId="13" w15:restartNumberingAfterBreak="0">
+    <w:nsid w:val="6FFA2432"/>
+    <w:multiLevelType w:val="hybridMultilevel"/>
+    <w:tmpl w:val="B1F21FFA"/>
+    <w:lvl w:ilvl="0" w:tplc="04070001">
+      <w:start w:val="1"/>
+      <w:numFmt w:val="bullet"/>
+      <w:lvlText w:val=""/>
+      <w:lvlJc w:val="left"/>
+      <w:pPr>
+        <w:ind w:left="720" w:hanging="360"/>
+      </w:pPr>
+      <w:rPr>
+        <w:rFonts w:ascii="Symbol" w:hAnsi="Symbol" w:hint="default"/>
       </w:rPr>
     </w:lvl>
     <w:lvl w:ilvl="1" w:tplc="04070003" w:tentative="1">
@@ -8338,10 +7798,10 @@
     <w:abstractNumId w:val="5"/>
   </w:num>
   <w:num w:numId="2" w16cid:durableId="2042313764">
-    <w:abstractNumId w:val="9"/>
+    <w:abstractNumId w:val="11"/>
   </w:num>
   <w:num w:numId="3" w16cid:durableId="849417499">
-    <w:abstractNumId w:val="10"/>
+    <w:abstractNumId w:val="12"/>
   </w:num>
   <w:num w:numId="4" w16cid:durableId="1639531528">
     <w:abstractNumId w:val="4"/>
@@ -8359,13 +7819,22 @@
     <w:abstractNumId w:val="1"/>
   </w:num>
   <w:num w:numId="9" w16cid:durableId="284848520">
+    <w:abstractNumId w:val="7"/>
+  </w:num>
+  <w:num w:numId="10" w16cid:durableId="1403480139">
+    <w:abstractNumId w:val="8"/>
+  </w:num>
+  <w:num w:numId="11" w16cid:durableId="1651638737">
+    <w:abstractNumId w:val="10"/>
+  </w:num>
+  <w:num w:numId="12" w16cid:durableId="146871442">
+    <w:abstractNumId w:val="9"/>
+  </w:num>
+  <w:num w:numId="13" w16cid:durableId="351810984">
     <w:abstractNumId w:val="6"/>
   </w:num>
-  <w:num w:numId="10" w16cid:durableId="1403480139">
-    <w:abstractNumId w:val="7"/>
-  </w:num>
-  <w:num w:numId="11" w16cid:durableId="1651638737">
-    <w:abstractNumId w:val="8"/>
+  <w:num w:numId="14" w16cid:durableId="739642781">
+    <w:abstractNumId w:val="13"/>
   </w:num>
 </w:numbering>
 </file>

</xml_diff>